<commit_message>
Convert projecto DOCX to Markdown
</commit_message>
<xml_diff>
--- a/projecto-completo.docx
+++ b/projecto-completo.docx
@@ -153,7 +153,19 @@
         <w:rPr>
           <w:lang w:val="pt-PT"/>
         </w:rPr>
-        <w:t xml:space="preserve"> ampliaram o acesso a dispositivos protésicos, especialmente em contextos economicamente desfavorecidos. No entanto, muitos desses modelos dependem de geometrias fixas, isto é, formas pré-definidas sem adaptação automática, ou de ajustes manuais pouco padronizados, o que resulta em alterações sem um protocolo uniforme e dificulta a escalabilidade, a reprodutibilidade e a integração robusta de dados antropométricos, ou seja, medidas corporais específicas do utilizador.</w:t>
+        <w:t xml:space="preserve"> ampliaram o acesso a dispositivos protésicos, especialmente em contextos economicamente desfavorecidos. No entanto, muitos desses modelos dependem de geometrias fixas, isto é, formas pré-definidas sem adaptação automática, ou de ajustes manuais pouco padronizados, o que resulta em alterações sem um protocolo uniforme e dificulta a </w:t>
+      </w:r>
+      <w:r>
+        <w:rPr>
+          <w:lang w:val="pt-PT"/>
+        </w:rPr>
+        <w:t>expansã</w:t>
+      </w:r>
+      <w:r>
+        <w:rPr>
+          <w:lang w:val="pt-PT"/>
+        </w:rPr>
+        <w:t>, a reprodutibilidade e a integração robusta de dados antropométricos, ou seja, medidas corporais específicas do utilizador.</w:t>
       </w:r>
     </w:p>
     <w:p>
@@ -2124,7 +2136,19 @@
         <w:rPr>
           <w:lang w:val="pt-PT"/>
         </w:rPr>
-        <w:t>Entre os principais desafios identificados destacam-se: – a articulação entre padronização e personalização, particularmente relevante em dispositivos médicos sujeitos a regulamentação rigorosa; – a discrepância entre modelos teóricos de UCD ensinados academicamente e as restrições institucionais à prática em saúde; – a dificuldade de tradução de processos participativos para contextos de implementação e de escalabilidade; – e a necessidade de integrar dimensões interseccionais (como género e fatores socioculturais) na investigação e no desenvolvimento.</w:t>
+        <w:t>Entre os principais desafios identificados destacam-se: – a articulação entre padronização e personalização, particularmente relevante em dispositivos médicos sujeitos a regulamentação rigorosa; – a discrepância entre modelos teóricos de UCD ensinados academicamente e as restrições institucionais à prática em saúde; – a dificuldade de tradução de processos participativos para contextos de implementação e de e</w:t>
+      </w:r>
+      <w:r>
+        <w:rPr>
+          <w:lang w:val="pt-PT"/>
+        </w:rPr>
+        <w:t>xpansão</w:t>
+      </w:r>
+      <w:r>
+        <w:rPr>
+          <w:lang w:val="pt-PT"/>
+        </w:rPr>
+        <w:t>; – e a necessidade de integrar dimensões interseccionais (como género e fatores socioculturais) na investigação e no desenvolvimento.</w:t>
       </w:r>
       <w:commentRangeEnd w:id="6"/>
       <w:r>
@@ -4775,7 +4799,19 @@
         <w:rPr>
           <w:lang w:val="pt-PT"/>
         </w:rPr>
-        <w:t>1. Seleção modular de componentes: a personalização é obtida por meio da combinação de módulos interoperáveis, permitindo adaptar a funcionalidade por meio de combinações e substituições. A modularidade surge como estratégia para conciliar personalização, reutilização e escalabilidade em ecossistemas de produto (Dechev et al., 2023 (#ref-dechev-2023); Peters &amp; Richter, 2023 (#ref-peters-2023)).</w:t>
+        <w:t xml:space="preserve">1. Seleção modular de componentes: a personalização é obtida por meio da combinação de módulos interoperáveis, permitindo adaptar a funcionalidade por meio de combinações e substituições. A modularidade surge como estratégia para conciliar personalização, reutilização e </w:t>
+      </w:r>
+      <w:r>
+        <w:rPr>
+          <w:lang w:val="pt-PT"/>
+        </w:rPr>
+        <w:t>expansão</w:t>
+      </w:r>
+      <w:r>
+        <w:rPr>
+          <w:lang w:val="pt-PT"/>
+        </w:rPr>
+        <w:t xml:space="preserve"> em ecossistemas de produto (Dechev et al., 2023 (#ref-dechev-2023); Peters &amp; Richter, 2023 (#ref-peters-2023)).</w:t>
       </w:r>
     </w:p>
     <w:p>
@@ -6290,15 +6326,17 @@
         <w:pStyle w:val="Normal"/>
         <w:bidi w:val="0"/>
         <w:jc w:val="left"/>
-        <w:rPr>
-          <w:lang w:val="pt-PT"/>
-        </w:rPr>
-      </w:pPr>
-      <w:r>
-        <w:rPr>
-          <w:lang w:val="pt-PT"/>
-        </w:rPr>
-        <w:t>Partindo deste enquadramento, a investigação assume o desenvolvimento de um sistema paramétrico assistido por inteligência artificial como meio para explorar formas mais configuráveis, reprodutíveis e acessíveis de personalização protésica. A dimensão investigativa do projeto não reside apenas na obtenção de uma solução funcional, mas também na explicitação dos critérios, das relações paramétricas e dos mecanismos de decisão que estruturam o processo, tornando-o analisável, criticável e potencialmente transferível para outros contextos de desenvolvimento.</w:t>
+        <w:rPr/>
+      </w:pPr>
+      <w:r>
+        <w:rPr>
+          <w:lang w:val="pt-PT"/>
+        </w:rPr>
+        <w:t xml:space="preserve">Partindo deste enquadramento, a investigação assume o desenvolvimento de um sistema paramétrico assistido por inteligência artificial como meio para explorar formas mais configuráveis, reprodutíveis e acessíveis de personalização protésica. </w:t>
+      </w:r>
+      <w:r>
+        <w:rPr/>
+        <w:t>O contributo de investigação do projeto não reside apenas na obtenção de uma solução funcional, mas também na explicitação dos critérios, das relações paramétricas e dos mecanismos de decisão que estruturam o processo, tornando-o analisável, aberto à revisão crítica e potencialmente transferível para outros contextos de desenvolvimento.</w:t>
       </w:r>
     </w:p>
     <w:p>
@@ -7079,7 +7117,19 @@
         <w:rPr>
           <w:lang w:val="pt-PT"/>
         </w:rPr>
-        <w:t>Os constrangimentos materiais são definidos em termos de resistência, rigidez, durabilidade e compatibilidade biológica. Os constrangimentos mecânicos incluem limites de binário, deformação admissível, integridade estrutural sob carga e capacidades cinemáticas mínimas para a realização de tarefas quotidianas. Os constrangimentos anatómicos são integrados com base em dados antropométricos e, quando possível, na digitalização do membro residual, condicionando as geometrias, as zonas de contacto e os volumes internos. Por fim, os constrangimentos produtivos relacionam-se com as capacidades e limitações do fabrico aditivo, incluindo tolerâncias, orientação de impressão, tempo de fabrico, custo e escalabilidade.</w:t>
+        <w:t xml:space="preserve">Os constrangimentos materiais são definidos em termos de resistência, rigidez, durabilidade e compatibilidade biológica. Os constrangimentos mecânicos incluem limites de binário, deformação admissível, integridade estrutural sob carga e capacidades cinemáticas mínimas para a realização de tarefas quotidianas. Os constrangimentos anatómicos são integrados com base em dados antropométricos e, quando possível, na digitalização do membro residual, condicionando as geometrias, as zonas de contacto e os volumes internos. Por fim, os constrangimentos produtivos relacionam-se com as capacidades e limitações do fabrico aditivo, incluindo tolerâncias, orientação de impressão, tempo de fabrico, custo e </w:t>
+      </w:r>
+      <w:r>
+        <w:rPr>
+          <w:lang w:val="pt-PT"/>
+        </w:rPr>
+        <w:t>escalonamento</w:t>
+      </w:r>
+      <w:r>
+        <w:rPr>
+          <w:lang w:val="pt-PT"/>
+        </w:rPr>
+        <w:t>.</w:t>
       </w:r>
     </w:p>
     <w:p>
@@ -13901,7 +13951,7 @@
         <w:rPr>
           <w:lang w:val="pt-PT"/>
         </w:rPr>
-        <w:t>A dimensão funcional introduziu um nível adicional de exigência. Em sistemas configuráveis para próteses, a coerência geométrica e a imprimibilidade não bastam para assegurar a adequação ao uso. A articulação entre segmentos, o posicionamento relativo dos mecanismos, a distribuição de massa, as zonas de esforço e a amplitude de movimento influenciam diretamente o desempenho esperado do objeto. Por essa razão, várias revisões do modelo implicaram reajustes que não se limitavam a problemas formais, mas também à necessidade de manter um equilíbrio plausível entre adaptação dimensional, comportamento funcional e viabilidade material. O refinamento correspondeu, assim, a uma negociação contínua entre a simplificação paramétrica e a exigência prototípica.</w:t>
+        <w:t>Em sistemas configuráveis para próteses, a coerência geométrica e a compatibilidade com o processo de impressão não são suficientes para assegurar a adequação ao uso. A articulação entre segmentos, o posicionamento relativo dos mecanismos, a distribuição de massa, as zonas sujeitas a esforço e a amplitude de movimento influenciam diretamente o desempenho esperado do objeto. Por essa razão, várias revisões do modelo implicaram reajustes que não se limitavam à correção formal da geometria, mas procuravam manter um equilíbrio plausível entre adaptação dimensional, comportamento funcional e viabilidade material. O refinamento correspondeu, assim, a uma negociação contínua entre a simplificação paramétrica e as exigências funcionais e materiais do protótipo.</w:t>
       </w:r>
     </w:p>
     <w:p>
@@ -14018,95 +14068,235 @@
         <w:pStyle w:val="Normal"/>
         <w:bidi w:val="0"/>
         <w:jc w:val="left"/>
-        <w:rPr>
-          <w:lang w:val="pt-PT"/>
-        </w:rPr>
-      </w:pPr>
-      <w:r>
-        <w:rPr>
-          <w:lang w:val="pt-PT"/>
-        </w:rPr>
-        <w:t>A plataforma web desenvolvida no âmbito deste projeto constitui a camada de mediação entre o modelo paramétrico, os dados do utilizador e os processos de configuração digital da prótese. O seu enquadramento conceptual assenta na ideia de que a personalização não deve depender da manipulação direta do código nem de competências avançadas de modelação tridimensional, mas de uma interface capaz de traduzir dados antropométricos, decisões de configuração e critérios de fabrico em parâmetros operacionais inteligíveis. Nesta perspetiva, a plataforma não é apenas um visualizador técnico do modelo, mas também um dispositivo de mediação que reorganiza a relação entre o sistema paramétrico, o utilizador, o processo de decisão e a preparação para o fabrico. Esta leitura é coerente com a literatura sobre personalização digital e mass personalisation, que descreve os configuradores como infraestruturas que expõem uma parte controlada do espaço de variação, permitindo adaptar produtos sem comprometer a coerência interna do modelo-base (Ozdemir, Verlinden, &amp; Cascini, 2022; Stralen, 2018 (#ref-stralen-2018)).</w:t>
-      </w:r>
-    </w:p>
-    <w:p>
-      <w:pPr>
-        <w:pStyle w:val="Normal"/>
-        <w:bidi w:val="0"/>
-        <w:jc w:val="left"/>
-        <w:rPr>
-          <w:lang w:val="pt-PT"/>
-        </w:rPr>
-      </w:pPr>
-      <w:r>
-        <w:rPr>
-          <w:lang w:val="pt-PT"/>
-        </w:rPr>
-        <w:t>Do ponto de vista funcional, a plataforma foi concebida para suportar um processo de personalização progressiva, no qual a definição geométrica da prótese resulta da articulação entre a recolha de dados, a seleção do modelo, o ajustamento de parâmetros, a visualização do resultado e a eventual exportação para prototipagem. Esta organização procura reduzir a distância entre o domínio técnico da modelação paramétrica e o contexto aplicado de utilização clínica, projetual ou experimental. Em vez de exigir que cada interveniente compreenda a estrutura interna do ficheiro OpenSCAD, o sistema disponibiliza uma camada de interação mais acessível, baseada em controlos paramétricos, pré-visualização tridimensional e gestão de configurações. Tal opção aproxima-se de abordagens recentes em plataformas de personalização protésica, nas quais a interface funciona como meio de tornar observável, configurável e progressivamente verificável um processo que, de outro modo, permaneceria dependente de software especializado ou de mediação exclusivamente técnica (Peixoto et al., 2025 (#ref-peixoto-2025)).</w:t>
-      </w:r>
-    </w:p>
-    <w:p>
-      <w:pPr>
-        <w:pStyle w:val="Normal"/>
-        <w:bidi w:val="0"/>
-        <w:jc w:val="left"/>
-        <w:rPr>
-          <w:lang w:val="pt-PT"/>
-        </w:rPr>
-      </w:pPr>
-      <w:r>
-        <w:rPr>
-          <w:lang w:val="pt-PT"/>
-        </w:rPr>
-        <w:t>Neste sentido, a plataforma deve ser entendida como um sistema sociotécnico, e não apenas como um artefacto de software. A personalização deixa de ser concebida como um ato individual e isolado e passa a ser enquadrada como um processo distribuído, no qual diferentes agentes intervêm com graus distintos de responsabilidade e de controlo. Num contexto de próteses personalizadas, o resultado final pode depender da articulação entre o utilizador final, o designer, o técnico ou o clínico, bem como de condicionantes produtivas e de critérios de validação. A plataforma procura, assim, oferecer uma infraestrutura digital que acomode essa pluralidade de agentes sem comprometer a consistência técnica da configuração paramétrica nem deslocar indevidamente a responsabilidade para o utilizador menos especializado (Bai, Yuan, Liu, Huang, &amp; Feng, 2024; Quintero et al., 2018 (#ref-quintero-2018)).</w:t>
-      </w:r>
-    </w:p>
-    <w:p>
-      <w:pPr>
-        <w:pStyle w:val="Normal"/>
-        <w:bidi w:val="0"/>
-        <w:jc w:val="left"/>
-        <w:rPr>
-          <w:lang w:val="pt-PT"/>
-        </w:rPr>
-      </w:pPr>
-      <w:r>
-        <w:rPr>
-          <w:lang w:val="pt-PT"/>
-        </w:rPr>
-        <w:t>A definição dos perfis de utilizador corresponde, por isso, a uma opção conceptual central. O sistema organiza-se em três perfis principais: administrador, técnico e utilizador. O perfil de administrador assegura a gestão global da plataforma, incluindo a criação de contas, a definição de permissões e a supervisão do ecossistema de configurações. O perfil técnico, pensado para profissionais intermédios, como protésicos, clínicos ou operadores especializados, permite criar, editar e acompanhar configurações próprias e, quando aplicável, aceder às configurações dos utilizadores sob sua responsabilidade. O perfil de utilizador corresponde ao nível mais restrito, centrado na consulta das suas configurações, no acompanhamento do processo e em interações delimitadas pelo sistema. Esta segmentação traduz uma lógica de controlo de acesso baseada em papéis, procurando equilibrar autonomia, segurança, inteligibilidade e responsabilidade distribuída.</w:t>
-      </w:r>
-    </w:p>
-    <w:p>
-      <w:pPr>
-        <w:pStyle w:val="Normal"/>
-        <w:bidi w:val="0"/>
-        <w:jc w:val="left"/>
-        <w:rPr>
-          <w:lang w:val="pt-PT"/>
-        </w:rPr>
-      </w:pPr>
-      <w:r>
-        <w:rPr>
-          <w:lang w:val="pt-PT"/>
-        </w:rPr>
-        <w:t>Importa sublinhar que esta diferenciação não se limita a uma decisão administrativa. Ela participa diretamente na forma como a plataforma enquadra a personalização. Ao reservar certos parâmetros, decisões ou operações a perfis técnicos, o sistema reconhece que nem todos os aspetos da configuração devem ser apresentados ao utilizador final como escolhas livres. Em domínios sensíveis, como o das próteses, a experiência de uso beneficia quando a interface torna visível o processo, mas também quando delimita o campo de ação de forma coerente com critérios de supervisão, segurança e adequação funcional. A literatura sobre interfaces clínicas e interação em próteses inteligentes aponta precisamente para a necessidade de distinguir entre participação informada do utilizador e controlo técnico supervisionado, evitando tanto a opacidade excessiva como a transferência imprudente de responsabilidade para agentes não especializados (Bai et al., 2024 (#ref-bai-2024); Quintero et al., 2018 (#ref-quintero-2018)).</w:t>
-      </w:r>
-    </w:p>
-    <w:p>
-      <w:pPr>
-        <w:pStyle w:val="Normal"/>
-        <w:bidi w:val="0"/>
-        <w:jc w:val="left"/>
-        <w:rPr>
-          <w:lang w:val="pt-PT"/>
-        </w:rPr>
-      </w:pPr>
-      <w:r>
-        <w:rPr>
-          <w:lang w:val="pt-PT"/>
-        </w:rPr>
-        <w:t>Deste modo, o enquadramento conceptual da plataforma articula três objetivos complementares: tornar a lógica paramétrica operável em ambiente web, estruturar a personalização como um processo progressivo e inteligível e distribuir o acesso às operações de acordo com papéis diferenciados. O valor da plataforma, nesta fase, não reside apenas em permitir editar parâmetros à distância, mas também em reconfigurar o próprio processo de personalização como uma sequência assistida, rastreável e criticável. É nessa articulação entre configurabilidade, mediação da interface e organização por perfis que a secção seguinte, dedicada à arquitetura geral do sistema, encontra a sua base conceptual.</w:t>
+        <w:rPr/>
+      </w:pPr>
+      <w:r>
+        <w:rPr>
+          <w:lang w:val="pt-PT"/>
+        </w:rPr>
+        <w:t xml:space="preserve">A plataforma web desenvolvida no âmbito deste projeto constitui a camada de mediação entre o modelo paramétrico, os dados do utilizador e os processos de configuração digital da prótese. O seu enquadramento conceptual assenta na ideia de que a personalização não deve depender da manipulação direta do código nem de competências avançadas de modelação tridimensional, mas de uma interface capaz de traduzir dados antropométricos, decisões de configuração e critérios de fabrico em parâmetros operacionais inteligíveis. Nesta perspetiva, a plataforma não é apenas um visualizador técnico do modelo, mas também um dispositivo de mediação que reorganiza a relação entre o sistema paramétrico, o utilizador, o processo de decisão e a preparação para o fabrico. </w:t>
+      </w:r>
+      <w:r>
+        <w:rPr/>
+        <w:t>Esta leitura é coerente com os estudos sobre personalização digital e personalização em massa, que descrevem os configuradores como infraestruturas capazes de expor uma parte controlada do espaço de variação, permitindo adaptar produtos sem comprometer a coerência interna do modelo-base (Ozdemir, Verlinden, &amp; Cascini, 2022; Stralen, 2018 (#ref-stralen-2018)).</w:t>
+      </w:r>
+    </w:p>
+    <w:p>
+      <w:pPr>
+        <w:pStyle w:val="Normal"/>
+        <w:bidi w:val="0"/>
+        <w:jc w:val="left"/>
+        <w:rPr>
+          <w:lang w:val="pt-PT"/>
+        </w:rPr>
+      </w:pPr>
+      <w:r>
+        <w:rPr>
+          <w:lang w:val="pt-PT"/>
+        </w:rPr>
+        <w:t xml:space="preserve">Do ponto de vista funcional, a plataforma foi concebida para suportar um processo </w:t>
+      </w:r>
+      <w:r>
+        <w:rPr>
+          <w:lang w:val="pt-PT"/>
+        </w:rPr>
+        <w:t xml:space="preserve">progressivo </w:t>
+      </w:r>
+      <w:r>
+        <w:rPr>
+          <w:lang w:val="pt-PT"/>
+        </w:rPr>
+        <w:t xml:space="preserve">de personalização, no qual a definição geométrica da prótese resulta da articulação entre a recolha de dados, a seleção do modelo, o ajustamento de parâmetros, a visualização do resultado e a eventual exportação para prototipagem. Esta organização procura reduzir a distância entre o domínio técnico da modelação paramétrica e o contexto aplicado de utilização clínica, experimental </w:t>
+      </w:r>
+      <w:r>
+        <w:rPr>
+          <w:lang w:val="pt-PT"/>
+        </w:rPr>
+        <w:t>ou de projecto</w:t>
+      </w:r>
+      <w:r>
+        <w:rPr>
+          <w:lang w:val="pt-PT"/>
+        </w:rPr>
+        <w:t>.</w:t>
+      </w:r>
+    </w:p>
+    <w:p>
+      <w:pPr>
+        <w:pStyle w:val="Normal"/>
+        <w:bidi w:val="0"/>
+        <w:jc w:val="left"/>
+        <w:rPr>
+          <w:lang w:val="pt-PT"/>
+        </w:rPr>
+      </w:pPr>
+      <w:r>
+        <w:rPr>
+          <w:lang w:val="pt-PT"/>
+        </w:rPr>
+        <w:t xml:space="preserve">Em vez de exigir que cada interveniente compreenda a estrutura interna do ficheiro OpenSCAD, o sistema disponibiliza uma camada de interação mais acessível, baseada em controlos paramétricos, pré-visualização tridimensional e gestão de configurações. Tal opção aproxima-se de abordagens recentes em plataformas de personalização </w:t>
+      </w:r>
+      <w:r>
+        <w:rPr>
+          <w:lang w:val="pt-PT"/>
+        </w:rPr>
+        <w:t>de próteses</w:t>
+      </w:r>
+      <w:r>
+        <w:rPr>
+          <w:lang w:val="pt-PT"/>
+        </w:rPr>
+        <w:t>, nas quais a interface funciona como meio de tornar observável, configurável e progressivamente verificável um processo que, de outro modo, permaneceria dependente de software especializado ou de mediação exclus</w:t>
+      </w:r>
+      <w:commentRangeStart w:id="83"/>
+      <w:r>
+        <w:rPr>
+          <w:lang w:val="pt-PT"/>
+        </w:rPr>
+        <w:t>ivamente técnica (Peixoto et al., 2025 (#ref-peixoto-2025)).</w:t>
+      </w:r>
+      <w:commentRangeEnd w:id="83"/>
+      <w:r>
+        <w:commentReference w:id="83"/>
+      </w:r>
+      <w:r>
+        <w:rPr>
+          <w:lang w:val="pt-PT"/>
+        </w:rPr>
+      </w:r>
+    </w:p>
+    <w:p>
+      <w:pPr>
+        <w:pStyle w:val="Normal"/>
+        <w:bidi w:val="0"/>
+        <w:jc w:val="left"/>
+        <w:rPr>
+          <w:lang w:val="pt-PT"/>
+        </w:rPr>
+      </w:pPr>
+      <w:r>
+        <w:rPr>
+          <w:lang w:val="pt-PT"/>
+        </w:rPr>
+        <w:t>Neste sentido, a plataforma deve ser entendida como uma infraestrutura de mediação entre componentes técnicos, utilizadores e intervenientes especializados, e não apenas como um artefacto de software. A personalização deixa, assim, de corresponder a um ato individual e isolado, passando a ser enquadrada como um processo distribuído, no qual diferentes intervenientes participam com graus distintos de responsabilidade, conhecimento e controlo.</w:t>
+      </w:r>
+    </w:p>
+    <w:p>
+      <w:pPr>
+        <w:pStyle w:val="Normal"/>
+        <w:bidi w:val="0"/>
+        <w:jc w:val="left"/>
+        <w:rPr>
+          <w:lang w:val="pt-PT"/>
+        </w:rPr>
+      </w:pPr>
+      <w:r>
+        <w:rPr>
+          <w:lang w:val="pt-PT"/>
+        </w:rPr>
+        <w:t>Num contexto de próteses personalizadas, o resultado final pode depender da articulação entre o utilizador final, o designer, o técnico ou o clínico, bem como de condicionantes produtivas e de critérios de validação. A plataforma procura, assim, oferecer uma infraestrutura digital que acomode essa pluralidade de agentes sem comprometer a consistência técnica da configuração paramétrica nem deslocar indevidamente a responsabilidade para o utilizador menos especializado (Bai, Yuan, Liu, Huang, &amp; Feng, 2024; Quintero et al., 2018 (#ref-quintero-2018)).</w:t>
+      </w:r>
+    </w:p>
+    <w:p>
+      <w:pPr>
+        <w:pStyle w:val="Normal"/>
+        <w:bidi w:val="0"/>
+        <w:jc w:val="left"/>
+        <w:rPr>
+          <w:lang w:val="pt-PT"/>
+        </w:rPr>
+      </w:pPr>
+      <w:r>
+        <w:rPr>
+          <w:lang w:val="pt-PT"/>
+        </w:rPr>
+        <w:t>A definição dos perfis de utilizador constitui, por isso, uma decisão estruturante no desenho da plataforma, uma vez que determina como se distribuem responsabilidades, permissões e formas de intervenção no processo de personalização. O sistema organiza-se em três perfis principais: administrador, técnico e utilizador.</w:t>
+      </w:r>
+    </w:p>
+    <w:p>
+      <w:pPr>
+        <w:pStyle w:val="Normal"/>
+        <w:bidi w:val="0"/>
+        <w:jc w:val="left"/>
+        <w:rPr/>
+      </w:pPr>
+      <w:r>
+        <w:rPr>
+          <w:lang w:val="pt-PT"/>
+        </w:rPr>
+        <w:t xml:space="preserve">O perfil de administrador assegura a gestão global da plataforma, incluindo a criação de contas, a definição de permissões e a supervisão do ecossistema de configurações, </w:t>
+      </w:r>
+      <w:r>
+        <w:rPr>
+          <w:lang w:val="pt-PT"/>
+        </w:rPr>
+        <w:t>incluindo da base de dados antropométricos</w:t>
+      </w:r>
+      <w:r>
+        <w:rPr>
+          <w:lang w:val="pt-PT"/>
+        </w:rPr>
+        <w:t xml:space="preserve">. </w:t>
+      </w:r>
+      <w:r>
+        <w:rPr/>
+        <w:t>O perfil técnico, pensado para profissionais intermédios, como técnicos de ortoprotesia, clínicos ou operadores especializados, permite criar, editar e acompanhar configurações próprias e, quando aplicável, aceder às configurações dos utilizadores sob sua responsabilidade.</w:t>
+      </w:r>
+      <w:r>
+        <w:rPr>
+          <w:lang w:val="pt-PT"/>
+        </w:rPr>
+        <w:t xml:space="preserve"> O perfil de utilizador corresponde ao nível mais restrito, centrado na consulta das suas configurações, no acompanhamento do processo e em interações delimitadas pelo sistema.</w:t>
+      </w:r>
+    </w:p>
+    <w:p>
+      <w:pPr>
+        <w:pStyle w:val="Normal"/>
+        <w:bidi w:val="0"/>
+        <w:jc w:val="left"/>
+        <w:rPr>
+          <w:lang w:val="pt-PT"/>
+        </w:rPr>
+      </w:pPr>
+      <w:r>
+        <w:rPr>
+          <w:lang w:val="pt-PT"/>
+        </w:rPr>
+        <w:t>Esta segmentação traduz uma lógica de controlo de acesso baseada em papéis, procurando equilibrar autonomia, segurança e responsabilidade distribuída, ao tornar claros os limites de intervenção de cada perfil. Importa sublinhar que esta diferenciação não se limita a uma decisão administrativa, participando diretamente na forma como a plataforma enquadra a personalização.</w:t>
+      </w:r>
+    </w:p>
+    <w:p>
+      <w:pPr>
+        <w:pStyle w:val="Normal"/>
+        <w:bidi w:val="0"/>
+        <w:jc w:val="left"/>
+        <w:rPr>
+          <w:lang w:val="pt-PT"/>
+        </w:rPr>
+      </w:pPr>
+      <w:r>
+        <w:rPr>
+          <w:lang w:val="pt-PT"/>
+        </w:rPr>
+        <w:t>Ao reservar certos parâmetros, decisões ou operações a perfis técnicos, o sistema reconhece que nem todos os aspetos da configuração devem ser apresentados ao utilizador final como escolhas livres. Em domínios sensíveis, como o das próteses, a experiência de uso beneficia quando a interface torna visível o processo, mas também quando delimita o campo de ação de forma coerente com critérios de supervisão, segurança e adequação funcional. A literatura sobre interfaces clínicas e interação em próteses inteligentes aponta precisamente para a necessidade de distinguir entre participação informada do utilizador e controlo técnico supervisionado, evitando tanto a opacidade excessiva como a transferência imprudente de responsabilidade para agentes não especializados (Bai et al., 2024 (#ref-bai-2024); Quintero et al., 2018 (#ref-quintero-2018)).</w:t>
+      </w:r>
+    </w:p>
+    <w:p>
+      <w:pPr>
+        <w:pStyle w:val="Normal"/>
+        <w:bidi w:val="0"/>
+        <w:jc w:val="left"/>
+        <w:rPr/>
+      </w:pPr>
+      <w:r>
+        <w:rPr>
+          <w:lang w:val="pt-PT"/>
+        </w:rPr>
+        <w:t xml:space="preserve">Deste modo, o enquadramento conceptual da plataforma articula três objetivos complementares: tornar a lógica paramétrica operável em ambiente web, estruturar a personalização como um processo progressivo e inteligível e distribuir o acesso às operações de acordo com papéis diferenciados. O valor da plataforma, nesta fase, não reside apenas em permitir editar parâmetros à distância, </w:t>
+      </w:r>
+      <w:r>
+        <w:rPr/>
+        <w:t>mas também em reconfigurar o próprio processo de personalização como uma sequência assistida, documentável e passível de revisão crítica. É nessa articulação entre capacidade de configuração, mediação pela interface e organização por perfis que a secção seguinte, dedicada à arquitetura geral do sistema, encontra a sua base conceptual.</w:t>
       </w:r>
     </w:p>
     <w:p>
@@ -14168,7 +14358,7 @@
         <w:rPr>
           <w:lang w:val="pt-PT"/>
         </w:rPr>
-        <w:t>A arquitetura geral do sistema foi concebida como uma estrutura em camadas, organizada para separar a interface, a lógica de aplicação, a persistência de dados e os serviços complementares de apoio à configuração. Esta opção procura responder a um problema central do projeto: tornar operável um modelo paramétrico tecnicamente exigente num ambiente web sem concentrar, no mesmo ponto, responsabilidades de interação, cálculo geométrico, armazenamento e controlo de acesso. Em termos conceptuais, esta separação prolonga a lógica já discutida nas secções anteriores: a personalização digital exige sistemas suficientemente configuráveis para acomodar a variação, mas também suficientemente disciplinados para preservar a coerência, a rastreabilidade e a capacidade de manutenção (Ozdemir et al., 2022 (#ref-ozdemir-2022); Lei et al., 2016 (#ref-lei-2016)).</w:t>
+        <w:t>O sistema organiza-se numa estrutura em camadas, concebida para distinguir a interface de utilização, a lógica de configuração, a persistência de dados e os serviços complementares de apoio ao processo de personalização. Esta opção procura responder a um problema central do projeto: tornar operável um modelo paramétrico tecnicamente exigente num ambiente web sem concentrar, no mesmo ponto, responsabilidades de interação, cálculo geométrico, armazenamento e controlo de acesso. Em termos conceptuais, esta separação prolonga a lógica já discutida nas secções anteriores: a personalização digital exige sistemas suficientemente configuráveis para acomodar a variação, mas também suficientemente disciplinados para preservar a coerência, a rastreabilidade e a capacidade de manutenção (Ozdemir et al., 2022 (#ref-ozdemir-2022); Lei et al., 2016 (#ref-lei-2016)).</w:t>
       </w:r>
     </w:p>
     <w:p>
@@ -14301,63 +14491,165 @@
         <w:pStyle w:val="Normal"/>
         <w:bidi w:val="0"/>
         <w:jc w:val="left"/>
-        <w:rPr>
-          <w:lang w:val="pt-PT"/>
-        </w:rPr>
-      </w:pPr>
-      <w:r>
-        <w:rPr>
-          <w:lang w:val="pt-PT"/>
-        </w:rPr>
-        <w:t>No lado do cliente, a aplicação funciona no navegador e integra os componentes responsáveis pela interface, pela recolha e edição de parâmetros, pela gestão do estado da sessão e pela visualização local dos modelos. No lado do servidor, um serviço desenvolvido em Node.js com Express assegura o fornecimento de ficheiros estáticos, o processamento de pedidos à API, a autenticação de utilizadores, a aplicação de permissões e a comunicação com a camada de persistência. Esta distribuição de responsabilidades evita que a interface dependa de processamento remoto contínuo para todas as operações e, simultaneamente, impede que tarefas sensíveis, como a gestão de utilizadores, o controlo de acessos e a comunicação com serviços externos, fiquem expostas diretamente no cliente. A arquitetura não corresponde, portanto, a uma simples divisão técnica entre “frente” e “retaguarda”, mas sim a uma estratégia de contenção da complexidade e de delimitação explícita de responsabilidades.</w:t>
-      </w:r>
-    </w:p>
-    <w:p>
-      <w:pPr>
-        <w:pStyle w:val="Normal"/>
-        <w:bidi w:val="0"/>
-        <w:jc w:val="left"/>
-        <w:rPr>
-          <w:lang w:val="pt-PT"/>
-        </w:rPr>
-      </w:pPr>
-      <w:r>
-        <w:rPr>
-          <w:lang w:val="pt-PT"/>
-        </w:rPr>
-        <w:t>A camada de persistência assenta numa base de dados SQLite, utilizada para armazenar contas de utilizador, configurações guardadas, relações de atribuição técnica e tokens de autenticação. A escolha desta solução responde ao caráter prototípico e funcional do sistema nesta fase da investigação, privilegiando a leveza de implementação, a portabilidade e a facilidade de manutenção. As configurações paramétricas são armazenadas como estruturas JSON associadas a um modelo e a um utilizador, permitindo preservar diferentes instâncias de personalização, recuperá-las em momentos posteriores e compará-las como estados distintos do processo projetual. Deste modo, a base de dados não funciona apenas como repositório administrativo, mas também como infraestrutura que sustenta a continuidade, o versionamento prático e a rastreabilidade das variantes produzidas.</w:t>
-      </w:r>
-    </w:p>
-    <w:p>
-      <w:pPr>
-        <w:pStyle w:val="Normal"/>
-        <w:bidi w:val="0"/>
-        <w:jc w:val="left"/>
-        <w:rPr>
-          <w:lang w:val="pt-PT"/>
-        </w:rPr>
-      </w:pPr>
-      <w:r>
-        <w:rPr>
-          <w:lang w:val="pt-PT"/>
-        </w:rPr>
-        <w:t>Um dos aspetos mais relevantes da arquitetura é que a renderização geométrica não é executada no servidor. Em vez disso, o cálculo e a geração da geometria tridimensional ocorrem localmente no navegador, por meio de um processo baseado em OpenSCAD, compilado para WebAssembly e executado em um Web Worker. Esta decisão reduz a carga computacional do backend, diminui a dependência de um serviço remoto de renderização e favorece uma interação mais imediata durante a edição paramétrica. Ao mesmo tempo, preserva-se uma fronteira clara: o servidor mantém-se responsável pela autenticação, armazenamento, gestão de configurações e intermediação de chamadas a serviços de inteligência artificial, enquanto o cliente assume a computação geométrica intensiva. A arquitetura resultante é, assim, híbrida: centraliza funções de controlo e persistência, mas distribui localmente a geração formal do modelo.</w:t>
-      </w:r>
-    </w:p>
-    <w:p>
-      <w:pPr>
-        <w:pStyle w:val="Normal"/>
-        <w:bidi w:val="0"/>
-        <w:jc w:val="left"/>
-        <w:rPr>
-          <w:lang w:val="pt-PT"/>
-        </w:rPr>
-      </w:pPr>
-      <w:r>
-        <w:rPr>
-          <w:lang w:val="pt-PT"/>
-        </w:rPr>
-        <w:t>No plano da segurança e do controlo de acesso, a arquitetura incorpora autenticação baseada em JWT, utilização de tokens de atualização em cookies HttpOnly, validação de dados, limitação de pedidos e bloqueio explícito de ficheiros sensíveis. Estes mecanismos não devem ser entendidos como adições periféricas, mas como parte integrante do desenho do sistema, sobretudo num contexto em que múltiplos perfis de utilizador operam sobre configurações potencialmente sensíveis e em que a plataforma articula a autonomia de uso com a supervisão técnica. A literatura sobre interfaces de configuração em contexto protésico sublinha, precisamente, a importância de equilibrar a participação, a diferenciação de permissões e o enquadramento seguro das operações críticas (Quintero et al., 2018 (#ref-quintero-2018); Bai et al., 2024 (#ref-bai-2024)). Neste sentido, a arquitetura traduz uma opção por robustez e extensibilidade controlada: não procura apenas “ligar” componentes, mas estruturar um ecossistema técnico coerente com os requisitos de personalização assistida, gestão multiutilizador e futura evolução da plataforma.</w:t>
+        <w:rPr/>
+      </w:pPr>
+      <w:r>
+        <w:rPr>
+          <w:lang w:val="pt-PT"/>
+        </w:rPr>
+        <w:t xml:space="preserve">No navegador do utilizador, a aplicação integra os componentes responsáveis pela interface, pela recolha e edição de parâmetros, pela gestão do estado da sessão e pela visualização local dos modelos. </w:t>
+      </w:r>
+      <w:r>
+        <w:rPr/>
+        <w:t>No servidor, um serviço desenvolvido em Node.js, com recurso ao framework Express.js, assegura a disponibilização de ficheiros estáticos, o processamento de pedidos à API, a autenticação de utilizadores, a aplicação de permissões e a comunicação com a camada de persistência.</w:t>
+      </w:r>
+      <w:r>
+        <w:rPr>
+          <w:lang w:val="pt-PT"/>
+        </w:rPr>
+        <w:t xml:space="preserve"> Esta distribuição de responsabilidades evita que a interface dependa de processamento remoto contínuo para todas as operações e, simultaneamente, impede que tarefas sensíveis, como a gestão de utilizadores, o controlo de acessos e a comunicação com serviços externos, fiquem expostas diretamente no cliente. A arquitetura não corresponde, portanto, a uma simples divisão técnica entre “frente” </w:t>
+      </w:r>
+      <w:r>
+        <w:rPr>
+          <w:lang w:val="pt-PT"/>
+        </w:rPr>
+        <w:t>(</w:t>
+      </w:r>
+      <w:r>
+        <w:rPr>
+          <w:i/>
+          <w:iCs/>
+          <w:lang w:val="pt-PT"/>
+        </w:rPr>
+        <w:t>frontend</w:t>
+      </w:r>
+      <w:r>
+        <w:rPr>
+          <w:lang w:val="pt-PT"/>
+        </w:rPr>
+        <w:t>)</w:t>
+      </w:r>
+      <w:r>
+        <w:rPr>
+          <w:lang w:val="pt-PT"/>
+        </w:rPr>
+        <w:t xml:space="preserve"> e “retaguarda” </w:t>
+      </w:r>
+      <w:r>
+        <w:rPr>
+          <w:lang w:val="pt-PT"/>
+        </w:rPr>
+        <w:t>(</w:t>
+      </w:r>
+      <w:r>
+        <w:rPr>
+          <w:i/>
+          <w:iCs/>
+          <w:lang w:val="pt-PT"/>
+        </w:rPr>
+        <w:t>backend</w:t>
+      </w:r>
+      <w:r>
+        <w:rPr>
+          <w:lang w:val="pt-PT"/>
+        </w:rPr>
+        <w:t>)</w:t>
+      </w:r>
+      <w:r>
+        <w:rPr>
+          <w:lang w:val="pt-PT"/>
+        </w:rPr>
+        <w:t>, mas sim a uma estratégia de contenção da complexidade e de delimitação explícita de responsabilidades.</w:t>
+      </w:r>
+    </w:p>
+    <w:p>
+      <w:pPr>
+        <w:pStyle w:val="Normal"/>
+        <w:bidi w:val="0"/>
+        <w:jc w:val="left"/>
+        <w:rPr>
+          <w:lang w:val="pt-PT"/>
+        </w:rPr>
+      </w:pPr>
+      <w:r>
+        <w:rPr>
+          <w:lang w:val="pt-PT"/>
+        </w:rPr>
+        <w:t xml:space="preserve">A camada de persistência assenta numa base de dados SQLite, utilizada para armazenar contas de utilizador, configurações guardadas, relações de atribuição técnica e tokens de autenticação. A escolha desta solução responde ao caráter prototípico e funcional do sistema nesta fase da investigação, privilegiando a leveza de implementação, a portabilidade e a facilidade de manutenção. As configurações paramétricas são armazenadas como estruturas JSON associadas a um modelo e a um utilizador, permitindo preservar diferentes instâncias de personalização, recuperá-las em momentos posteriores e compará-las como estados distintos do processo </w:t>
+      </w:r>
+      <w:r>
+        <w:rPr>
+          <w:lang w:val="pt-PT"/>
+        </w:rPr>
+        <w:t>do projeto.</w:t>
+      </w:r>
+      <w:r>
+        <w:rPr>
+          <w:lang w:val="pt-PT"/>
+        </w:rPr>
+        <w:t xml:space="preserve"> Deste modo, a base de dados não funciona apenas como repositório administrativo, mas também como infraestrutura que sustenta a continuidade do processo, a gestão prática de versões e o acompanhamento da evolução das variantes produzidas.</w:t>
+      </w:r>
+    </w:p>
+    <w:p>
+      <w:pPr>
+        <w:pStyle w:val="Normal"/>
+        <w:bidi w:val="0"/>
+        <w:jc w:val="left"/>
+        <w:rPr>
+          <w:lang w:val="pt-PT"/>
+        </w:rPr>
+      </w:pPr>
+      <w:r>
+        <w:rPr>
+          <w:lang w:val="pt-PT"/>
+        </w:rPr>
+        <w:t xml:space="preserve">Um dos aspetos mais relevantes da arquitetura é que a renderização geométrica não é executada no servidor. Em vez disso, o cálculo e a geração da geometria tridimensional ocorrem localmente no navegador, através de uma versão do OpenSCAD compilada para WebAssembly, tecnologia que permite executar código de elevado desempenho em ambiente web. Este processo é realizado num Web Worker, isto é, numa tarefa separada da interface principal, evitando que a geração do modelo bloqueie a interação do utilizador com a plataforma. Esta decisão reduz a carga computacional do </w:t>
+      </w:r>
+      <w:r>
+        <w:rPr>
+          <w:i/>
+          <w:iCs/>
+          <w:lang w:val="pt-PT"/>
+        </w:rPr>
+        <w:t>backen</w:t>
+      </w:r>
+      <w:r>
+        <w:rPr>
+          <w:lang w:val="pt-PT"/>
+        </w:rPr>
+        <w:t>d, diminui a dependência de um serviço remoto de renderização e favorece uma interação mais imediata durante a edição paramétrica. Ao mesmo tempo, preserva-se uma fronteira clara: o servidor mantém-se responsável pela autenticação, armazenamento, gestão de configurações e intermediação de chamadas a serviços de inteligência artificial, enquanto o cliente assume a computação geométrica intensiva. A arquitetura resultante é, assim, híbrida: centraliza funções de controlo e persistência, mas distribui localmente a geração formal do modelo.</w:t>
+      </w:r>
+    </w:p>
+    <w:p>
+      <w:pPr>
+        <w:pStyle w:val="Normal"/>
+        <w:bidi w:val="0"/>
+        <w:jc w:val="left"/>
+        <w:rPr>
+          <w:lang w:val="pt-PT"/>
+        </w:rPr>
+      </w:pPr>
+      <w:r>
+        <w:rPr>
+          <w:lang w:val="pt-PT"/>
+        </w:rPr>
+        <w:t>No plano da segurança e do controlo de acesso, a arquitetura incorpora autenticação baseada em JSON Web Token (JWT), um mecanismo que permite verificar a identidade do utilizador através de credenciais digitais temporárias. A plataforma utiliza ainda tokens de atualização armazenados em cookies HttpOnly, isto é, cookies que não podem ser acedidos diretamente por scripts executados no navegador, reduzindo a exposição a certos tipos de ataque. Estes mecanismos são complementados por validação de dados, limitação de pedidos e bloqueio explícito de ficheiros sensíveis.</w:t>
+      </w:r>
+    </w:p>
+    <w:p>
+      <w:pPr>
+        <w:pStyle w:val="Normal"/>
+        <w:bidi w:val="0"/>
+        <w:jc w:val="left"/>
+        <w:rPr>
+          <w:lang w:val="pt-PT"/>
+        </w:rPr>
+      </w:pPr>
+      <w:r>
+        <w:rPr>
+          <w:lang w:val="pt-PT"/>
+        </w:rPr>
+        <w:t>Estes mecanismos não devem ser entendidos como adições periféricas, mas como parte integrante do desenho do sistema, sobretudo num contexto em que múltiplos perfis de utilizador operam sobre configurações potencialmente sensíveis e em que a plataforma articula a autonomia de uso com a supervisão técnica. A literatura sobre interfaces de configuração em contexto protésico sublinha, precisamente, a importância de equilibrar a participação, a diferenciação de permissões e o enquadramento seguro das operações críticas (Quintero et al., 2018 (#ref-quintero-2018); Bai et al., 2024 (#ref-bai-2024)). Neste sentido, a arquitetura traduz uma opção por robustez e extensibilidade controlada: não procura apenas “ligar” componentes, mas estruturar um ecossistema técnico coerente com os requisitos de personalização assistida, gestão multiutilizador e futura evolução da plataforma.</w:t>
       </w:r>
     </w:p>
     <w:p>
@@ -14419,39 +14711,90 @@
         <w:rPr>
           <w:lang w:val="pt-PT"/>
         </w:rPr>
-        <w:t>A integração do OpenSCAD por meio de WebAssembly constitui um dos elementos</w:t>
-      </w:r>
-    </w:p>
-    <w:p>
-      <w:pPr>
-        <w:pStyle w:val="Normal"/>
-        <w:bidi w:val="0"/>
-        <w:jc w:val="left"/>
-        <w:rPr>
-          <w:lang w:val="pt-PT"/>
-        </w:rPr>
-      </w:pPr>
-      <w:r>
-        <w:rPr>
-          <w:lang w:val="pt-PT"/>
-        </w:rPr>
-        <w:t>técnicos mais relevantes da plataforma, pois permite executar localmente, no navegador, um modelo paramétrico baseado em código, sem depender de um serviço externo de renderização contínua. O OpenSCAD funciona como linguagem e ambiente de modelação em que a geometria é definida por instruções escritas, parâmetros numéricos e relações explícitas entre componentes, em vez de resultar exclusivamente de manipulação gráfica direta. O WebAssembly (WASM), por sua vez, possibilita a execução de aplicações compiladas com desempenho próximo ao nativo no contexto da web. A articulação entre ambos torna viável um cenário particularmente pertinente para esta investigação: preservar a lógica algorítmica do modelo e, ao mesmo tempo, disponibilizá-la num ambiente de utilização mais acessível, orientado por uma interface (Machado et al., 2019 (#ref-machado-2019); Nilsiam &amp; Pearce, 2017 (#ref-nilsiam-2017)).</w:t>
-      </w:r>
-    </w:p>
-    <w:p>
-      <w:pPr>
-        <w:pStyle w:val="Normal"/>
-        <w:bidi w:val="0"/>
-        <w:jc w:val="left"/>
-        <w:rPr>
-          <w:lang w:val="pt-PT"/>
-        </w:rPr>
-      </w:pPr>
-      <w:r>
-        <w:rPr>
-          <w:lang w:val="pt-PT"/>
-        </w:rPr>
-        <w:t>Em termos operacionais, o processo organiza-se em uma cadeia relativamente clara. Os ficheiros .scad, que contêm a definição algorítmica do modelo, e os conjuntos de parâmetros produzidos pela interface são carregados no frontend. Esses elementos são depois encaminhados para um Web Worker, isto é, um processo separado da interface principal, capaz de executar tarefas pesadas em segundo plano. Nesse worker, a versão compilada do OpenSCAD em WASM interpreta o código, aplica os parâmetros recebidos e gera a geometria tridimensional correspondente. O resultado é então devolvido ao ambiente de visualização no navegador, onde o utilizador pode observar os efeitos das alterações introduzidas sem sair da plataforma nem recorrer a software CAD instalado localmente. Esta cadeia de parâmetros -&gt; worker -&gt; OpenSCAD em WASM -&gt; geometria visível é central para o funcionamento do sistema, pois liga a edição, o cálculo e o feedback formal numa sequência rastreável.</w:t>
+        <w:t xml:space="preserve">A integração do OpenSCAD por meio de WebAssembly, </w:t>
+      </w:r>
+      <w:r>
+        <w:rPr>
+          <w:lang w:val="pt-PT"/>
+        </w:rPr>
+        <w:t>como referido anteriormente,</w:t>
+      </w:r>
+      <w:r>
+        <w:rPr>
+          <w:lang w:val="pt-PT"/>
+        </w:rPr>
+        <w:t xml:space="preserve"> constitui um dos elementos técnicos mais relevantes da plataforma, pois permite executar localmente, no navegador, um modelo paramétrico baseado em código, sem depender de um serviço externo de renderização contínua. O OpenSCAD funciona como linguagem e ambiente de modelação em que a geometria é definida por instruções escritas, parâmetros numéricos e relações explícitas entre componentes, em vez de resultar exclusivamente de manipulação gráfica direta. O WebAssembly (WASM), por sua vez, possibilita a execução de aplicações compiladas com desempenho próximo ao nativo no contexto da web. A articulação entre ambos torna viável um cenário particularmente pertinente para esta investigação: preservar a lógica algorítmica do modelo e, ao mesmo tempo, disponibilizá-la num ambiente de utilização mais acessível, orientado por uma interface (Machado et al., 2019 (#ref-machado-2019); Nilsiam &amp; Pearce, 2017 (#ref-nilsiam-2017)).</w:t>
+      </w:r>
+    </w:p>
+    <w:p>
+      <w:pPr>
+        <w:pStyle w:val="Normal"/>
+        <w:bidi w:val="0"/>
+        <w:jc w:val="left"/>
+        <w:rPr>
+          <w:lang w:val="pt-PT"/>
+        </w:rPr>
+      </w:pPr>
+      <w:r>
+        <w:rPr>
+          <w:shd w:fill="FFFF00" w:val="clear"/>
+          <w:lang w:val="pt-PT"/>
+        </w:rPr>
+        <w:t>E</w:t>
+      </w:r>
+      <w:commentRangeStart w:id="84"/>
+      <w:r>
+        <w:rPr>
+          <w:shd w:fill="FFFF00" w:val="clear"/>
+          <w:lang w:val="pt-PT"/>
+        </w:rPr>
+        <w:t xml:space="preserve">m termos operacionais, o processo organiza-se  </w:t>
+      </w:r>
+      <w:r>
+        <w:rPr>
+          <w:shd w:fill="FFFF00" w:val="clear"/>
+          <w:lang w:val="pt-PT"/>
+        </w:rPr>
+        <w:t>n</w:t>
+      </w:r>
+      <w:r>
+        <w:rPr>
+          <w:shd w:fill="FFFF00" w:val="clear"/>
+          <w:lang w:val="pt-PT"/>
+        </w:rPr>
+        <w:t>uma cadeia relativamente clara. Os ficheiros .scad, que contêm a definição algorítmica do modelo, e os conjuntos de parâmetros produzidos pela interface são carregados no frontend.</w:t>
+      </w:r>
+      <w:r>
+        <w:rPr>
+          <w:shd w:fill="FFFF00" w:val="clear"/>
+          <w:lang w:val="pt-PT"/>
+        </w:rPr>
+      </w:r>
+      <w:commentRangeEnd w:id="84"/>
+      <w:r>
+        <w:commentReference w:id="84"/>
+      </w:r>
+      <w:r>
+        <w:rPr>
+          <w:lang w:val="pt-PT"/>
+        </w:rPr>
+        <w:t xml:space="preserve"> </w:t>
+      </w:r>
+      <w:commentRangeStart w:id="85"/>
+      <w:r>
+        <w:rPr>
+          <w:lang w:val="pt-PT"/>
+        </w:rPr>
+        <w:t>Esses elementos são depois encaminhados para um Web Worker, isto é, um processo separado da interface principal, capaz de executar tarefas pesadas em segundo plano. Nesse worker, a versão compilada do OpenSCAD em WASM interpreta o código, aplica os parâmetros recebidos e gera a geometria tridimensional correspondente. O resultado é então devolvido ao ambiente de visualização no navegador, onde o utilizador pode observar os efeitos das alterações introduzidas sem sair da plataforma nem recorrer a software CAD instalado localmente. Esta cadeia de parâmetros -&gt; worker -&gt; OpenSCAD em WASM -&gt; geometria visível é central para o funcionamento do sistema, pois liga a edição, o cálculo e o feedback formal numa sequência rastreável.</w:t>
+      </w:r>
+      <w:commentRangeEnd w:id="85"/>
+      <w:r>
+        <w:commentReference w:id="85"/>
+      </w:r>
+      <w:r>
+        <w:rPr>
+          <w:lang w:val="pt-PT"/>
+        </w:rPr>
       </w:r>
     </w:p>
     <w:p>
@@ -14499,23 +14842,49 @@
         <w:rPr>
           <w:lang w:val="pt-PT"/>
         </w:rPr>
-        <w:t>Esta integração tem ainda valor estratégico no contexto da investigação, pois aproxima a lógica da modelação baseada em código à acessibilidade operacional exigida por uma plataforma web. A literatura sobre OpenSCAD tem sublinhado precisamente a sua afinidade com fluxos repetíveis, configuradores digitais e a partilha de modelos paramétricos em ambientes abertos, ainda que, muitas vezes, fora de contextos protésicos especificamente clínicos (Machado et al., 2019 (#ref-machado-2019); Nilsiam &amp; Pearce, 2017 (#ref-nilsiam-2017)). No presente projeto, a adoção de WASM não representa apenas uma decisão de engenharia para “correr código no browser”; representa a tentativa de integrar, numa mesma infraestrutura, a transparência do modelo paramétrico, a observabilidade da interação e a capacidade de atualização iterativa da geometria.</w:t>
-      </w:r>
-    </w:p>
-    <w:p>
-      <w:pPr>
-        <w:pStyle w:val="Normal"/>
-        <w:bidi w:val="0"/>
-        <w:jc w:val="left"/>
-        <w:rPr>
-          <w:lang w:val="pt-PT"/>
-        </w:rPr>
-      </w:pPr>
-      <w:r>
-        <w:rPr>
-          <w:lang w:val="pt-PT"/>
-        </w:rPr>
-        <w:t>Não obstante as vantagens, esta solução introduz limitações que importa reconhecer. O desempenho da renderização depende da complexidade do modelo, dos valores paramétricos escolhidos e dos recursos do dispositivo do utilizador, podendo resultar em tempos de espera mais longos para geometrias mais exigentes. Acresce que o carregamento inicial do módulo WASM, a serialização de dados entre a interface e o worker e a própria conversão da saída geométrica para formatos visualizáveis introduzem sobrecarga que não existe da mesma forma em ambientes CAD locais dedicados. Assim, a integração de OpenSCAD via WebAssembly deve ser entendida como um compromisso tecnicamente situado: amplia a acessibilidade e a autonomia local, mas o faz dentro dos limites computacionais e operacionais do navegador. O valor da solução reside, por isso, menos numa promessa de desempenho absoluto e mais na capacidade de tornar executável, em ambiente web, um núcleo paramétrico explícito e criticável.</w:t>
+        <w:t xml:space="preserve">Esta integração tem ainda valor estratégico no contexto da investigação, pois aproxima a lógica da modelação baseada em código à acessibilidade operacional exigida por uma plataforma web. A literatura sobre OpenSCAD tem sublinhado precisamente a sua afinidade com fluxos repetíveis, configuradores digitais e a partilha de modelos paramétricos em ambientes abertos, ainda que, muitas vezes, fora de contextos </w:t>
+      </w:r>
+      <w:r>
+        <w:rPr>
+          <w:lang w:val="pt-PT"/>
+        </w:rPr>
+        <w:t>de próteses e</w:t>
+      </w:r>
+      <w:r>
+        <w:rPr>
+          <w:lang w:val="pt-PT"/>
+        </w:rPr>
+        <w:t xml:space="preserve"> especificamente clínicos (Machado et al., 2019 (#ref-machado-2019); Nilsiam &amp; Pearce, 2017 (#ref-nilsiam-2017)). No presente projeto, a adoção de WASM não representa apenas uma decisão de engenharia para “correr código no browser”; representa a tentativa de integrar, numa mesma infraestrutura, a transparência do modelo paramétrico, a observabilidade da interação e a capacidade de atualização iterativa da geometria.</w:t>
+      </w:r>
+    </w:p>
+    <w:p>
+      <w:pPr>
+        <w:pStyle w:val="Normal"/>
+        <w:bidi w:val="0"/>
+        <w:jc w:val="left"/>
+        <w:rPr/>
+      </w:pPr>
+      <w:r>
+        <w:rPr>
+          <w:lang w:val="pt-PT"/>
+        </w:rPr>
+        <w:t xml:space="preserve">Não obstante as vantagens, esta solução introduz limitações que importa reconhecer: O desempenho da renderização depende da complexidade do modelo, dos valores paramétricos escolhidos e dos recursos do dispositivo do utilizador, podendo resultar em tempos de espera mais longos para geometrias mais exigentes. Acresce que o carregamento inicial do módulo WASM, a serialização de dados entre a interface e o worker e a própria conversão da saída geométrica para formatos visualizáveis introduzem sobrecarga que não existe da mesma forma em ambientes CAD locais dedicados. Assim, a integração de OpenSCAD via WebAssembly deve ser entendida como um compromisso tecnicamente situado: amplia a acessibilidade e a autonomia local, mas </w:t>
+      </w:r>
+      <w:r>
+        <w:rPr>
+          <w:lang w:val="pt-PT"/>
+        </w:rPr>
+        <w:t>apenas</w:t>
+      </w:r>
+      <w:r>
+        <w:rPr>
+          <w:lang w:val="pt-PT"/>
+        </w:rPr>
+        <w:t xml:space="preserve"> dentro dos limites computacionais e operacionais do navegador. </w:t>
+      </w:r>
+      <w:r>
+        <w:rPr/>
+        <w:t>O valor da solução reside, por isso, menos numa promessa de desempenho absoluto e mais na capacidade de tornar executável, em ambiente web, um núcleo paramétrico explícito, verificável e sujeito a revisão crítica.</w:t>
       </w:r>
     </w:p>
     <w:p>
@@ -14577,23 +14946,67 @@
         <w:rPr>
           <w:lang w:val="pt-PT"/>
         </w:rPr>
-        <w:t>A estrutura funcional da plataforma organiza-se em um conjunto de módulos interligados que suportam o ciclo completo de configuração paramétrica: seleção do modelo, introdução e edição de parâmetros, visualização tridimensional, sugestões assistidas por IA, gestão de configurações e administração multiutilizador. Esta organização modular não serve apenas para distribuir funcionalidades; também torna o processo de personalização legível e sequencial. Em vez de expor o utilizador a um ambiente indiferenciado de opções, a plataforma reparte o trabalho por etapas e componentes com funções distintas, o que está de acordo com a literatura sobre configuradores digitais, segundo a qual a eficácia da personalização depende, em grande medida, da clareza com que o sistema delimita o espaço de ação disponível e articula feedback com decisão (Ozdemir et al., 2022 (#ref-ozdemir-2022); Peixoto et al., 2025 (#ref-peixoto-2025)).</w:t>
-      </w:r>
-    </w:p>
-    <w:p>
-      <w:pPr>
-        <w:pStyle w:val="Normal"/>
-        <w:bidi w:val="0"/>
-        <w:jc w:val="left"/>
-        <w:rPr>
-          <w:lang w:val="pt-PT"/>
-        </w:rPr>
-      </w:pPr>
-      <w:r>
-        <w:rPr>
-          <w:lang w:val="pt-PT"/>
-        </w:rPr>
-        <w:t>A Figura 5.2 ilustra um precedente particularmente próximo desta lógica: uma ferramenta paramétrica orientada a terapeutas ocupacionais, na qual múltiplas variantes de produto podem ser configuradas a partir de dimensões, materiais e pesos ajustáveis. A sua pertinência para esta dissertação está na demonstração de que a parametrização ganha valor quando é mediada por uma interface capaz de ser usada por profissionais que não são necessariamente modeladores CAD avançados (Li &amp; Aflatoony, 2025 (#ref-li-aflatoony-2025)).</w:t>
+        <w:t xml:space="preserve">A estrutura funcional da plataforma organiza-se </w:t>
+      </w:r>
+      <w:r>
+        <w:rPr>
+          <w:lang w:val="pt-PT"/>
+        </w:rPr>
+        <w:t>n</w:t>
+      </w:r>
+      <w:r>
+        <w:rPr>
+          <w:lang w:val="pt-PT"/>
+        </w:rPr>
+        <w:t xml:space="preserve">um conjunto de módulos interligados que suportam o ciclo completo de configuração paramétrica: seleção do modelo, introdução e edição de parâmetros, visualização tridimensional, sugestões assistidas por IA, gestão de configurações e administração multiutilizador. Esta organização modular não serve apenas para distribuir funcionalidades; também torna o processo de personalização legível e sequencial. Em vez de expor o utilizador a um ambiente indiferenciado de opções, a plataforma reparte o trabalho por etapas e componentes com funções distintas, o que está de acordo com a literatura sobre configuradores digitais, segundo a qual a eficácia da personalização depende, em grande medida, da clareza com que o sistema delimita o espaço de ação disponível e articula </w:t>
+      </w:r>
+      <w:r>
+        <w:rPr>
+          <w:i/>
+          <w:iCs/>
+          <w:lang w:val="pt-PT"/>
+        </w:rPr>
+        <w:t>feedback</w:t>
+      </w:r>
+      <w:r>
+        <w:rPr>
+          <w:lang w:val="pt-PT"/>
+        </w:rPr>
+        <w:t xml:space="preserve"> com decisão (Ozdemir et al., 2022 (#ref-ozdemir-2022); Peixoto et al., 2025 (#ref-peixoto-2025)).</w:t>
+      </w:r>
+    </w:p>
+    <w:p>
+      <w:pPr>
+        <w:pStyle w:val="Normal"/>
+        <w:bidi w:val="0"/>
+        <w:jc w:val="left"/>
+        <w:rPr/>
+      </w:pPr>
+      <w:r>
+        <w:rPr>
+          <w:lang w:val="pt-PT"/>
+        </w:rPr>
+        <w:t xml:space="preserve">A Figura 5.2 ilustra um precedente particularmente próximo desta lógica: uma ferramenta paramétrica orientada a terapeutas ocupacionais, na qual múltiplas variantes de produto podem ser configuradas a partir de dimensões, materiais e pesos ajustáveis. </w:t>
+      </w:r>
+      <w:r>
+        <w:rPr/>
+        <w:t>A sua pertinência para esta dissertação reside em demonstrar que a parametrização ganha valor quando é mediada por uma interface acessível a profissionais que não são necessariamente especialistas em modelação CAD.</w:t>
+      </w:r>
+    </w:p>
+    <w:p>
+      <w:pPr>
+        <w:pStyle w:val="Normal"/>
+        <w:bidi w:val="0"/>
+        <w:jc w:val="left"/>
+        <w:rPr>
+          <w:lang w:val="pt-PT"/>
+        </w:rPr>
+      </w:pPr>
+      <w:r>
+        <w:rPr>
+          <w:lang w:val="pt-PT"/>
+        </w:rPr>
+        <w:t>(Li &amp; Aflatoony, 2025 (#ref-li-aflatoony-2025)).</w:t>
       </w:r>
     </w:p>
     <w:p>
@@ -14718,23 +15131,51 @@
         <w:rPr>
           <w:lang w:val="pt-PT"/>
         </w:rPr>
-        <w:t>O ponto de entrada do sistema é o módulo de seleção de modelos. Cada modelo é descrito por um ficheiro de configuração que inclui o identificador, a descrição, o ficheiro OpenSCAD associado e a lista de parâmetros editáveis. A partir dessa estrutura, a interface consegue gerar dinamicamente os controlos de edição necessários, como sliders, campos numéricos, caixas de seleção ou campos de texto. Esta opção reduz a rigidez do sistema e permite acomodar famílias distintas de modelos paramétricos sem exigir reprogramação manual de cada ecrã. Em termos funcionais, este módulo atua como mediador entre a biblioteca de modelos e a interface, convertendo uma estrutura técnica de ficheiros e parâmetros num ponto de entrada compreensível para a configuração.</w:t>
-      </w:r>
-    </w:p>
-    <w:p>
-      <w:pPr>
-        <w:pStyle w:val="Normal"/>
-        <w:bidi w:val="0"/>
-        <w:jc w:val="left"/>
-        <w:rPr>
-          <w:lang w:val="pt-PT"/>
-        </w:rPr>
-      </w:pPr>
-      <w:r>
-        <w:rPr>
-          <w:lang w:val="pt-PT"/>
-        </w:rPr>
-        <w:t>O núcleo operativo da plataforma situa-se, depois, na articulação entre o módulo de edição paramétrica e o de visualização 3D. Quando os parâmetros são alterados, o sistema recompõe o código, aciona a renderização local e devolve ao utilizador a geometria atualizada. Esta ligação direta entre edição e pré-visualização é decisiva do ponto de vista funcional, pois transforma a manipulação de variáveis abstratas em observação imediata das suas consequências formais. Funções de reposição de valores por defeito, atualização incremental e exportação de ficheiros STL alargam esta utilidade para além da mera experimentação visual, aproximando a plataforma de um ambiente de prototipagem e de preparação para fabrico. A literatura sobre interfaces para configuração assistida em contexto protésico sugere precisamente que a legibilidade do processo melhora quando o utilizador consegue relacionar a ação, a consequência geométrica e a possibilidade de validação num mesmo circuito de interação (Peixoto et al., 2025 (#ref-peixoto-2025); Quintero et al., 2018 (#ref-quintero-2018)).</w:t>
+        <w:t>O ponto de entrada do sistema é o módulo de seleção de modelos. Cada modelo é descrito por um ficheiro de configuração que inclui o identificador, a descrição, o ficheiro OpenSCAD associado e a lista de parâmetros editáveis. A partir dessa estrutura, a interface gera automaticamente os controlos necessários para editar esses parâmetros, incluindo campos numéricos, seletores de valores dentro de intervalos definidos, caixas de seleção e campos de texto. Esta opção reduz a rigidez do sistema e permite acomodar famílias distintas de modelos paramétricos sem exigir reprogramação manual de cada ecrã. Em termos funcionais, este módulo atua como mediador entre a biblioteca de modelos e a interface, convertendo uma estrutura técnica de ficheiros e parâmetros num ponto de entrada compreensível para a configuração.</w:t>
+      </w:r>
+    </w:p>
+    <w:p>
+      <w:pPr>
+        <w:pStyle w:val="Normal"/>
+        <w:bidi w:val="0"/>
+        <w:jc w:val="left"/>
+        <w:rPr>
+          <w:lang w:val="pt-PT"/>
+        </w:rPr>
+      </w:pPr>
+      <w:r>
+        <w:rPr>
+          <w:lang w:val="pt-PT"/>
+        </w:rPr>
+        <w:t xml:space="preserve">O núcleo operativo da plataforma situa-se, depois, na articulação entre o módulo de edição paramétrica e o de visualização 3D. Quando os parâmetros são alterados, o sistema recompõe o código, aciona a renderização local e devolve ao utilizador a geometria atualizada. Esta ligação direta entre edição e pré-visualização é decisiva do ponto de vista funcional, pois transforma a manipulação de variáveis abstratas em observação imediata das suas consequências formais. Funções de reposição de valores por defeito, atualização incremental e exportação de ficheiros </w:t>
+      </w:r>
+      <w:commentRangeStart w:id="86"/>
+      <w:r>
+        <w:rPr>
+          <w:lang w:val="pt-PT"/>
+        </w:rPr>
+        <w:t xml:space="preserve">STL </w:t>
+      </w:r>
+      <w:r>
+        <w:rPr>
+          <w:lang w:val="pt-PT"/>
+        </w:rPr>
+        <w:t>ou 3MF</w:t>
+      </w:r>
+      <w:r>
+        <w:rPr>
+          <w:lang w:val="pt-PT"/>
+        </w:rPr>
+      </w:r>
+      <w:commentRangeEnd w:id="86"/>
+      <w:r>
+        <w:commentReference w:id="86"/>
+      </w:r>
+      <w:r>
+        <w:rPr>
+          <w:lang w:val="pt-PT"/>
+        </w:rPr>
+        <w:t xml:space="preserve"> alargam esta utilidade para além da mera experimentação visual, aproximando a plataforma de um ambiente de prototipagem e de preparação para fabrico. A literatura sobre interfaces para configuração assistida em contexto protésico sugere precisamente que a legibilidade do processo melhora quando o utilizador consegue relacionar a ação, a consequência geométrica e a possibilidade de validação num mesmo circuito de interação (Peixoto et al., 2025 (#ref-peixoto-2025); Quintero et al., 2018 (#ref-quintero-2018)).</w:t>
       </w:r>
     </w:p>
     <w:p>
@@ -14766,109 +15207,185 @@
         <w:rPr>
           <w:lang w:val="pt-PT"/>
         </w:rPr>
-        <w:t>Esta arquitetura corrige uma fragilidade identificada numa versão anterior do sistema, em que o pedido à IA permanecia demasiado associado a um modelo já removido e podia induzir sugestões com nomes de parâmetros inexistentes. Ao ancorar a sugestão no esquema vivo do modelo ativo, a IA passa a operar sobre a mesma gramática paramétrica que a interface, os perfis antropométricos importados e o modelo OpenSCAD. O papel funcional deste módulo não é gerar autonomamente a prótese, mas sim ampliar a capacidade exploratória do sistema, sugerindo pontos de partida plausíveis e ajudando a reduzir a carga inicial de parametrização. Nesta perspetiva, o módulo de IA integra-se no fluxo como suporte à decisão, e não como instância soberana de configuração, o que mantém coerência com a lógica human-in-the-loop assumida no projeto.</w:t>
-      </w:r>
-    </w:p>
-    <w:p>
-      <w:pPr>
-        <w:pStyle w:val="Normal"/>
-        <w:bidi w:val="0"/>
-        <w:jc w:val="left"/>
-        <w:rPr>
-          <w:lang w:val="pt-PT"/>
-        </w:rPr>
-      </w:pPr>
-      <w:r>
-        <w:rPr>
-          <w:lang w:val="pt-PT"/>
-        </w:rPr>
-        <w:t>A evolução posterior do módulo acrescentou uma ancoragem opcional em dados populacionais. Quando o frontend envia a descrição do paciente e o identificador do modelo, o servidor procura o perfil antropométrico populacional mais próximo, considerando atributos como sexo, idade aproximada e país, e projeta as médias desse perfil sobre os parâmetros disponíveis no modelo ativo. O bloco de referência é então anexado ao pedido enviado à IA como prior mensurável, sem se sobrepor a medições diretamente fornecidas pelo utilizador. Esta solução reforça a continuidade entre três caminhos da plataforma: seleção manual de uma baseline populacional, importação de perfis antropométricos e sugestão assistida por IA.</w:t>
-      </w:r>
-    </w:p>
-    <w:p>
-      <w:pPr>
-        <w:pStyle w:val="Normal"/>
-        <w:bidi w:val="0"/>
-        <w:jc w:val="left"/>
-        <w:rPr>
-          <w:lang w:val="pt-PT"/>
-        </w:rPr>
-      </w:pPr>
-      <w:r>
-        <w:rPr>
-          <w:lang w:val="pt-PT"/>
-        </w:rPr>
-        <w:t>Outro componente central é o módulo de gestão de configurações. A possibilidade de nomear, guardar, recuperar, atualizar e eliminar instâncias de personalização é particularmente relevante num processo iterativo, em que diferentes variantes podem corresponder a hipóteses sucessivas de trabalho e não apenas a estados finais. Funcionalmente, este módulo transforma a configuração de um ato momentâneo numa sequência acumulativa e rastreável, permitindo retomar versões anteriores, comparar alternativas e sustentar processos de revisão progressiva. Deste modo, a gestão de configurações não é uma simples conveniência de interface: é parte integrante da estrutura funcional que torna a personalização verificável e acumulável ao longo do tempo.</w:t>
-      </w:r>
-    </w:p>
-    <w:p>
-      <w:pPr>
-        <w:pStyle w:val="Normal"/>
-        <w:bidi w:val="0"/>
-        <w:jc w:val="left"/>
-        <w:rPr>
-          <w:lang w:val="pt-PT"/>
-        </w:rPr>
-      </w:pPr>
-      <w:r>
-        <w:rPr>
-          <w:lang w:val="pt-PT"/>
-        </w:rPr>
-        <w:t>Por fim, a plataforma inclui um módulo administrativo e de controlo de acesso que suporta a organização multiutilizador. Este módulo assegura a criação de contas, a diferenciação de permissões, a atribuição de utilizadores a técnicos e a delimitação das ações acessíveis a cada perfil. A sua presença confirma que a estrutura funcional da plataforma não se esgota na manipulação de parâmetros e na visualização de formas; inclui também a gestão das relações entre agentes, das responsabilidades e dos níveis de intervenção. Neste sentido, a aplicação obtém sugestões paramétricas através do servidor, que se comunica com serviços externos por intermédio de um proxy seguro¹, mas enquadra essa capacidade dentro de uma estrutura funcional mais ampla, em que configuração, supervisão e persistência coexistem como partes de um mesmo sistema operativo.</w:t>
-      </w:r>
-    </w:p>
-    <w:p>
-      <w:pPr>
-        <w:pStyle w:val="Normal"/>
-        <w:bidi w:val="0"/>
-        <w:jc w:val="left"/>
-        <w:rPr>
-          <w:lang w:val="pt-PT"/>
-        </w:rPr>
-      </w:pPr>
-      <w:r>
-        <w:rPr>
-          <w:lang w:val="pt-PT"/>
-        </w:rPr>
-        <w:t xml:space="preserve">¹ </w:t>
-      </w:r>
-      <w:r>
-        <w:rPr>
-          <w:lang w:val="pt-PT"/>
-        </w:rPr>
-        <w:t>Entende-se por proxy seguro uma camada intermédia de comunicação que permite ao servidor gerir os pedidos enviados a serviços externos, protegendo credenciais sensíveis, controlando o acesso e reduzindo a exposição direta da aplicação a sistemas externos.</w:t>
-      </w:r>
-    </w:p>
-    <w:p>
-      <w:pPr>
-        <w:pStyle w:val="Normal"/>
-        <w:bidi w:val="0"/>
-        <w:jc w:val="left"/>
-        <w:rPr>
-          <w:lang w:val="pt-PT"/>
-        </w:rPr>
-      </w:pPr>
-      <w:r>
-        <w:rPr>
-          <w:lang w:val="pt-PT"/>
-        </w:rPr>
-        <w:t>A biblioteca de modelos integrada na plataforma confirma esta lógica modular. Em vez de tratar a prótese como um único ficheiro estático, o sistema organiza diferentes famílias de mãos protésicas como modelos registados, cada uma com parâmetros, dependências, limites e modos de visualização próprios. Esta decisão permitiu comparar estratégias distintas de integração: modelos reconstruídos integralmente em OpenSCAD, modelos provenientes de geometrias existentes e modelos open source já paramétricos, mas não alinhados com a nomenclatura antropométrica da plataforma. A integração não consistiu, portanto, apenas em “carregar” ficheiros tridimensionais; consistiu em traduzir cada modelo para uma interface comum de parâmetros, mantendo as suas restrições mecânicas específicas.</w:t>
-      </w:r>
-    </w:p>
-    <w:p>
-      <w:pPr>
-        <w:pStyle w:val="Normal"/>
-        <w:bidi w:val="0"/>
-        <w:jc w:val="left"/>
-        <w:rPr>
-          <w:lang w:val="pt-PT"/>
-        </w:rPr>
-      </w:pPr>
-      <w:r>
-        <w:rPr>
-          <w:lang w:val="pt-PT"/>
-        </w:rPr>
-        <w:t>No caso do Paraglider Hand, também conhecido como Flexible Flyer, a integração partiu de uma mão mecânica acionada pelo corpo, derivada da linhagem Phoenix e UnLimbited. O desafio principal não foi reconstruir a geometria dos dedos, já definida em OpenSCAD, mas alinhar a lógica original do modelo com os nomes canónicos usados pelo sistema. A palma passou a ser controlada pela largura metacarpal, enquanto os dedos foram associados a comprimentos digitais independentes. Esta separação foi importante porque a largura da palma e o comprimento dos dedos não variam necessariamente de forma proporcional. Ao mesmo tempo, a palma teve de manter escalonamento uniforme, uma vez que os furos cilíndricos para pinos metálicos não podem ser deformados em elipses sem comprometer a montagem. Assim, certas medidas, como o comprimento e a espessura da palma, foram mantidas como informação contextual para a IA e para o perfil antropométrico, mas não foram usadas como transformações geométricas ativas nesse modelo.</w:t>
+        <w:t xml:space="preserve">Esta arquitetura corrige uma fragilidade identificada numa versão anterior do sistema, em que o pedido à IA permanecia demasiado associado a um modelo já removido e podia induzir sugestões com nomes de parâmetros inexistentes. Ao ancorar a sugestão no esquema vivo do modelo ativo, a IA passa a operar sobre a mesma gramática paramétrica que a interface, os perfis antropométricos importados e o modelo OpenSCAD. O papel funcional deste módulo não é gerar autonomamente a prótese, mas sim ampliar a capacidade exploratória do sistema, sugerindo pontos de partida plausíveis e ajudando a reduzir a carga inicial de parametrização. Nesta perspetiva, o módulo de IA integra-se no fluxo como suporte à decisão, e não como instância soberana de configuração, o que mantém coerência com a lógica </w:t>
+      </w:r>
+      <w:r>
+        <w:rPr>
+          <w:i/>
+          <w:iCs/>
+          <w:lang w:val="pt-PT"/>
+        </w:rPr>
+        <w:t>human-in-the-loop</w:t>
+      </w:r>
+      <w:r>
+        <w:rPr>
+          <w:lang w:val="pt-PT"/>
+        </w:rPr>
+        <w:t xml:space="preserve"> assumida no projeto.</w:t>
+      </w:r>
+    </w:p>
+    <w:p>
+      <w:pPr>
+        <w:pStyle w:val="Normal"/>
+        <w:bidi w:val="0"/>
+        <w:jc w:val="left"/>
+        <w:rPr/>
+      </w:pPr>
+      <w:r>
+        <w:rPr>
+          <w:lang w:val="pt-PT"/>
+        </w:rPr>
+        <w:t xml:space="preserve">A evolução posterior do módulo acrescentou uma ancoragem opcional em dados populacionais. Quando o </w:t>
+      </w:r>
+      <w:r>
+        <w:rPr>
+          <w:i/>
+          <w:iCs/>
+          <w:lang w:val="pt-PT"/>
+        </w:rPr>
+        <w:t>frontend</w:t>
+      </w:r>
+      <w:r>
+        <w:rPr>
+          <w:lang w:val="pt-PT"/>
+        </w:rPr>
+        <w:t xml:space="preserve"> envia a descrição do paciente e o identificador do modelo, o servidor procura o perfil antropométrico populacional mais próximo, considerando atributos como sexo, idade aproximada e país, e projeta as médias desse perfil sobre os parâmetros disponíveis no modelo ativo. </w:t>
+      </w:r>
+      <w:r>
+        <w:rPr/>
+        <w:t>O bloco de referência é então anexado ao pedido enviado à IA como ponto de ancoragem quantitativo, permitindo orientar a sugestão paramétrica sem se sobrepor a medições diretamente fornecidas pelo utilizador.</w:t>
+      </w:r>
+      <w:r>
+        <w:rPr>
+          <w:lang w:val="pt-PT"/>
+        </w:rPr>
+        <w:t xml:space="preserve"> </w:t>
+      </w:r>
+      <w:r>
+        <w:rPr/>
+        <w:t>Esta solução reforça a continuidade entre três formas de introdução de dados na plataforma: a seleção manual de um perfil populacional de referência, a importação de perfis antropométricos e a sugestão assistida por IA.</w:t>
+      </w:r>
+    </w:p>
+    <w:p>
+      <w:pPr>
+        <w:pStyle w:val="Normal"/>
+        <w:bidi w:val="0"/>
+        <w:jc w:val="left"/>
+        <w:rPr/>
+      </w:pPr>
+      <w:r>
+        <w:rPr>
+          <w:lang w:val="pt-PT"/>
+        </w:rPr>
+        <w:t xml:space="preserve">Outro componente central é o módulo de gestão de configurações. A possibilidade de nomear, guardar, recuperar, atualizar e eliminar instâncias de personalização é particularmente relevante num processo iterativo, em que diferentes variantes podem corresponder a hipóteses sucessivas de trabalho e não apenas a estados finais. </w:t>
+      </w:r>
+      <w:r>
+        <w:rPr/>
+        <w:t>Funcionalmente, este módulo transforma a configuração de um ato momentâneo numa sequência acumulativa, na qual diferentes estados podem ser guardados, recuperados e comparados ao longo do processo</w:t>
+      </w:r>
+      <w:r>
+        <w:rPr>
+          <w:lang w:val="pt-PT"/>
+        </w:rPr>
+        <w:t>, permitindo retomar versões anteriores, comparar alternativas e sustentar processos de revisão progressiva. Deste modo, a gestão de configurações não é uma simples conveniência de interface: é parte integrante da estrutura funcional que torna a personalização verificável e acumulável ao longo do tempo.</w:t>
+      </w:r>
+    </w:p>
+    <w:p>
+      <w:pPr>
+        <w:pStyle w:val="Normal"/>
+        <w:bidi w:val="0"/>
+        <w:jc w:val="left"/>
+        <w:rPr>
+          <w:lang w:val="pt-PT"/>
+        </w:rPr>
+      </w:pPr>
+      <w:r>
+        <w:rPr>
+          <w:lang w:val="pt-PT"/>
+        </w:rPr>
+        <w:t xml:space="preserve">Por fim, a plataforma inclui um módulo administrativo e de controlo de acesso que suporta a organização multi-utilizador. Este módulo assegura a criação de contas, a diferenciação de permissões, a atribuição de utilizadores a técnicos e a delimitação das ações acessíveis a cada perfil. A sua presença confirma que a estrutura funcional da plataforma não se esgota na manipulação de parâmetros e na visualização de formas; inclui também a gestão das relações entre agentes, das responsabilidades e dos níveis de intervenção. Neste sentido, a aplicação obtém sugestões paramétricas através do servidor, que se comunica com serviços externos por intermédio de um </w:t>
+      </w:r>
+      <w:commentRangeStart w:id="87"/>
+      <w:r>
+        <w:rPr>
+          <w:lang w:val="pt-PT"/>
+        </w:rPr>
+        <w:t>proxy seguro</w:t>
+      </w:r>
+      <w:r>
+        <w:rPr>
+          <w:lang w:val="pt-PT"/>
+        </w:rPr>
+      </w:r>
+      <w:commentRangeEnd w:id="87"/>
+      <w:r>
+        <w:commentReference w:id="87"/>
+      </w:r>
+      <w:r>
+        <w:rPr>
+          <w:lang w:val="pt-PT"/>
+        </w:rPr>
+        <w:t>, mas enquadra essa capacidade dentro de uma estrutura funcional mais ampla, em que configuração, supervisão e persistência coexistem como partes de um mesmo sistema operativo.</w:t>
+      </w:r>
+    </w:p>
+    <w:p>
+      <w:pPr>
+        <w:pStyle w:val="Normal"/>
+        <w:bidi w:val="0"/>
+        <w:jc w:val="left"/>
+        <w:rPr>
+          <w:lang w:val="pt-PT"/>
+        </w:rPr>
+      </w:pPr>
+      <w:r>
+        <w:rPr>
+          <w:lang w:val="pt-PT"/>
+        </w:rPr>
+        <w:t xml:space="preserve">A biblioteca de modelos integrada na plataforma confirma esta lógica modular. Em vez de tratar a prótese como um único ficheiro estático, o sistema organiza diferentes famílias de </w:t>
+      </w:r>
+      <w:r>
+        <w:rPr>
+          <w:lang w:val="pt-PT"/>
+        </w:rPr>
+        <w:t>próteses</w:t>
+      </w:r>
+      <w:r>
+        <w:rPr>
+          <w:lang w:val="pt-PT"/>
+        </w:rPr>
+        <w:t xml:space="preserve"> como modelos registados, cada uma com parâmetros, dependências, limites e modos de visualização próprios. Esta decisão permitiu comparar estratégias distintas de integração: modelos reconstruídos integralmente em OpenSCAD, modelos provenientes de geometrias existentes e modelos open source já paramétricos, mas não alinhados com a nomenclatura antropométrica da plataforma. A integração não consistiu, portanto, apenas em “carregar” ficheiros tridimensionais; consistiu em traduzir cada modelo para uma interface comum de parâmetros, mantendo as suas restrições mecânicas específicas.</w:t>
+      </w:r>
+    </w:p>
+    <w:p>
+      <w:pPr>
+        <w:pStyle w:val="Normal"/>
+        <w:bidi w:val="0"/>
+        <w:jc w:val="left"/>
+        <w:rPr>
+          <w:lang w:val="pt-PT"/>
+        </w:rPr>
+      </w:pPr>
+      <w:commentRangeStart w:id="88"/>
+      <w:r>
+        <w:rPr>
+          <w:lang w:val="pt-PT"/>
+        </w:rPr>
+        <w:t>No caso do Paraglider Hand, também conhecido como Flexible Flyer, a integração partiu de uma mão mecânica acionada pelo corpo, derivada da linhagem Phoenix e UnLimbited.</w:t>
+      </w:r>
+      <w:r>
+        <w:rPr>
+          <w:lang w:val="pt-PT"/>
+        </w:rPr>
+      </w:r>
+      <w:commentRangeEnd w:id="88"/>
+      <w:r>
+        <w:commentReference w:id="88"/>
+      </w:r>
+      <w:r>
+        <w:rPr>
+          <w:lang w:val="pt-PT"/>
+        </w:rPr>
+        <w:t xml:space="preserve"> O desafio principal não foi reconstruir a geometria dos dedos, já definida em OpenSCAD, mas alinhar a lógica original do modelo com os nomes canónicos usados pelo sistema. A palma passou a ser controlada pela largura metacarpal, enquanto os dedos foram associados a comprimentos digitais independentes. Esta separação foi importante porque a largura da palma e o comprimento dos dedos não variam necessariamente de forma proporcional. Ao mesmo tempo, a palma teve de manter escalonamento uniforme, uma vez que os furos cilíndricos para pinos metálicos não podem ser deformados em elipses sem comprometer a montagem. Assim, certas medidas, como o comprimento e a espessura da palma, foram mantidas como informação contextual para a IA e para o perfil antropométrico, mas não foram usadas como transformações geométricas ativas nesse modelo.</w:t>
       </w:r>
     </w:p>
     <w:p>
@@ -14900,23 +15417,69 @@
         <w:rPr>
           <w:lang w:val="pt-PT"/>
         </w:rPr>
-        <w:t>O trabalho realizado sobre modelos do tipo Cyborg Beast/Flexy Hand teve uma função complementar. Estes modelos foram usados como base exploratória para testar uma reparametrização mais ampla, em que a geometria original foi reorganizada em torno de medidas antropométricas da palma, dos dedos, do punho e do membro residual. A versão antropométrica resultante não foi tratada como simples escala global: incorporou comprimentos digitais, espessuras estruturais, canais internos, parâmetros de hardware e dimensões de encaixe derivadas de medidas do antebraço. Essa experiência foi útil para clarificar a diferença entre adaptar um modelo existente por multiplicadores gerais e reconstruir a sua lógica dimensional em torno de uma estrutura antropométrica coerente. Mesmo quando determinados modelos permaneceram como material de desenvolvimento e comparação, contribuíram para estabilizar a taxonomia de parâmetros que a plataforma passou a exigir aos modelos ativos.</w:t>
-      </w:r>
-    </w:p>
-    <w:p>
-      <w:pPr>
-        <w:pStyle w:val="Normal"/>
-        <w:bidi w:val="0"/>
-        <w:jc w:val="left"/>
-        <w:rPr>
-          <w:lang w:val="pt-PT"/>
-        </w:rPr>
-      </w:pPr>
-      <w:r>
-        <w:rPr>
-          <w:lang w:val="pt-PT"/>
-        </w:rPr>
-        <w:t>Em conjunto, estes casos mostram que a escalabilidade da plataforma depende menos da quantidade de modelos disponíveis e mais da existência de uma gramática comum de integração. Cada nova mão exige três operações: identificar quais parâmetros antropométricos são relevantes, decidir que parâmetros podem alterar a geometria sem quebrar interfaces mecânicas e declarar essas relações de forma compreensível para a interface, para o renderizador e para a camada de IA. A biblioteca de modelos torna-se, assim, um campo de validação técnica da própria arquitetura: quanto mais heterogéneos forem os modelos integrados, mais clara se torna a necessidade de separar dados antropométricos, regras geométricas, restrições de fabrico e sugestões assistidas.</w:t>
+        <w:t xml:space="preserve">O trabalho realizado sobre modelos do tipo Cyborg Beast/Flexy Hand teve uma função complementar. Estes modelos foram usados como base exploratória para testar uma reparametrização mais ampla, em que a geometria original foi reorganizada em torno de medidas antropométricas da palma, dos dedos, do punho e do membro residual. A versão antropométrica resultante não foi tratada como simples escala global: incorporou comprimentos digitais, espessuras estruturais, canais internos, </w:t>
+      </w:r>
+      <w:commentRangeStart w:id="89"/>
+      <w:r>
+        <w:rPr>
+          <w:lang w:val="pt-PT"/>
+        </w:rPr>
+        <w:t>parâmetros de hardware</w:t>
+      </w:r>
+      <w:r>
+        <w:rPr>
+          <w:lang w:val="pt-PT"/>
+        </w:rPr>
+      </w:r>
+      <w:commentRangeEnd w:id="89"/>
+      <w:r>
+        <w:commentReference w:id="89"/>
+      </w:r>
+      <w:r>
+        <w:rPr>
+          <w:lang w:val="pt-PT"/>
+        </w:rPr>
+        <w:t xml:space="preserve"> e dimensões de encaixe derivadas de medidas do antebraço. Essa experiência foi útil para clarificar a diferença entre adaptar um modelo existente por multiplicadores gerais e reconstruir a sua lógica dimensional em torno de uma estrutura antropométrica coerente. Mesmo quando determinados modelos permaneceram como material de desenvolvimento e comparação, contribuíram para estabilizar a taxonomia de parâmetros que a plataforma passou a exigir aos modelos ativos.</w:t>
+      </w:r>
+    </w:p>
+    <w:p>
+      <w:pPr>
+        <w:pStyle w:val="Normal"/>
+        <w:bidi w:val="0"/>
+        <w:jc w:val="left"/>
+        <w:rPr>
+          <w:lang w:val="pt-PT"/>
+        </w:rPr>
+      </w:pPr>
+      <w:r>
+        <w:rPr>
+          <w:lang w:val="pt-PT"/>
+        </w:rPr>
+        <w:t xml:space="preserve">Em conjunto, estes casos mostram que a </w:t>
+      </w:r>
+      <w:r>
+        <w:rPr>
+          <w:lang w:val="pt-PT"/>
+        </w:rPr>
+        <w:t>expansão</w:t>
+      </w:r>
+      <w:r>
+        <w:rPr>
+          <w:lang w:val="pt-PT"/>
+        </w:rPr>
+        <w:t xml:space="preserve"> da plataforma depende menos da quantidade de modelos disponíveis e mais da existência de uma gramática comum de integração. Cada nova </w:t>
+      </w:r>
+      <w:r>
+        <w:rPr>
+          <w:lang w:val="pt-PT"/>
+        </w:rPr>
+        <w:t>prótese a integrar no sistema</w:t>
+      </w:r>
+      <w:r>
+        <w:rPr>
+          <w:lang w:val="pt-PT"/>
+        </w:rPr>
+        <w:t xml:space="preserve"> exige três operações: identificar quais parâmetros antropométricos são relevantes, decidir que parâmetros podem alterar a geometria sem quebrar interfaces mecânicas e declarar essas relações de forma compreensível para a interface, para o renderizador e para a camada de IA. A biblioteca de modelos torna-se, assim, um campo de validação técnica da própria arquitetura: quanto mais heterogéneos forem os modelos integrados, mais clara se torna a necessidade de separar dados antropométricos, regras geométricas, restrições de fabrico e sugestões assistidas.</w:t>
       </w:r>
     </w:p>
     <w:p>
@@ -14947,119 +15510,275 @@
         <w:rPr>
           <w:lang w:val="pt-PT"/>
         </w:rPr>
-        <w:t>5.5 Gestão de parâmetros, versões e escalabilidade</w:t>
-      </w:r>
-    </w:p>
-    <w:p>
-      <w:pPr>
-        <w:pStyle w:val="Normal"/>
-        <w:bidi w:val="0"/>
-        <w:jc w:val="left"/>
-        <w:rPr>
-          <w:lang w:val="pt-PT"/>
-        </w:rPr>
-      </w:pPr>
-      <w:r>
-        <w:rPr>
-          <w:lang w:val="pt-PT"/>
-        </w:rPr>
-        <w:t>A gestão de parâmetros constitui uma das condições centrais para transformar um modelo paramétrico em um sistema utilizável e persistente. No caso da plataforma desenvolvida, essa gestão é operacionalizada através de ficheiros de configuração que descrevem cada parâmetro segundo atributos como nome, tipo, valor inicial, limites, incrementos e agrupamento temático. Esta estrutura não cumpre apenas uma função técnica de leitura na interface; formaliza a relação entre o código OpenSCAD, o espaço de variação permitido e os mecanismos de controlo disponibilizados ao utilizador. Em termos metodológicos, esta opção aproxima-se da lógica descrita na literatura sobre configuradores e personalização digital, segundo a qual a eficácia do sistema depende da capacidade de expor apenas parâmetros relevantes, dentro de limites inteligíveis e controlados, preservando a coerência interna do modelo-base (Ozdemir et al., 2022 (#ref-ozdemir-2022); Lei et al., 2016 (#ref-lei-2016)).</w:t>
-      </w:r>
-    </w:p>
-    <w:p>
-      <w:pPr>
-        <w:pStyle w:val="Normal"/>
-        <w:bidi w:val="0"/>
-        <w:jc w:val="left"/>
-        <w:rPr>
-          <w:lang w:val="pt-PT"/>
-        </w:rPr>
-      </w:pPr>
-      <w:r>
-        <w:rPr>
-          <w:lang w:val="pt-PT"/>
-        </w:rPr>
-        <w:t>Ao descrever os parâmetros em estruturas independentes do código geométrico principal, a plataforma obtém duas vantagens. A primeira é a rastreabilidade: torna-se possível saber quais variáveis são editáveis, quais são os seus intervalos válidos e como se articulam com a interface. A segunda é a reconfigurabilidade do próprio sistema: a adição, remoção ou ajuste de parâmetros pode ser realizada sem reescrever integralmente a lógica de interação. Assim, a gestão de parâmetros funciona como uma camada intermédia entre a definição geométrica e a experiência de uso, permitindo que o modelo permaneça tecnicamente explícito sem exigir que o utilizador interaja diretamente com a sua sintaxe interna.</w:t>
-      </w:r>
-    </w:p>
-    <w:p>
-      <w:pPr>
-        <w:pStyle w:val="Normal"/>
-        <w:bidi w:val="0"/>
-        <w:jc w:val="left"/>
-        <w:rPr>
-          <w:lang w:val="pt-PT"/>
-        </w:rPr>
-      </w:pPr>
-      <w:r>
-        <w:rPr>
-          <w:lang w:val="pt-PT"/>
-        </w:rPr>
-        <w:t>A gestão de versões manifesta-se, neste estágio do projeto, sobretudo por meio do armazenamento de configurações salvas. A plataforma permite conservar diferentes conjuntos de parâmetros associados ao mesmo modelo, atribuindo-lhes identificação própria, notas descritivas e associação a um utilizador específico. Embora esta solução ainda não corresponda a um sistema de versionamento completo nos moldes tradicionais do desenvolvimento de software, já suporta uma função projetualmente relevante: acompanhar o processo iterativo de configuração, preservar variantes e permitir a comparação entre estados sucessivos do mesmo artefacto. Cada configuração registada pode, assim, ser entendida como uma instância rastreável do processo de personalização, e não apenas como um ficheiro transitório. Esta capacidade é particularmente importante num contexto em que a personalização não é um ato único, mas uma sequência de aproximações, testes e revisões.</w:t>
-      </w:r>
-    </w:p>
-    <w:p>
-      <w:pPr>
-        <w:pStyle w:val="Normal"/>
-        <w:bidi w:val="0"/>
-        <w:jc w:val="left"/>
-        <w:rPr>
-          <w:lang w:val="pt-PT"/>
-        </w:rPr>
-      </w:pPr>
-      <w:r>
-        <w:rPr>
-          <w:lang w:val="pt-PT"/>
-        </w:rPr>
-        <w:t>Do ponto de vista funcional, a persistência dessas configurações em estruturas JSON associadas a modelos e utilizadores reforça a continuidade entre interação, revisão e reutilização. O sistema deixa de operar apenas em tempo real e passa a acumular histórico operativo, possibilitando retomar soluções anteriores, documentar alternativas exploradas e preparar comparações futuras entre versões. Esta forma de versionamento prático é coerente com o caráter prototípico da plataforma: ainda não pretende substituir mecanismos mais sofisticados de gestão de revisões, mas fornece uma base suficiente para sustentar o acompanhamento iterativo do desenvolvimento e a análise reflexiva do processo.</w:t>
-      </w:r>
-    </w:p>
-    <w:p>
-      <w:pPr>
-        <w:pStyle w:val="Normal"/>
-        <w:bidi w:val="0"/>
-        <w:jc w:val="left"/>
-        <w:rPr>
-          <w:lang w:val="pt-PT"/>
-        </w:rPr>
-      </w:pPr>
-      <w:r>
-        <w:rPr>
-          <w:lang w:val="pt-PT"/>
-        </w:rPr>
-        <w:t>Quanto à escalabilidade, a plataforma beneficia de uma arquitetura modular e orientada para configuração. A separação entre modelos, parâmetros, interface, autenticação e persistência permite acrescentar novos modelos em OpenSCAD, novos tipos de parâmetros ou novas rotinas de apoio sem reestruturar integralmente a aplicação. Na prática, a introdução de um novo modelo exige sobretudo a adição do ficheiro .scad correspondente e o respetivo registo em models-config.json, o que evidencia uma forma de escalabilidade baseada menos na duplicação de código e mais na extensão configurável. Esta característica é consistente com a literatura sobre sistemas paramétricos e famílias de produto, que associa robustez e expansão sustentável à qualidade das estruturas relacionais, e não ao aumento indiscriminado de opções ou de módulos independentes (Lei et al., 2016 (#ref-lei-2016); Ozdemir et al., 2022 (#ref-ozdemir-2022)).</w:t>
-      </w:r>
-    </w:p>
-    <w:p>
-      <w:pPr>
-        <w:pStyle w:val="Normal"/>
-        <w:bidi w:val="0"/>
-        <w:jc w:val="left"/>
-        <w:rPr>
-          <w:lang w:val="pt-PT"/>
-        </w:rPr>
-      </w:pPr>
-      <w:r>
-        <w:rPr>
-          <w:lang w:val="pt-PT"/>
-        </w:rPr>
-        <w:t>Todavia, esta escalabilidade deve ser analisada criticamente. O recurso ao SQLite é adequado a um protótipo funcional com baixa ou média concorrência, mas poderá revelar limitações em cenários de utilização mais intensiva, com múltiplos utilizadores simultâneos, maior volume de configurações ou necessidades mais exigentes de auditoria e sincronização. De forma semelhante, a renderização local via WASM, embora eficaz em muitos contextos, depende do desempenho do dispositivo do utilizador, o que introduz variabilidade na experiência e impõe limites ao crescimento indiscriminado da complexidade geométrica. Assim, a escalabilidade da plataforma não pode ser reduzida à possibilidade de adicionar funcionalidades ou modelos; envolve também a capacidade de sustentar esse crescimento sem perder legibilidade, desempenho, segurança e manutenibilidade.</w:t>
-      </w:r>
-    </w:p>
-    <w:p>
-      <w:pPr>
-        <w:pStyle w:val="Normal"/>
-        <w:bidi w:val="0"/>
-        <w:jc w:val="left"/>
-        <w:rPr>
-          <w:lang w:val="pt-PT"/>
-        </w:rPr>
-      </w:pPr>
-      <w:r>
-        <w:rPr>
-          <w:lang w:val="pt-PT"/>
-        </w:rPr>
-        <w:t>Neste sentido, a secção confirma uma conclusão importante para o projeto: a gestão de parâmetros, de configurações e de expansão futura deve ser entendida como parte integrante da própria lógica de design da plataforma. Não se trata apenas de resolver problemas infraestruturais posteriores, mas de reconhecer que a configurabilidade, a persistência e o crescimento controlado são condições para que a personalização paramétrica permaneça tecnicamente viável e metodologicamente rastreável ao longo do desenvolvimento.</w:t>
+        <w:t xml:space="preserve">5.5 Gestão de parâmetros, versões e </w:t>
+      </w:r>
+      <w:r>
+        <w:rPr>
+          <w:lang w:val="pt-PT"/>
+        </w:rPr>
+        <w:t>expansão</w:t>
+      </w:r>
+    </w:p>
+    <w:p>
+      <w:pPr>
+        <w:pStyle w:val="Heading3"/>
+        <w:bidi w:val="0"/>
+        <w:jc w:val="left"/>
+        <w:rPr>
+          <w:lang w:val="pt-PT"/>
+        </w:rPr>
+      </w:pPr>
+      <w:r>
+        <w:rPr>
+          <w:lang w:val="pt-PT"/>
+        </w:rPr>
+      </w:r>
+    </w:p>
+    <w:p>
+      <w:pPr>
+        <w:pStyle w:val="Normal"/>
+        <w:bidi w:val="0"/>
+        <w:jc w:val="left"/>
+        <w:rPr>
+          <w:lang w:val="pt-PT"/>
+        </w:rPr>
+      </w:pPr>
+      <w:r>
+        <w:rPr>
+          <w:lang w:val="pt-PT"/>
+        </w:rPr>
+        <w:t>Controlar</w:t>
+      </w:r>
+      <w:r>
+        <w:rPr>
+          <w:lang w:val="pt-PT"/>
+        </w:rPr>
+        <w:t xml:space="preserve"> parâmetros constitui uma das condições centrais para transformar um modelo paramétrico </w:t>
+      </w:r>
+      <w:r>
+        <w:rPr>
+          <w:lang w:val="pt-PT"/>
+        </w:rPr>
+        <w:t>n</w:t>
+      </w:r>
+      <w:r>
+        <w:rPr>
+          <w:lang w:val="pt-PT"/>
+        </w:rPr>
+        <w:t>um sistema utilizável e persistente. No caso da plataforma desenvolvida, essa gestão é operacionalizada através de ficheiros de configuração que descrevem cada parâmetro segundo atributos como nome, tipo, valor inicial, limites, incrementos e agrupamento temático. Esta estrutura não cumpre apenas uma função técnica de leitura na interface; formaliza a relação entre o código OpenSCAD, o espaço de variação permitido e os mecanismos de controlo disponibilizados ao utilizador. Em termos metodológicos, esta opção aproxima-se da lógica descrita na literatura sobre configuradores e personalização digital, segundo a qual a eficácia do sistema depende da capacidade de expor apenas parâmetros relevantes, dentro de limites inteligíveis e controlados, preservando a coerência interna do modelo-base (Ozdemir et al., 2022 (#ref-ozdemir-2022); Lei et al., 2016 (#ref-lei-2016)).</w:t>
+      </w:r>
+    </w:p>
+    <w:p>
+      <w:pPr>
+        <w:pStyle w:val="Normal"/>
+        <w:bidi w:val="0"/>
+        <w:jc w:val="left"/>
+        <w:rPr/>
+      </w:pPr>
+      <w:r>
+        <w:rPr>
+          <w:lang w:val="pt-PT"/>
+        </w:rPr>
+        <w:t xml:space="preserve">Ao descrever os parâmetros em estruturas independentes do código geométrico principal, a plataforma obtém duas vantagens. A primeira é a rastreabilidade: torna-se possível saber quais variáveis são editáveis, quais são os seus intervalos válidos e como se articulam com a interface. </w:t>
+      </w:r>
+      <w:r>
+        <w:rPr/>
+        <w:t xml:space="preserve">A segunda vantagem reside na possibilidade de adaptar a estrutura do próprio sistema: parâmetros podem ser adicionados, removidos ou ajustados sem que seja necessário reescrever integralmente a lógica de interação. Assim, a gestão de parâmetros funciona como uma camada intermédia entre a definição geométrica e a experiência de uso, permitindo que o modelo permaneça tecnicamente explícito sem exigir que o utilizador interaja diretamente com a sua sintaxe interna. </w:t>
+      </w:r>
+    </w:p>
+    <w:p>
+      <w:pPr>
+        <w:pStyle w:val="Normal"/>
+        <w:bidi w:val="0"/>
+        <w:jc w:val="left"/>
+        <w:rPr/>
+      </w:pPr>
+      <w:r>
+        <w:rPr>
+          <w:lang w:val="pt-PT"/>
+        </w:rPr>
+        <w:t>A gestão de versões manifesta-se, neste estágio do projeto, sobretudo por meio do armazenamento de configurações salvas. A plataforma permite conservar diferentes conjuntos de parâmetros associados ao mesmo modelo, atribuindo-lhes identificação própria, notas descritivas e associação a um utilizador específico. E</w:t>
+      </w:r>
+      <w:r>
+        <w:rPr/>
+        <w:t>mbora esta solução ainda não corresponda a um sistema completo de gestão de versões, como os utilizados no desenvolvimento de software, já suporta uma função relevante para o processo de projeto: acompanhar a configuração ao longo do tempo, preservar variantes e permitir a comparação entre estados sucessivos do mesmo artefacto.</w:t>
+      </w:r>
+      <w:r>
+        <w:rPr>
+          <w:lang w:val="pt-PT"/>
+        </w:rPr>
+        <w:t xml:space="preserve"> Cada configuração registada pode, assim, ser entendida como uma instância rastreável do processo de personalização, e não apenas como um ficheiro transitório. Esta capacidade é particularmente importante num contexto em que a personalização não é um ato único, mas uma sequência de aproximações, testes e revisões.</w:t>
+      </w:r>
+    </w:p>
+    <w:p>
+      <w:pPr>
+        <w:pStyle w:val="Normal"/>
+        <w:bidi w:val="0"/>
+        <w:jc w:val="left"/>
+        <w:rPr>
+          <w:lang w:val="pt-PT"/>
+        </w:rPr>
+      </w:pPr>
+      <w:r>
+        <w:rPr>
+          <w:lang w:val="pt-PT"/>
+        </w:rPr>
+        <w:t xml:space="preserve">Do ponto de vista funcional, a persistência dessas configurações em estruturas </w:t>
+      </w:r>
+      <w:commentRangeStart w:id="90"/>
+      <w:r>
+        <w:rPr>
+          <w:lang w:val="pt-PT"/>
+        </w:rPr>
+        <w:t>JSON</w:t>
+      </w:r>
+      <w:r>
+        <w:rPr>
+          <w:lang w:val="pt-PT"/>
+        </w:rPr>
+      </w:r>
+      <w:commentRangeEnd w:id="90"/>
+      <w:r>
+        <w:commentReference w:id="90"/>
+      </w:r>
+      <w:r>
+        <w:rPr>
+          <w:lang w:val="pt-PT"/>
+        </w:rPr>
+        <w:t xml:space="preserve"> associadas a modelos e utilizadores reforça a continuidade entre interação, revisão e reutilização. O sistema deixa, assim, de limitar a configuração ao estado temporário da sessão e passa a preservar um registo das configurações realizadas, possibilitando retomar soluções anteriores, documentar alternativas exploradas e preparar comparações futuras entre versões. Esta forma de gestão prática de versões é coerente com o caráter experimental da plataforma: ainda não pretende substituir mecanismos mais sofisticados de gestão de revisões, mas fornece uma base suficiente para sustentar o acompanhamento iterativo do desenvolvimento e a análise reflexiva do processo.</w:t>
+      </w:r>
+    </w:p>
+    <w:p>
+      <w:pPr>
+        <w:pStyle w:val="BodyText"/>
+        <w:bidi w:val="0"/>
+        <w:jc w:val="left"/>
+        <w:rPr/>
+      </w:pPr>
+      <w:r>
+        <w:rPr>
+          <w:lang w:val="pt-PT"/>
+        </w:rPr>
+        <w:t xml:space="preserve">Quanto à capacidade de expansão, a plataforma beneficia de uma arquitetura modular e orientada por ficheiros de configuração. A separação entre modelos, parâmetros, interface, autenticação e persistência permite acrescentar novos modelos em OpenSCAD, novos tipos de parâmetros ou novas rotinas de apoio sem reestruturar integralmente a aplicação. </w:t>
+      </w:r>
+      <w:r>
+        <w:rPr/>
+        <w:t>Na prática, a introdução de um novo modelo exige sobretudo a adição do ficheiro .scad correspondente e o seu registo no ficheiro de configuração dos modelos (models-config.json). Esta estrutura evidencia uma lógica de expansão baseada menos na duplicação de código e mais na extensão controlada da plataforma.</w:t>
+      </w:r>
+      <w:r>
+        <w:rPr>
+          <w:lang w:val="pt-PT"/>
+        </w:rPr>
+        <w:t xml:space="preserve"> Esta característica é consistente com a literatura sobre sistemas paramétricos e famílias de produto, que associa robustez e expansão sustentável à qualidade das estruturas relacionais, e não ao aumento indiscriminado de opções ou de módulos independentes (Lei et al., 2016 (#ref-lei-2016); Ozdemir et al., 2022 (#ref-ozdemir-2022)).</w:t>
+      </w:r>
+    </w:p>
+    <w:p>
+      <w:pPr>
+        <w:pStyle w:val="Normal"/>
+        <w:bidi w:val="0"/>
+        <w:jc w:val="left"/>
+        <w:rPr>
+          <w:lang w:val="pt-PT"/>
+        </w:rPr>
+      </w:pPr>
+      <w:r>
+        <w:rPr>
+          <w:lang w:val="pt-PT"/>
+        </w:rPr>
+        <w:t>Todavia, esta lógica de expansão deve ser analisada criticamente.</w:t>
+      </w:r>
+    </w:p>
+    <w:p>
+      <w:pPr>
+        <w:pStyle w:val="BodyText"/>
+        <w:bidi w:val="0"/>
+        <w:jc w:val="left"/>
+        <w:rPr>
+          <w:lang w:val="pt-PT"/>
+        </w:rPr>
+      </w:pPr>
+      <w:r>
+        <w:rPr>
+          <w:lang w:val="pt-PT"/>
+        </w:rPr>
+        <w:t xml:space="preserve">O recurso ao </w:t>
+      </w:r>
+      <w:commentRangeStart w:id="91"/>
+      <w:r>
+        <w:rPr>
+          <w:lang w:val="pt-PT"/>
+        </w:rPr>
+        <w:t>SQLite</w:t>
+      </w:r>
+      <w:r>
+        <w:rPr>
+          <w:lang w:val="pt-PT"/>
+        </w:rPr>
+      </w:r>
+      <w:commentRangeEnd w:id="91"/>
+      <w:r>
+        <w:commentReference w:id="91"/>
+      </w:r>
+      <w:r>
+        <w:rPr>
+          <w:lang w:val="pt-PT"/>
+        </w:rPr>
+        <w:t xml:space="preserve"> é adequado a um protótipo funcional com um número reduzido ou moderado de acessos simultâneos, mas poderá revelar limitações em cenários de utilização mais intensiva, com maior volume de configurações, operações frequentes de leitura e escrita ou necessidades mais exigentes de auditoria e sincronização.</w:t>
+      </w:r>
+    </w:p>
+    <w:p>
+      <w:pPr>
+        <w:pStyle w:val="BodyText"/>
+        <w:bidi w:val="0"/>
+        <w:jc w:val="left"/>
+        <w:rPr/>
+      </w:pPr>
+      <w:r>
+        <w:rPr>
+          <w:lang w:val="pt-PT"/>
+        </w:rPr>
+        <w:t xml:space="preserve">De forma semelhante, a renderização local via WASM, embora eficaz em muitos contextos, depende do desempenho do dispositivo do utilizador, o que introduz variabilidade na experiência e impõe limites ao crescimento indiscriminado da complexidade geométrica. </w:t>
+      </w:r>
+      <w:r>
+        <w:rPr/>
+        <w:t>Assim, a capacidade de expansão da plataforma não pode ser reduzida à possibilidade de adicionar funcionalidades ou modelos; envolve também a capacidade de sustentar esse crescimento sem perder legibilidade, desempenho, segurança e facilidade de manutenção.</w:t>
+      </w:r>
+    </w:p>
+    <w:p>
+      <w:pPr>
+        <w:pStyle w:val="BodyText"/>
+        <w:bidi w:val="0"/>
+        <w:jc w:val="left"/>
+        <w:rPr>
+          <w:highlight w:val="none"/>
+          <w:shd w:fill="FFFF00" w:val="clear"/>
+          <w:lang w:val="pt-PT"/>
+        </w:rPr>
+      </w:pPr>
+      <w:r>
+        <w:rPr>
+          <w:shd w:fill="FFFF00" w:val="clear"/>
+          <w:lang w:val="pt-PT"/>
+        </w:rPr>
+        <w:t>Neste sentido, a secção confirma uma conclusão importante para o projeto: a gestão de parâmetros, de configurações e da expansão futura deve ser entendida como parte integrante da própria lógica de design da plataforma. Não se trata apenas de resolver problemas infraestruturais posteriores, mas de reconhecer que a capacidade de configuração, a persistência e o crescimento controlado são condições para que a personalização paramétrica permaneça tecnicamente viável e passível de acompanhamento e revisão ao longo do desenvolvimento.</w:t>
+      </w:r>
+    </w:p>
+    <w:p>
+      <w:pPr>
+        <w:pStyle w:val="Normal"/>
+        <w:bidi w:val="0"/>
+        <w:jc w:val="left"/>
+        <w:rPr>
+          <w:highlight w:val="none"/>
+          <w:shd w:fill="FFFF00" w:val="clear"/>
+          <w:lang w:val="pt-PT"/>
+        </w:rPr>
+      </w:pPr>
+      <w:r>
+        <w:rPr>
+          <w:shd w:fill="FFFF00" w:val="clear"/>
+          <w:lang w:val="pt-PT"/>
+        </w:rPr>
       </w:r>
     </w:p>
     <w:p>
@@ -15278,7 +15997,20 @@
         <w:rPr>
           <w:lang w:val="pt-PT"/>
         </w:rPr>
-        <w:t>No plano da personalização, esta mediação é importante porque a adaptação de uma prótese não se reduz ao escalonamento uniforme da forma. A literatura indica que diferentes parâmetros podem ter de ser controlados de forma independente para respeitar as proporções anatómicas, o conforto, a mobilidade e os requisitos de montagem. O estudo de Lim et al. (2018) (#ref-lim-2018), por exemplo, demonstra que o comprimento e a largura de um dedo protésico não devem ser ajustados como se fossem variáveis que variam de forma linear e proporcional, reforçando a necessidade de parametrizações mais finas do que simples operações de escala. De forma convergente, Gu et al. (2024) (#ref-gu-2024) mostram que abordagens data-driven podem apoiar a adaptação estrutural e a melhoria da vestibilidade, sugerindo que métodos inteligentes podem ser úteis para antecipar as relações entre geometria, desempenho e conforto. Para o sistema proposto, isto significa que a IA pode funcionar como uma camada de inferência preliminar sobre um espaço paramétrico já estruturado, e não como um gerador autónomo de soluções.</w:t>
+        <w:t xml:space="preserve">No plano da personalização, esta mediação é importante porque a adaptação de uma prótese não se reduz ao escalonamento uniforme da forma. A literatura indica que diferentes parâmetros podem ter de ser controlados de forma independente para respeitar as proporções anatómicas, o conforto, a mobilidade e os requisitos de montagem. O estudo de Lim et al. (2018) (#ref-lim-2018), por exemplo, demonstra que o comprimento e a largura de um dedo protésico não devem ser ajustados como se fossem variáveis que variam de forma linear e proporcional, reforçando a necessidade de parametrizações mais finas do que simples operações de escala. De forma convergente, Gu et al. (2024) (#ref-gu-2024) mostram que abordagens data-driven podem apoiar a adaptação estrutural e a melhoria da </w:t>
+      </w:r>
+      <w:r>
+        <w:rPr>
+          <w:shd w:fill="FFFF00" w:val="clear"/>
+          <w:lang w:val="pt-PT"/>
+        </w:rPr>
+        <w:t>vestibilidade,</w:t>
+      </w:r>
+      <w:r>
+        <w:rPr>
+          <w:lang w:val="pt-PT"/>
+        </w:rPr>
+        <w:t xml:space="preserve"> sugerindo que métodos inteligentes podem ser úteis para antecipar as relações entre geometria, desempenho e conforto. Para o sistema proposto, isto significa que a IA pode funcionar como uma camada de inferência preliminar sobre um espaço paramétrico já estruturado, e não como um gerador autónomo de soluções.</w:t>
       </w:r>
     </w:p>
     <w:p>
@@ -15954,7 +16686,23 @@
         <w:rPr>
           <w:lang w:val="pt-PT"/>
         </w:rPr>
-        <w:t>Deste modo, a estratégia de interação adotada não deve ser lida apenas como um conjunto de escolhas de interface, mas como uma decisão metodológica sobre a forma de tornar o processo de personalização observável, configurável e criticável. A UI/UX participa diretamente na construção do sistema, atuando como infraestrutura de mediação entre o conhecimento técnico, os dados individuais e a decisão projetual. O seu objetivo não é simplificar artificialmente o problema, mas organizar a complexidade de forma inteligível, preservando continuidade com a lógica paramétrica do modelo e com o enquadramento assistivo da IA discutido no capítulo anterior.</w:t>
+        <w:t>Deste modo, a estratégia de interação adotada não deve ser lida apenas como um conjunto de escolhas de interface, mas como uma decisão metodológica sobre a forma de tornar o processo de personalização observável, configurável e aberto à revisão crítica ao longo do desenvolvimento.</w:t>
+      </w:r>
+    </w:p>
+    <w:p>
+      <w:pPr>
+        <w:pStyle w:val="Normal"/>
+        <w:bidi w:val="0"/>
+        <w:jc w:val="left"/>
+        <w:rPr>
+          <w:lang w:val="pt-PT"/>
+        </w:rPr>
+      </w:pPr>
+      <w:r>
+        <w:rPr>
+          <w:lang w:val="pt-PT"/>
+        </w:rPr>
+        <w:t>A UI/UX participa diretamente na construção do sistema, atuando como infraestrutura de mediação entre o conhecimento técnico, os dados individuais e a decisão projetual. O seu objetivo não é simplificar artificialmente o problema, mas organizar a complexidade de forma inteligível, preservando continuidade com a lógica paramétrica do modelo e com o enquadramento assistivo da IA discutido no capítulo anterior.</w:t>
       </w:r>
     </w:p>
     <w:p>
@@ -18606,7 +19354,23 @@
         <w:rPr>
           <w:lang w:val="pt-PT"/>
         </w:rPr>
-        <w:t>Face aos objetivos da investigação, os resultados reforçam a pertinência de articular design paramétrico, dados antropométricos, interface web e IA numa plataforma única, desde que a IA permaneça enquadrada por regras explícitas e revisão humana. A contribuição não está em automatizar a conceção de uma prótese final, mas em estruturar um fluxo no qual informação incompleta pode ser convertida num ponto de partida dimensionalmente plausível, editável, visualizável e criticável. Esta capacidade responde diretamente ao problema de acessibilidade identificado no projeto: muitos utilizadores conseguem descrever idade, altura, constituição física ou lado amputado, mas não dominam a nomenclatura nem os procedimentos de medição necessários para parametrizar uma mão protésica.</w:t>
+        <w:t>Face aos objetivos da investigação, os resultados reforçam a pertinência de articular design paramétrico, dados antropométricos, interface web e IA numa plataforma única, desde que a IA permaneça enquadrada por regras explícitas e revisão humana. A contribuição não está em automatizar a conceção de uma prótese final, mas em estruturar um fluxo no qual informação incompleta pode ser convertida num ponto de partida dimensionalmente plausível, editável, visualizável e passível de revisão crítica.</w:t>
+      </w:r>
+    </w:p>
+    <w:p>
+      <w:pPr>
+        <w:pStyle w:val="Normal"/>
+        <w:bidi w:val="0"/>
+        <w:jc w:val="left"/>
+        <w:rPr>
+          <w:lang w:val="pt-PT"/>
+        </w:rPr>
+      </w:pPr>
+      <w:r>
+        <w:rPr>
+          <w:lang w:val="pt-PT"/>
+        </w:rPr>
+        <w:t>Esta capacidade responde diretamente ao problema de acessibilidade identificado no projeto: muitos utilizadores conseguem descrever idade, altura, constituição física ou lado amputado, mas não dominam a nomenclatura nem os procedimentos de medição necessários para parametrizar uma mão protésica.</w:t>
       </w:r>
     </w:p>
     <w:p>
@@ -22460,8 +23224,10 @@
         <w:annotationRef/>
       </w:r>
       <w:r>
-        <w:rPr/>
-        <w:t>Isto já fiu definido anteriormento?</w:t>
+        <w:rPr>
+          <w:lang w:val="pt-PT"/>
+        </w:rPr>
+        <w:t>Isto já foi definido anteriormento?</w:t>
       </w:r>
     </w:p>
   </w:comment>
@@ -22680,6 +23446,209 @@
           <w:lang w:val="pt-PT"/>
         </w:rPr>
         <w:t>Sei que já referimos o DfAM antes mas não me recordo se já foi definido.</w:t>
+      </w:r>
+    </w:p>
+  </w:comment>
+  <w:comment w:id="83" w:author="Unknown Author" w:date="2026-07-04T15:20:50Z" w:initials="">
+    <w:p>
+      <w:pPr>
+        <w:overflowPunct w:val="false"/>
+        <w:rPr/>
+      </w:pPr>
+      <w:r>
+        <w:annotationRef/>
+      </w:r>
+      <w:r>
+        <w:rPr>
+          <w:lang w:val="pt-PT"/>
+        </w:rPr>
+        <w:t>Vamos meter aqui uma imagem</w:t>
+      </w:r>
+    </w:p>
+  </w:comment>
+  <w:comment w:id="84" w:author="Unknown Author" w:date="2026-07-04T16:13:25Z" w:initials="">
+    <w:p>
+      <w:pPr>
+        <w:overflowPunct w:val="false"/>
+        <w:rPr/>
+      </w:pPr>
+      <w:r>
+        <w:annotationRef/>
+      </w:r>
+      <w:r>
+        <w:rPr>
+          <w:lang w:val="pt-PT"/>
+        </w:rPr>
+        <w:t>Vamos reescrever isto</w:t>
+      </w:r>
+    </w:p>
+  </w:comment>
+  <w:comment w:id="85" w:author="Unknown Author" w:date="2026-07-04T18:13:58Z" w:initials="">
+    <w:p>
+      <w:pPr>
+        <w:overflowPunct w:val="false"/>
+        <w:rPr/>
+      </w:pPr>
+      <w:r>
+        <w:annotationRef/>
+      </w:r>
+      <w:r>
+        <w:rPr>
+          <w:lang w:val="pt-PT"/>
+        </w:rPr>
+        <w:t>Já escrevemos isto duo no parágrafo anterior.</w:t>
+      </w:r>
+    </w:p>
+  </w:comment>
+  <w:comment w:id="86" w:author="Unknown Author" w:date="2026-07-04T18:35:39Z" w:initials="">
+    <w:p>
+      <w:pPr>
+        <w:overflowPunct w:val="false"/>
+        <w:rPr/>
+      </w:pPr>
+      <w:r>
+        <w:annotationRef/>
+      </w:r>
+      <w:r>
+        <w:rPr>
+          <w:lang w:val="pt-PT"/>
+        </w:rPr>
+        <w:t>Não te esqueças de adicionar ao indice estas siglas.</w:t>
+      </w:r>
+    </w:p>
+  </w:comment>
+  <w:comment w:id="87" w:author="Unknown Author" w:date="2026-07-04T18:49:44Z" w:initials="">
+    <w:p>
+      <w:pPr>
+        <w:overflowPunct w:val="false"/>
+        <w:autoSpaceDE w:val="false"/>
+        <w:bidi w:val="0"/>
+        <w:spacing w:before="0" w:after="0"/>
+        <w:jc w:val="left"/>
+        <w:rPr/>
+      </w:pPr>
+      <w:r>
+        <w:annotationRef/>
+      </w:r>
+      <w:r>
+        <w:rPr>
+          <w:rFonts w:ascii="Calibri" w:hAnsi="Calibri" w:eastAsia="Noto Serif CJK SC" w:cs="Calibri"/>
+          <w:color w:val="auto"/>
+          <w:kern w:val="0"/>
+          <w:sz w:val="22"/>
+          <w:szCs w:val="22"/>
+          <w:lang w:val="pt-PT" w:eastAsia="zh-CN" w:bidi="en-US"/>
+        </w:rPr>
+        <w:t>¹ Entende-se por proxy seguro uma camada intermédia de comunicação que permite ao servidor gerir os pedidos enviados a serviços externos, protegendo credenciais sensíveis, controlando o acesso e reduzindo a exposição direta da aplicação a sistemas externos.</w:t>
+      </w:r>
+    </w:p>
+    <w:p>
+      <w:pPr>
+        <w:overflowPunct w:val="false"/>
+        <w:autoSpaceDE w:val="false"/>
+        <w:bidi w:val="0"/>
+        <w:spacing w:before="0" w:after="0"/>
+        <w:jc w:val="left"/>
+        <w:rPr/>
+      </w:pPr>
+      <w:r>
+        <w:rPr>
+          <w:rFonts w:cs="Calibri" w:eastAsia="Noto Serif CJK SC" w:ascii="Calibri" w:hAnsi="Calibri"/>
+          <w:color w:val="auto"/>
+          <w:kern w:val="0"/>
+          <w:sz w:val="22"/>
+          <w:szCs w:val="22"/>
+          <w:lang w:eastAsia="zh-CN" w:val="pt-PT" w:bidi="en-US"/>
+        </w:rPr>
+      </w:r>
+    </w:p>
+    <w:p>
+      <w:pPr>
+        <w:overflowPunct w:val="false"/>
+        <w:autoSpaceDE w:val="false"/>
+        <w:bidi w:val="0"/>
+        <w:spacing w:before="0" w:after="0"/>
+        <w:jc w:val="left"/>
+        <w:rPr/>
+      </w:pPr>
+      <w:r>
+        <w:rPr>
+          <w:rFonts w:ascii="Calibri" w:hAnsi="Calibri" w:eastAsia="Noto Serif CJK SC" w:cs="Calibri"/>
+          <w:color w:val="auto"/>
+          <w:kern w:val="0"/>
+          <w:sz w:val="22"/>
+          <w:szCs w:val="22"/>
+          <w:lang w:val="pt-PT" w:eastAsia="zh-CN" w:bidi="en-US"/>
+        </w:rPr>
+        <w:t>Já escrevemos proxy antes.</w:t>
+      </w:r>
+    </w:p>
+  </w:comment>
+  <w:comment w:id="88" w:author="Unknown Author" w:date="2026-07-04T18:51:43Z" w:initials="">
+    <w:p>
+      <w:pPr>
+        <w:overflowPunct w:val="false"/>
+        <w:rPr/>
+      </w:pPr>
+      <w:r>
+        <w:annotationRef/>
+      </w:r>
+      <w:r>
+        <w:rPr>
+          <w:lang w:val="pt-PT"/>
+        </w:rPr>
+        <w:t>Faz sentido integrar uma parte sobre a E-nable e os modelos deles.</w:t>
+      </w:r>
+    </w:p>
+  </w:comment>
+  <w:comment w:id="89" w:author="Unknown Author" w:date="2026-07-04T18:53:29Z" w:initials="">
+    <w:p>
+      <w:pPr>
+        <w:overflowPunct w:val="false"/>
+        <w:rPr/>
+      </w:pPr>
+      <w:r>
+        <w:annotationRef/>
+      </w:r>
+      <w:r>
+        <w:rPr>
+          <w:lang w:val="pt-PT"/>
+        </w:rPr>
+        <w:t>Parametros de hardware</w:t>
+      </w:r>
+    </w:p>
+  </w:comment>
+  <w:comment w:id="90" w:author="Unknown Author" w:date="2026-07-04T19:12:30Z" w:initials="">
+    <w:p>
+      <w:pPr>
+        <w:overflowPunct w:val="false"/>
+        <w:rPr/>
+      </w:pPr>
+      <w:r>
+        <w:annotationRef/>
+      </w:r>
+      <w:r>
+        <w:rPr>
+          <w:lang w:val="pt-PT"/>
+        </w:rPr>
+        <w:t>Adicionar ao indice</w:t>
+      </w:r>
+    </w:p>
+  </w:comment>
+  <w:comment w:id="91" w:author="Unknown Author" w:date="2026-07-04T21:37:44Z" w:initials="">
+    <w:p>
+      <w:pPr>
+        <w:overflowPunct w:val="false"/>
+        <w:rPr/>
+      </w:pPr>
+      <w:r>
+        <w:annotationRef/>
+      </w:r>
+      <w:r>
+        <w:rPr>
+          <w:lang w:val="pt-PT"/>
+        </w:rPr>
+        <w:t>Isto está no indice? Vai lá ver</w:t>
       </w:r>
     </w:p>
   </w:comment>

</xml_diff>

<commit_message>
Add Phoenix reconstruction protocol
</commit_message>
<xml_diff>
--- a/projecto-completo.docx
+++ b/projecto-completo.docx
@@ -17038,87 +17038,262 @@
         <w:rPr>
           <w:lang w:val="pt-PT"/>
         </w:rPr>
-        <w:t>A experiência do designer, técnico ou clínico que utiliza a plataforma distingue-se estruturalmente da do utilizador final, embora ambas se desenvolvam sobre a mesma infraestrutura digital. A literatura analisada sugere que esta diferença não decorre apenas de níveis distintos de literacia técnica, mas também do próprio tipo de decisão que cada agente é chamado a tomar. Em sistemas de personalização protésica, diferentes domínios de configuração exigem distribuições distintas de autoridade. Quando estão em causa parâmetros ligados à geometria do encaixe, à biomecânica, à tolerância dos tecidos ou à viabilidade de fabrico, o papel do profissional tende a ser dominante, pois envolve interpretação especializada, validação contextual e responsabilidade técnica. Em contrapartida, quando a configuração incide sobre preferências de controlo, inteligibilidade do sistema ou aspetos estéticos mais diretamente experienciados pelo utilizador, a participação deste torna-se mais substantiva. O contraste entre estes domínios é central para compreender a diferenciação entre perfis de uso, ainda que a literatura direta sobre plataformas paramétricas para o membro superior permaneça escassa e muitas conclusões tenham de ser complementadas por evidência transferível de contextos adjacentes (Cordella et al., 2016 (#ref-cordella-2016); Saldarriaga et al., 2024 (#ref-saldarriaga-2024)).</w:t>
-      </w:r>
-    </w:p>
-    <w:p>
-      <w:pPr>
-        <w:pStyle w:val="Normal"/>
-        <w:bidi w:val="0"/>
-        <w:jc w:val="left"/>
-        <w:rPr>
-          <w:lang w:val="pt-PT"/>
-        </w:rPr>
-      </w:pPr>
-      <w:r>
-        <w:rPr>
-          <w:lang w:val="pt-PT"/>
-        </w:rPr>
-        <w:t>Para o designer, protésico ou clínico, a plataforma funciona sobretudo como um ambiente de trabalho orientado à configuração, ao teste, à comparação de alternativas e à supervisão do processo. O interesse principal deste perfil não está apenas em “ver” a prótese, mas em compreender como os parâmetros se relacionam, quais dependências estruturais existem entre dimensões e quais efeitos pequenas alterações podem produzir na geometria final ou no comportamento do sistema. A evidência transferível proveniente de plataformas de configuração e afinação em contexto protésico indica que profissionais valorizam interfaces que reduzam tempo de ajuste, tornem o espaço paramétrico mais interpretável e mantenham uma continuidade suficiente com o raciocínio clínico ou técnico habitual, incluindo ambientes em que conhecimento especializado é codificado em regras, sugestões iniciais ou ferramentas de comparação (Colombo et al., 2015 (#ref-colombo-2015); Quintero et al., 2018 (#ref-quintero-2018); Bai et al., 2024 (#ref-bai-2024)). Contudo, essa mesma literatura mostra também que a digitalização não aumenta automaticamente a confiança profissional: quando o sistema elimina pistas tácteis, empíricas ou processuais importantes, pode igualmente restringir certas formas de saber prático, como sugere a literatura sobre retificação digital e workflows CAD/CAM.</w:t>
-      </w:r>
-    </w:p>
-    <w:p>
-      <w:pPr>
-        <w:pStyle w:val="Normal"/>
-        <w:bidi w:val="0"/>
-        <w:jc w:val="left"/>
-        <w:rPr>
-          <w:lang w:val="pt-PT"/>
-        </w:rPr>
-      </w:pPr>
-      <w:r>
-        <w:rPr>
-          <w:lang w:val="pt-PT"/>
-        </w:rPr>
-        <w:t>Para o utilizador final, por outro lado, a experiência tende a ser mais centrada na compreensibilidade, na confiança e na perceção de participação. Mesmo quando a pessoa não manipula diretamente todos os parâmetros, a possibilidade de visualizar o modelo, reconhecer alterações e acompanhar o processo de personalização torna a configuração menos opaca. A interface ajuda, assim, a transformar essa adaptação de uma decisão técnica distante em um processo parcialmente observável e inteligível. Este aspeto é particularmente relevante num domínio em que a aceitação de uma prótese não depende apenas do desempenho funcional, mas também da perceção de adequação, de participação e de controlo sobre o resultado. A literatura revisada sugere, de forma consistente, que a inteligibilidade da lógica do sistema influencia a experiência de uso: quando o sistema torna mais visíveis os efeitos das ações, os limites das escolhas ou a relação entre input e comportamento, tende a aumentar tanto a capacidade de uso quanto a confiança subjetiva. Plataformas de personalização estética e sistemas com uma visualização mais explícita do espaço de decisão sugerem, precisamente, que a agência do utilizador cresce quando o domínio editável é legível e de baixo risco (Peixoto et al., 2025 (#ref-peixoto-2025)).</w:t>
-      </w:r>
-    </w:p>
-    <w:p>
-      <w:pPr>
-        <w:pStyle w:val="Normal"/>
-        <w:bidi w:val="0"/>
-        <w:jc w:val="left"/>
-        <w:rPr>
-          <w:lang w:val="pt-PT"/>
-        </w:rPr>
-      </w:pPr>
-      <w:r>
-        <w:rPr>
-          <w:lang w:val="pt-PT"/>
-        </w:rPr>
-        <w:t>Esta diferenciação torna-se mais clara quando se distinguem três domínios de personalização que a literatura tende a tratar de forma distinta. No primeiro, correspondente à geometria do encaixe e ao ajustamento biomecânico, predomina uma lógica clínica: a pessoa fornece feedback sobre conforto, tolerância ou preferência, mas a decisão permanece concentrada em quem detém competência técnica e responsabilidade pela validação. No segundo, correspondente à personalização do controlo e à afinação de sistemas interativos, a autoridade do utilizador tende a aumentar, porque só ele pode avaliar de forma imediata a sensação de controlo, a carga cognitiva ou a adequação do comportamento do sistema em uso. No terceiro, ligado à personalização estética e identitária, a literatura sugere que a autonomia dessa participação pode ser mais ampla, precisamente porque o risco clínico e biomecânico é menor e o critério de adequação é mais diretamente experienciado pelo próprio. Esta distinção é importante porque impede tratar a “participação do utilizador” como uma categoria homogénea.</w:t>
-      </w:r>
-    </w:p>
-    <w:p>
-      <w:pPr>
-        <w:pStyle w:val="Normal"/>
-        <w:bidi w:val="0"/>
-        <w:jc w:val="left"/>
-        <w:rPr>
-          <w:lang w:val="pt-PT"/>
-        </w:rPr>
-      </w:pPr>
-      <w:r>
-        <w:rPr>
-          <w:lang w:val="pt-PT"/>
-        </w:rPr>
-        <w:t>A coexistência destes perfis e domínios justifica a adoção de permissões diferenciadas e de uma experiência graduada por papéis. O sistema não distribui o mesmo poder de edição a todos os agentes, pois isso reduziria a segurança, a coerência e a legibilidade do processo. Em vez disso, estrutura diferentes níveis de acesso, permitindo que determinadas ações sejam reservadas a perfis técnicos, enquanto outras se mantêm acessíveis ao utilizador que acompanha a sua configuração. Esta diferenciação não deve ser entendida como uma limitação arbitrária, mas como uma decisão de desenho que procura equilibrar autonomia, segurança e responsabilidade. A literatura recente sobre próteses inteligentes e interfaces configuráveis aponta no mesmo sentido, defendendo modelos de controlo em que parâmetros críticos permanecem sob supervisão profissional, enquanto ajustes mais circunscritos podem tornar-se acessíveis ao utilizador final (Bai et al., 2024 (#ref-bai-2024); Quintero et al., 2018 (#ref-quintero-2018)).</w:t>
-      </w:r>
-    </w:p>
-    <w:p>
-      <w:pPr>
-        <w:pStyle w:val="Normal"/>
-        <w:bidi w:val="0"/>
-        <w:jc w:val="left"/>
-        <w:rPr>
-          <w:lang w:val="pt-PT"/>
-        </w:rPr>
-      </w:pPr>
-      <w:r>
-        <w:rPr>
-          <w:lang w:val="pt-PT"/>
-        </w:rPr>
-        <w:t>A Figura 7.1 ilustra a importância de observar a experiência em uso, e não apenas a configuração abstrata do dispositivo. O teste com utilizador permite identificar problemas de acoplamento, ativação, conforto e adequação funcional que não emergem de forma suficiente no modelo digital. Para esta investigação, a imagem funciona como lembrete metodológico: a plataforma pode tornar o processo mais legível e configurável, mas a experiência situada continua a ser indispensável para validação futura (Silva et al., 2018 (#ref-silva-alcara-2018)).</w:t>
+        <w:t>A plataforma foi estruturada para acomodar formas distintas de participação no processo de configuração, uma vez que designers, técnicos, clínicos e utilizadores finais não intervêm sobre os mesmos parâmetros nem assumem o mesmo grau de responsabilidade. Os estudos analisados sugerem que esta diferença não resulta apenas de níveis distintos de literacia técnica, mas também do tipo de decisão que cada interveniente é chamado a tomar.</w:t>
+      </w:r>
+    </w:p>
+    <w:p>
+      <w:pPr>
+        <w:pStyle w:val="Normal"/>
+        <w:bidi w:val="0"/>
+        <w:jc w:val="left"/>
+        <w:rPr>
+          <w:lang w:val="pt-PT"/>
+        </w:rPr>
+      </w:pPr>
+      <w:r>
+        <w:rPr>
+          <w:lang w:val="pt-PT"/>
+        </w:rPr>
+        <w:t xml:space="preserve">Em sistemas de personalização protésica, diferentes domínios de configuração exigem distribuições distintas de autoridade. Quando estão em causa parâmetros ligados à geometria do encaixe, à biomecânica, à tolerância dos tecidos ou à viabilidade de fabrico, o papel do profissional tende a ser dominante, pois envolve interpretação especializada, validação contextual e responsabilidade técnica. </w:t>
+      </w:r>
+      <w:r>
+        <w:rPr/>
+        <w:t>Em contrapartida, quando a configuração incide sobre preferências de controlo, clareza do sistema ou aspetos estéticos que o utilizador consegue avaliar diretamente, a sua participação torna-se mais substantiva.</w:t>
+      </w:r>
+    </w:p>
+    <w:p>
+      <w:pPr>
+        <w:pStyle w:val="Normal"/>
+        <w:bidi w:val="0"/>
+        <w:jc w:val="left"/>
+        <w:rPr>
+          <w:lang w:val="pt-PT"/>
+        </w:rPr>
+      </w:pPr>
+      <w:r>
+        <w:rPr>
+          <w:lang w:val="pt-PT"/>
+        </w:rPr>
+        <w:t>O contraste entre estes domínios é central para compreender a diferenciação entre perfis de uso, ainda que a literatura direta sobre plataformas paramétricas para o membro superior permaneça escassa e muitas conclusões tenham de ser complementadas por evidência transferível de contextos adjacentes (Cordella et al., 2016 (#ref-cordella-2016); Saldarriaga et al., 2024 (#ref-saldarriaga-2024)).</w:t>
+      </w:r>
+    </w:p>
+    <w:p>
+      <w:pPr>
+        <w:pStyle w:val="Normal"/>
+        <w:bidi w:val="0"/>
+        <w:jc w:val="left"/>
+        <w:rPr>
+          <w:lang w:val="pt-PT"/>
+        </w:rPr>
+      </w:pPr>
+      <w:r>
+        <w:rPr>
+          <w:lang w:val="pt-PT"/>
+        </w:rPr>
+        <w:t xml:space="preserve">Para o designer, </w:t>
+      </w:r>
+      <w:r>
+        <w:rPr>
+          <w:lang w:val="pt-PT"/>
+        </w:rPr>
+        <w:t xml:space="preserve">técnico especialista de próteses e ortóteses. </w:t>
+      </w:r>
+      <w:r>
+        <w:rPr>
+          <w:lang w:val="pt-PT"/>
+        </w:rPr>
+        <w:t xml:space="preserve">ou clínico, a plataforma funciona sobretudo como um ambiente de trabalho orientado à configuração, ao teste, à comparação de alternativas e à supervisão do processo. O interesse principal deste perfil não está apenas em “ver” a prótese, mas em compreender como os parâmetros se relacionam, quais dependências estruturais existem entre dimensões e quais efeitos pequenas alterações podem produzir na geometria final ou no comportamento do sistema. A evidência transferível proveniente de plataformas de configuração e afinação em contexto protésico indica que profissionais valorizam interfaces que reduzam tempo de ajuste, tornem o espaço paramétrico mais interpretável e mantenham uma continuidade suficiente com o raciocínio clínico ou técnico habitual, incluindo ambientes em que conhecimento especializado é codificado em regras, sugestões iniciais ou ferramentas de comparação (Colombo et al., 2015 (#ref-colombo-2015); Quintero et al., 2018 (#ref-quintero-2018); Bai et al., 2024 (#ref-bai-2024)). </w:t>
+      </w:r>
+      <w:r>
+        <w:rPr/>
+        <w:t>Os estudos consultados mostram, contudo, que a digitalização só reforça a confiança profissional quando mantém continuidade com elementos relevantes do processo de ajuste. A redução de indícios tácteis, empíricos ou processuais pode limitar formas de saber prático associadas à experiência clínica e técnica, como sugerem os estudos sobre retificação digital e fluxos CAD/CAM.</w:t>
+      </w:r>
+    </w:p>
+    <w:p>
+      <w:pPr>
+        <w:pStyle w:val="Normal"/>
+        <w:bidi w:val="0"/>
+        <w:jc w:val="left"/>
+        <w:rPr>
+          <w:lang w:val="pt-PT"/>
+        </w:rPr>
+      </w:pPr>
+      <w:r>
+        <w:rPr>
+          <w:lang w:val="pt-PT"/>
+        </w:rPr>
+        <w:t xml:space="preserve">No caso do utilizador final, a experiência tende a concentrar-se na compreensão do processo, na construção de confiança e na perceção de participação. Mesmo quando nem todos os parâmetros são diretamente editáveis, a visualização do modelo, o reconhecimento das alterações e o acompanhamento da personalização contribuem para tornar a configuração </w:t>
+      </w:r>
+      <w:r>
+        <w:rPr>
+          <w:lang w:val="pt-PT"/>
+        </w:rPr>
+        <w:t>menos opaca</w:t>
+      </w:r>
+      <w:r>
+        <w:rPr>
+          <w:lang w:val="pt-PT"/>
+        </w:rPr>
+        <w:t xml:space="preserve">. </w:t>
+      </w:r>
+      <w:r>
+        <w:rPr/>
+        <w:t>A interface contribui, assim, para tornar a adaptação menos distante do utilizador, apresentando-a como um processo parcialmente observável, compreensível e passível de acompanhamento.</w:t>
+      </w:r>
+    </w:p>
+    <w:p>
+      <w:pPr>
+        <w:pStyle w:val="Normal"/>
+        <w:bidi w:val="0"/>
+        <w:jc w:val="left"/>
+        <w:rPr>
+          <w:lang w:val="pt-PT"/>
+        </w:rPr>
+      </w:pPr>
+      <w:r>
+        <w:rPr>
+          <w:lang w:val="pt-PT"/>
+        </w:rPr>
+        <w:t>Quando a</w:t>
+      </w:r>
+      <w:r>
+        <w:rPr>
+          <w:lang w:val="pt-PT"/>
+        </w:rPr>
+        <w:t xml:space="preserve"> aceitação de uma prótese não depende apenas do desempenho funcional, mas também da perceção de adequação, de participação e de controlo sobre o resultado, </w:t>
+      </w:r>
+      <w:r>
+        <w:rPr>
+          <w:lang w:val="pt-PT"/>
+        </w:rPr>
+        <w:t>este aspecto assume relevância</w:t>
+      </w:r>
+      <w:r>
+        <w:rPr>
+          <w:lang w:val="pt-PT"/>
+        </w:rPr>
+        <w:t xml:space="preserve">. </w:t>
+      </w:r>
+      <w:r>
+        <w:rPr/>
+        <w:t>Os estudos analisados sugerem, de forma consistente, que a clareza com que o sistema comunica o seu funcionamento influencia a experiência de utilização.</w:t>
+      </w:r>
+    </w:p>
+    <w:p>
+      <w:pPr>
+        <w:pStyle w:val="Normal"/>
+        <w:bidi w:val="0"/>
+        <w:jc w:val="left"/>
+        <w:rPr>
+          <w:lang w:val="pt-PT"/>
+        </w:rPr>
+      </w:pPr>
+      <w:r>
+        <w:rPr/>
+        <w:t>Quando a plataforma torna mais visíveis os efeitos das ações, os limites das escolhas e a relação entre os dados introduzidos e o comportamento do modelo, reforça a facilidade de utilização e a confiança subjetiva.</w:t>
+      </w:r>
+    </w:p>
+    <w:p>
+      <w:pPr>
+        <w:pStyle w:val="Normal"/>
+        <w:bidi w:val="0"/>
+        <w:jc w:val="left"/>
+        <w:rPr>
+          <w:lang w:val="pt-PT"/>
+        </w:rPr>
+      </w:pPr>
+      <w:r>
+        <w:rPr/>
+        <w:t>As plataformas de personalização estética e os sistemas com visualização explícita do espaço de decisão sugerem que a participação ativa do utilizador aumenta quando as opções editáveis são claras, compreensíveis e associadas a consequências de baixo risco.</w:t>
+      </w:r>
+      <w:r>
+        <w:rPr>
+          <w:lang w:val="pt-PT"/>
+        </w:rPr>
+        <w:t xml:space="preserve"> (Peixoto et al., 2025 (#ref-peixoto-2025)).</w:t>
+      </w:r>
+    </w:p>
+    <w:p>
+      <w:pPr>
+        <w:pStyle w:val="Normal"/>
+        <w:bidi w:val="0"/>
+        <w:jc w:val="left"/>
+        <w:rPr>
+          <w:lang w:val="pt-PT"/>
+        </w:rPr>
+      </w:pPr>
+      <w:r>
+        <w:rPr>
+          <w:lang w:val="pt-PT"/>
+        </w:rPr>
+        <w:t xml:space="preserve">A diferença entre estes níveis de participação torna-se mais clara quando se consideram três domínios de personalização que os estudos analisados abordam de forma diferenciada. </w:t>
+      </w:r>
+      <w:r>
+        <w:rPr/>
+        <w:t>O primeiro domínio diz respeito à geometria do encaixe e ao ajustamento biomecânico, predominando aqui uma lógica clínica. Neste caso, a pessoa pode fornecer feedback sobre conforto, tolerância ou preferência, mas a decisão permanece centrada no interveniente com competência técnica e responsabilidade pela validação. O segundo domínio corresponde à personalização do controlo e à afinação de sistemas interativos, nos quais a autoridade do utilizador tende a aumentar, uma vez que a sensação de controlo, a carga cognitiva e a adequação do comportamento do sistema em uso dependem da sua avaliação direta. O terceiro domínio relaciona-se com a personalização estética e identitária, em que a autonomia do utilizador pode ser mais ampla, dado que o risco clínico e biomecânico é menor e o critério de adequação depende mais diretamente da sua perceção.</w:t>
+      </w:r>
+    </w:p>
+    <w:p>
+      <w:pPr>
+        <w:pStyle w:val="Normal"/>
+        <w:bidi w:val="0"/>
+        <w:jc w:val="left"/>
+        <w:rPr>
+          <w:lang w:val="pt-PT"/>
+        </w:rPr>
+      </w:pPr>
+      <w:r>
+        <w:rPr>
+          <w:lang w:val="pt-PT"/>
+        </w:rPr>
+        <w:t xml:space="preserve">A coexistência destes perfis e domínios justifica a adoção de permissões diferenciadas e de uma experiência graduada por papéis. O sistema não distribui o mesmo poder de edição a todos os agentes, pois isso reduziria a segurança, a coerência e a legibilidade do processo. Em vez disso, estrutura diferentes níveis de acesso, permitindo que determinadas ações sejam reservadas a perfis técnicos, enquanto outras se mantêm acessíveis ao utilizador que acompanha a sua configuração. Esta diferenciação não deve ser entendida como uma limitação arbitrária, mas como uma decisão de desenho que procura equilibrar autonomia, segurança e responsabilidade. </w:t>
+      </w:r>
+      <w:r>
+        <w:rPr/>
+        <w:t>Os estudos recentes sobre próteses inteligentes e interfaces configuráveis reforçam esta leitura, ao defenderem modelos de controlo nos quais os parâmetros críticos permanecem sob supervisão profissional, enquanto ajustes mais delimitados podem ser acessíveis ao utilizador final (Bai et al., 2024 (#ref-bai-2024); Quintero et al., 2018 (#ref-quintero-2018)).</w:t>
+      </w:r>
+    </w:p>
+    <w:p>
+      <w:pPr>
+        <w:pStyle w:val="Normal"/>
+        <w:bidi w:val="0"/>
+        <w:jc w:val="left"/>
+        <w:rPr>
+          <w:lang w:val="pt-PT"/>
+        </w:rPr>
+      </w:pPr>
+      <w:r>
+        <w:rPr>
+          <w:lang w:val="pt-PT"/>
+        </w:rPr>
+        <w:t>A Figura 7.1 evidencia a importância de analisar a utilização concreta do dispositivo, para além da sua configuração digital. A avaliação com utilizador</w:t>
+      </w:r>
+      <w:r>
+        <w:rPr>
+          <w:lang w:val="pt-PT"/>
+        </w:rPr>
+        <w:t>es</w:t>
+      </w:r>
+      <w:r>
+        <w:rPr>
+          <w:lang w:val="pt-PT"/>
+        </w:rPr>
+        <w:t xml:space="preserve"> permite identificar problemas relacionados com o ajuste ao corpo, o modo de ativação, o conforto e a adequação funcional, aspetos que dificilmente são detetados de forma suficiente apenas através do modelo digital. Para esta investigação, a imagem constitui um ponto de referência metodológico: embora a plataforma possa tornar o processo mais claro e configurável, a validação futura continua a depender da observação do uso em contexto real (Silva et al., 2018 (#ref-silva-alcara-2018)).</w:t>
+      </w:r>
+    </w:p>
+    <w:p>
+      <w:pPr>
+        <w:pStyle w:val="Normal"/>
+        <w:bidi w:val="0"/>
+        <w:jc w:val="left"/>
+        <w:rPr>
+          <w:lang w:val="pt-PT"/>
+        </w:rPr>
+      </w:pPr>
+      <w:r>
+        <w:rPr>
+          <w:lang w:val="pt-PT"/>
+        </w:rPr>
       </w:r>
     </w:p>
     <w:p>
@@ -17232,14 +17407,257 @@
         <w:rPr>
           <w:lang w:val="pt-PT"/>
         </w:rPr>
-        <w:t>Do ponto de vista da experiência global, a plataforma revela-se mais forte quando entendida como um espaço de colaboração assimétrica. O designer ou técnico dispõe de uma ferramenta que acelera iterações, estrutura a exploração paramétrica e apoia decisões de maior responsabilidade; o utilizador final ganha maior transparência, inteligibilidade e possibilidade de acompanhamento; e o sistema, no seu conjunto, passa a oferecer uma cadeia de interação mais clara entre o conhecimento especializado e a necessidade individual.</w:t>
+        <w:t xml:space="preserve">Do ponto de vista da experiência global, a plataforma deve ser entendida como um espaço de colaboração assimétrica. Neste enquadramento, o designer ou técnico dispõe de uma ferramenta que acelera iterações, estrutura a exploração paramétrica e apoia decisões de maior responsabilidade, enquanto o utilizador final obtém maior transparência, compreensão do processo e possibilidade de acompanhamento. O sistema passa, assim, a articular de forma mais clara o conhecimento especializado e a necessidade individual. </w:t>
+      </w:r>
+      <w:r>
+        <w:rPr/>
+        <w:t>A utilização da plataforma deve ser entendida, por isso, como uma forma de organizar a intervenção dos diferentes participantes no processo de personalização, articulando decisões técnicas, acompanhamento pelo utilizador e mediação pela interface.</w:t>
+      </w:r>
+      <w:r>
+        <w:rPr>
+          <w:lang w:val="pt-PT"/>
+        </w:rPr>
+        <w:t xml:space="preserve"> Esta leitura é consistente com abordagens human-in-the-loop, nas quais as preferências do utilizador, o ajustamento algorítmico e a supervisão profissional coexistem de forma hierárquica e não mutuamente exclusiva, ao mesmo tempo que a literatura mais ampla sobre fabrico digital em próteses continua a assinalar lacunas de formação, validação longitudinal e comparação sistemática entre workflows (Alili et al., 2023 (#ref-alili-2023); Oldfrey et al., 2024 (#ref-oldfrey-2024)). </w:t>
+      </w:r>
+      <w:r>
+        <w:rPr/>
+        <w:t>A distribuição diferenciada de acesso, interpretação e decisão conduz, assim, à questão seguinte: compreender de que modo a plataforma medeia o processo de design, para além de definir quem participa na sua utilização.</w:t>
+      </w:r>
+    </w:p>
+    <w:p>
+      <w:pPr>
+        <w:pStyle w:val="Heading3"/>
+        <w:bidi w:val="0"/>
+        <w:jc w:val="left"/>
+        <w:rPr>
+          <w:lang w:val="pt-PT"/>
+        </w:rPr>
+      </w:pPr>
+      <w:r>
+        <w:rPr>
+          <w:lang w:val="pt-PT"/>
+        </w:rPr>
+      </w:r>
+    </w:p>
+    <w:p>
+      <w:pPr>
+        <w:pStyle w:val="Heading3"/>
+        <w:bidi w:val="0"/>
+        <w:jc w:val="left"/>
+        <w:rPr>
+          <w:lang w:val="pt-PT"/>
+        </w:rPr>
+      </w:pPr>
+      <w:r>
+        <w:rPr>
+          <w:lang w:val="pt-PT"/>
+        </w:rPr>
+        <w:t>7.3 Mediação do processo de design e reflexão crítica</w:t>
+      </w:r>
+    </w:p>
+    <w:p>
+      <w:pPr>
+        <w:pStyle w:val="Heading3"/>
+        <w:bidi w:val="0"/>
+        <w:jc w:val="left"/>
+        <w:rPr>
+          <w:lang w:val="pt-PT"/>
+        </w:rPr>
+      </w:pPr>
+      <w:r>
+        <w:rPr>
+          <w:lang w:val="pt-PT"/>
+        </w:rPr>
+      </w:r>
+    </w:p>
+    <w:p>
+      <w:pPr>
+        <w:pStyle w:val="Normal"/>
+        <w:bidi w:val="0"/>
+        <w:jc w:val="left"/>
+        <w:rPr>
+          <w:lang w:val="pt-PT"/>
+        </w:rPr>
+      </w:pPr>
+      <w:r>
+        <w:rPr>
+          <w:lang w:val="pt-PT"/>
+        </w:rPr>
+        <w:t xml:space="preserve">O contributo mais relevante da interface não reside apenas em permitir editar parâmetros, mas também em mediar o próprio processo de design. A plataforma introduz uma camada intermédia entre o modelo algorítmico, a decisão técnica e a interpretação do utilizador, reorganizando o desenvolvimento da prótese como uma sequência de interações assistidas. Esta mediação é importante porque reduz a dependência de manipulação direta do código </w:t>
+      </w:r>
+      <w:r>
+        <w:rPr>
+          <w:lang w:val="pt-PT"/>
+        </w:rPr>
+        <w:t>e</w:t>
+      </w:r>
+      <w:r>
+        <w:rPr>
+          <w:lang w:val="pt-PT"/>
+        </w:rPr>
+        <w:t xml:space="preserve"> porque explicita que a personalização não é um ato instantâneo: trata-se de uma dinâmica iterativa de leitura de dados, proposta de configuração, avaliação visual, revisão crítica e eventual exportação para fabrico. </w:t>
+      </w:r>
+      <w:r>
+        <w:rPr/>
+        <w:t>Os estudos analisados reforçam que esta dimensão processual é parte central do modo como sistemas digitais desta natureza distribuem trabalho, autoridade e visibilidade entre diferentes intervenientes. A plataforma atua, assim, como uma infraestrutura de mediação, organizando as condições em que determinadas decisões são formuladas, avaliadas e realizadas no processo de design.</w:t>
+      </w:r>
+    </w:p>
+    <w:p>
+      <w:pPr>
+        <w:pStyle w:val="Normal"/>
+        <w:bidi w:val="0"/>
+        <w:jc w:val="left"/>
+        <w:rPr>
+          <w:lang w:val="pt-PT"/>
+        </w:rPr>
+      </w:pPr>
+      <w:r>
+        <w:rPr>
+          <w:lang w:val="pt-PT"/>
+        </w:rPr>
+        <w:t>Neste sentido, a interface assume uma dimensão simultaneamente operacional e epistemológica, ao influenciar a forma como o problema é compreendido, como as alternativas são exploradas e como as decisões são justificadas.</w:t>
+      </w:r>
+    </w:p>
+    <w:p>
+      <w:pPr>
+        <w:pStyle w:val="Normal"/>
+        <w:bidi w:val="0"/>
+        <w:jc w:val="left"/>
+        <w:rPr>
+          <w:lang w:val="pt-PT"/>
+        </w:rPr>
+      </w:pPr>
+      <w:r>
+        <w:rPr>
+          <w:lang w:val="pt-PT"/>
+        </w:rPr>
+        <w:t xml:space="preserve">Ao disponibilizar parâmetros editáveis, visualização tridimensional, sugestões assistidas por IA e gestão de versões, a plataforma contribui para estruturar o trabalho de projeto e para documentar a evolução das decisões tomadas ao longo do processo. Contudo, essa mesma estrutura também estabelece limites: o utilizador explora o espaço de soluções que o modelo e a interface permitem. </w:t>
+      </w:r>
+      <w:r>
+        <w:rPr/>
+        <w:t>A mediação digital amplia a capacidade de ação, mas também define os limites dentro dos quais a personalização pode ocorrer. Os estudos analisados sugerem que as plataformas mais relevantes neste domínio recorrem a mecanismos concretos de mediação, como o controlo diferenciado de permissões, a exposição seletiva de variáveis, os pontos de partida algorítmicos, a visualização orientada pelo problema e a supervisão integrada na própria interface.</w:t>
+      </w:r>
+    </w:p>
+    <w:p>
+      <w:pPr>
+        <w:pStyle w:val="Normal"/>
+        <w:bidi w:val="0"/>
+        <w:jc w:val="left"/>
+        <w:rPr>
+          <w:lang w:val="pt-PT"/>
+        </w:rPr>
+      </w:pPr>
+      <w:r>
+        <w:rPr>
+          <w:lang w:val="pt-PT"/>
+        </w:rPr>
+        <w:t>Tal tensão entre a ampliação da capacidade e o enquadramento do campo de decisão torna-se particularmente visível em sistemas que diferenciam deliberadamente entre parâmetros acessíveis ao utilizador e parâmetros reservados a profissionais ou a rotinas automáticas de afinação (Bai et al., 2024 (#ref-bai-2024); Alili et al., 2023 (#ref-alili-2023)).</w:t>
+      </w:r>
+    </w:p>
+    <w:p>
+      <w:pPr>
+        <w:pStyle w:val="Normal"/>
+        <w:bidi w:val="0"/>
+        <w:jc w:val="left"/>
+        <w:rPr>
+          <w:lang w:val="pt-PT"/>
+        </w:rPr>
+      </w:pPr>
+      <w:r>
+        <w:rPr>
+          <w:lang w:val="pt-PT"/>
+        </w:rPr>
+        <w:t>Uma implicação decisiva desta leitura é que a plataforma medeia tanto quem utiliza o sistema como aquilo que se torna visível no processo. A visualização tridimensional, os indicadores de estado, os limites paramétricos e os mecanismos de feedback participam ativamente na forma como o problema é compreendido, interpretado e avaliado.</w:t>
+      </w:r>
+    </w:p>
+    <w:p>
+      <w:pPr>
+        <w:pStyle w:val="Normal"/>
+        <w:bidi w:val="0"/>
+        <w:jc w:val="left"/>
+        <w:rPr>
+          <w:lang w:val="pt-PT"/>
+        </w:rPr>
+      </w:pPr>
+      <w:r>
+        <w:rPr>
+          <w:lang w:val="pt-PT"/>
+        </w:rPr>
+        <w:t>Ao tornar certas relações mais visíveis e outras menos acessíveis, a interface produz uma forma específica de legibilidade do processo de personalização. O mesmo se aplica aos mecanismos de comparação e revisão: quando o sistema oferece variantes, propõe valores iniciais ou assinala incongruências, está a intervir na forma como as alternativas são construídas antes mesmo de serem escolhidas.</w:t>
+      </w:r>
+    </w:p>
+    <w:p>
+      <w:pPr>
+        <w:pStyle w:val="Normal"/>
+        <w:bidi w:val="0"/>
+        <w:jc w:val="left"/>
+        <w:rPr>
+          <w:highlight w:val="none"/>
+          <w:shd w:fill="auto" w:val="clear"/>
+          <w:lang w:val="pt-PT"/>
+        </w:rPr>
+      </w:pPr>
+      <w:r>
+        <w:rPr>
+          <w:shd w:fill="auto" w:val="clear"/>
+          <w:lang w:val="pt-PT"/>
+        </w:rPr>
+        <w:t>Nesta perspetiva, a mediação digital participa na forma como as decisões de projeto são preparadas, avaliadas e justificadas. Esta observação conduz a uma reflexão crítica sobre o papel da plataforma no próprio processo de design.</w:t>
+      </w:r>
+    </w:p>
+    <w:p>
+      <w:pPr>
+        <w:pStyle w:val="Normal"/>
+        <w:bidi w:val="0"/>
+        <w:jc w:val="left"/>
+        <w:rPr>
+          <w:lang w:val="pt-PT"/>
+        </w:rPr>
+      </w:pPr>
+      <w:r>
+        <w:rPr>
+          <w:lang w:val="pt-PT"/>
+        </w:rPr>
+        <w:t>Uma interface bem desenhada pode criar a sensação de evidência ou de neutralidade em decisões que continuam condicionadas por critérios de projeto, pressupostos técnicos e escolhas interpretativas. O facto de um parâmetro ser apresentado como controlo disponível, ou de uma sugestão surgir com aparência de plausibilidade técnica, não significa que a solução esteja validada ou que represente a melhor opção em todos os contextos. A mediação da interface deve, por isso, ser avaliada não apenas pela sua eficiência, mas também pela forma como torna visíveis as dependências, as incertezas e as responsabilidades envolvidas no processo. A literatura analisada reforça esta cautela: resultados positivos de usabilidade ou de rapidez de afinação não eliminam a necessidade de definir quem decide, quais parâmetros podem ser alterados, quais decisões ficam pré-estruturadas pelo sistema e sob quais condições essas alterações são consideradas seguras ou adequadas (Peixoto et al., 2025 (#ref-peixoto-2025); Quintero et al., 2018 (#ref-quintero-2018); Bai et al., 2024 (#ref-bai-2024)).</w:t>
+      </w:r>
+    </w:p>
+    <w:p>
+      <w:pPr>
+        <w:pStyle w:val="Normal"/>
+        <w:bidi w:val="0"/>
+        <w:jc w:val="left"/>
+        <w:rPr>
+          <w:lang w:val="pt-PT"/>
+        </w:rPr>
+      </w:pPr>
+      <w:r>
+        <w:rPr>
+          <w:lang w:val="pt-PT"/>
+        </w:rPr>
+        <w:t>Uma interface bem desenhada pode criar a sensação de evidência ou de neutralidade em decisões que continuam condicionadas por critérios de projeto, pressupostos técnicos e escolhas interpretativas.</w:t>
+      </w:r>
+    </w:p>
+    <w:p>
+      <w:pPr>
+        <w:pStyle w:val="Normal"/>
+        <w:bidi w:val="0"/>
+        <w:jc w:val="left"/>
+        <w:rPr>
+          <w:lang w:val="pt-PT"/>
+        </w:rPr>
+      </w:pPr>
+      <w:r>
+        <w:rPr>
+          <w:lang w:val="pt-PT"/>
+        </w:rPr>
+        <w:t xml:space="preserve">A mediação do processo de design não elimina a </w:t>
       </w:r>
       <w:commentRangeStart w:id="109"/>
       <w:r>
         <w:rPr>
           <w:lang w:val="pt-PT"/>
         </w:rPr>
-        <w:t xml:space="preserve"> A utilização da plataforma não se resume, por isso, à ergonomia dos ecrãs, mas à forma como distribui a agência entre</w:t>
+        <w:t>autoria projetual</w:t>
       </w:r>
       <w:r>
         <w:rPr>
@@ -17254,118 +17672,29 @@
         <w:rPr>
           <w:lang w:val="pt-PT"/>
         </w:rPr>
-        <w:t xml:space="preserve"> diferentes participantes no processo de personalização. Esta leitura é consistente com abordagens human-in-the-loop, nas quais as preferências do utilizador, o ajustamento algorítmico e a supervisão profissional coexistem de forma hierárquica e não mutuamente exclusiva, ao mesmo tempo que a literatura mais ampla sobre fabrico digital em próteses continua a assinalar lacunas de formação, validação longitudinal e comparação sistemática entre workflows (Alili et al., 2023 (#ref-alili-2023); Oldfrey et al., 2024 (#ref-oldfrey-2024)). É precisamente essa distribuição desigual, mas intencional, de acesso, interpretação e decisão que prepara a questão seguinte: não apenas quem usa a plataforma, mas também de que modo ela própria medeia o processo de design.</w:t>
-      </w:r>
-    </w:p>
-    <w:p>
-      <w:pPr>
-        <w:pStyle w:val="Heading3"/>
-        <w:bidi w:val="0"/>
-        <w:jc w:val="left"/>
-        <w:rPr>
-          <w:lang w:val="pt-PT"/>
-        </w:rPr>
-      </w:pPr>
-      <w:r>
-        <w:rPr>
-          <w:lang w:val="pt-PT"/>
-        </w:rPr>
-      </w:r>
-    </w:p>
-    <w:p>
-      <w:pPr>
-        <w:pStyle w:val="Heading3"/>
-        <w:bidi w:val="0"/>
-        <w:jc w:val="left"/>
-        <w:rPr>
-          <w:lang w:val="pt-PT"/>
-        </w:rPr>
-      </w:pPr>
-      <w:r>
-        <w:rPr>
-          <w:lang w:val="pt-PT"/>
-        </w:rPr>
-        <w:t>7.3 Mediação do processo de design e reflexão crítica</w:t>
-      </w:r>
-    </w:p>
-    <w:p>
-      <w:pPr>
-        <w:pStyle w:val="Normal"/>
-        <w:bidi w:val="0"/>
-        <w:jc w:val="left"/>
-        <w:rPr>
-          <w:lang w:val="pt-PT"/>
-        </w:rPr>
-      </w:pPr>
-      <w:r>
-        <w:rPr>
-          <w:lang w:val="pt-PT"/>
-        </w:rPr>
-        <w:t>O contributo mais relevante da interface não reside apenas em permitir editar parâmetros, mas também em mediar o próprio processo de design. A plataforma introduz uma camada intermédia entre o modelo algorítmico, a decisão técnica e a interpretação do utilizador, reorganizando o desenvolvimento da prótese como uma sequência de interações assistidas. Esta mediação é importante porque reduz a dependência de manipulação direta do código, mas também porque explicita que a personalização não é um ato instantâneo: trata-se de uma dinâmica iterativa de leitura de dados, proposta de configuração, avaliação visual, revisão crítica e eventual exportação para fabrico. A literatura revisada reforça que esta dimensão processual não constitui mero efeito secundário da interface, mas sim parte central do modo como sistemas digitais desta natureza distribuem trabalho, autoridade e visibilidade entre diferentes agentes. Em vez de apenas executar decisões previamente tomadas, a plataforma ajuda a estruturar quando, como e por quem essas decisões se tornam possíveis.</w:t>
-      </w:r>
-    </w:p>
-    <w:p>
-      <w:pPr>
-        <w:pStyle w:val="Normal"/>
-        <w:bidi w:val="0"/>
-        <w:jc w:val="left"/>
-        <w:rPr>
-          <w:lang w:val="pt-PT"/>
-        </w:rPr>
-      </w:pPr>
-      <w:r>
-        <w:rPr>
-          <w:lang w:val="pt-PT"/>
-        </w:rPr>
-        <w:t>Neste sentido, a interface funciona como um dispositivo epistemológico, e não apenas operacional. Ela condiciona a forma como o problema é visto, como as alternativas são exploradas e como as decisões são justificadas. Ao disponibilizar parâmetros editáveis, visualização tridimensional, sugestões assistidas por IA e gestão de versões, a plataforma torna o trabalho projetual mais estruturado e rastreável. Contudo, essa mesma estrutura também estabelece limites: o utilizador explora o espaço de soluções que o modelo e a interface permitem. A mediação digital aumenta a capacidade de ação, mas também enquadra e delimita o campo do possível. A literatura revisada sugere precisamente que as plataformas mais relevantes neste domínio operam por mecanismos concretos de mediação: controlo diferenciado de permissões, exposição seletiva de variáveis, pontos de partida algorítmicos, visualização orientada por problema e formas de supervisão embutidas na própria interface. Tal tensão entre a ampliação da capacidade e o enquadramento do campo de decisão torna-se particularmente visível em sistemas que diferenciam deliberadamente entre parâmetros acessíveis ao utilizador e parâmetros reservados a profissionais ou a rotinas automáticas de afinação (Bai et al., 2024 (#ref-bai-2024); Alili et al., 2023 (#ref-alili-2023)).</w:t>
-      </w:r>
-    </w:p>
-    <w:p>
-      <w:pPr>
-        <w:pStyle w:val="Normal"/>
-        <w:bidi w:val="0"/>
-        <w:jc w:val="left"/>
-        <w:rPr>
-          <w:lang w:val="pt-PT"/>
-        </w:rPr>
-      </w:pPr>
-      <w:r>
-        <w:rPr>
-          <w:lang w:val="pt-PT"/>
-        </w:rPr>
-        <w:t>Uma implicação decisiva desta leitura é que a plataforma não medeia apenas “quem usa”, mas também “o que pode ser visto”. A visualização tridimensional, os indicadores de estado, os limites paramétricos e os mecanismos de feedback não são elementos neutros de apresentação; organizam a inteligibilidade do problema. Ao tornar certas relações mais visíveis e outras menos acessíveis, a interface produz uma forma específica de legibilidade do processo de personalização. O mesmo se aplica aos mecanismos de comparação e revisão: quando o sistema oferece variantes, propõe valores iniciais ou assinala incongruências, está a intervir na forma como as alternativas são construídas antes mesmo de serem escolhidas. Nesta perspetiva, a mediação digital não é mera facilitação; é também uma tecnologia de enquadramento do juízo projetual.</w:t>
-      </w:r>
-    </w:p>
-    <w:p>
-      <w:pPr>
-        <w:pStyle w:val="Normal"/>
-        <w:bidi w:val="0"/>
-        <w:jc w:val="left"/>
-        <w:rPr>
-          <w:lang w:val="pt-PT"/>
-        </w:rPr>
-      </w:pPr>
-      <w:r>
-        <w:rPr>
-          <w:lang w:val="pt-PT"/>
-        </w:rPr>
-        <w:t>Esta observação conduz a uma importante reflexão crítica. Uma interface bem desenhada pode criar a sensação de evidência ou de neutralidade em decisões que continuam contingentes e projetuais. O facto de um parâmetro ser apresentado como controlo disponível, ou de uma sugestão surgir com aparência de plausibilidade técnica, não significa que a solução esteja validada ou que represente a melhor opção em todos os contextos. A mediação da interface deve, por isso, ser avaliada não apenas pela sua eficiência, mas também pela forma como torna visíveis as dependências, as incertezas e as responsabilidades envolvidas no processo. A literatura analisada reforça esta cautela: resultados positivos de usabilidade ou de rapidez de afinação não eliminam a necessidade de definir quem decide, quais parâmetros podem ser alterados, quais decisões ficam pré-estruturadas pelo sistema e sob quais condições essas alterações são consideradas seguras ou adequadas (Peixoto et al., 2025 (#ref-peixoto-2025); Quintero et al., 2018 (#ref-quintero-2018); Bai et al., 2024 (#ref-bai-2024)).</w:t>
-      </w:r>
-    </w:p>
-    <w:p>
-      <w:pPr>
-        <w:pStyle w:val="Normal"/>
-        <w:bidi w:val="0"/>
-        <w:jc w:val="left"/>
-        <w:rPr>
-          <w:lang w:val="pt-PT"/>
-        </w:rPr>
-      </w:pPr>
-      <w:r>
-        <w:rPr>
-          <w:lang w:val="pt-PT"/>
-        </w:rPr>
-        <w:t>Deste ponto de vista, o sistema proposto assume uma posição produtiva: utiliza a interface para ampliar a acessibilidade, a inteligibilidade e a capacidade iterativa, sem dissolver a necessidade de julgamento humano. A mediação do processo de design não elimina a autoria projetual nem substitui a validação técnica; reorganiza-as num ambiente digital mais controlado e explícito. A plataforma redistribui a agência, mas não o faz de forma uniforme: concentra certas decisões em agentes tecnicamente qualificados, abre outras à participação informada do utilizador e deixa outras sob enquadramento assistido por lógica algorítmica. É precisamente nessa articulação entre interface, lógica paramétrica, sugestão assistida, visibilidade seletiva e responsabilidade crítica que reside o valor metodológico deste sistema enquanto contributo para o design de próteses personalizadas.</w:t>
+        <w:t xml:space="preserve"> nem substitui a validação técnica; reorganiza-as num ambiente digital mais controlado e explícito. A plataforma redistribui a agência, mas não o faz de forma uniforme: concentra certas decisões em agentes tecnicamente qualificados, abre outras à participação informada do utilizador e deixa outras sob enquadramento assistido por</w:t>
+      </w:r>
+      <w:commentRangeStart w:id="110"/>
+      <w:r>
+        <w:rPr>
+          <w:lang w:val="pt-PT"/>
+        </w:rPr>
+        <w:t xml:space="preserve"> lógica algorítmica</w:t>
+      </w:r>
+      <w:r>
+        <w:rPr>
+          <w:lang w:val="pt-PT"/>
+        </w:rPr>
+      </w:r>
+      <w:commentRangeEnd w:id="110"/>
+      <w:r>
+        <w:commentReference w:id="110"/>
+      </w:r>
+      <w:r>
+        <w:rPr>
+          <w:lang w:val="pt-PT"/>
+        </w:rPr>
+        <w:t>. É precisamente nessa articulação entre interface, lógica paramétrica, sugestão assistida, visibilidade seletiva e responsabilidade crítica que reside o valor metodológico deste sistema enquanto contributo para o design de próteses personalizadas.</w:t>
       </w:r>
     </w:p>
     <w:p>
@@ -17381,6 +17710,24 @@
         <w:rPr>
           <w:lang w:val="pt-PT"/>
         </w:rPr>
+      </w:r>
+    </w:p>
+    <w:p>
+      <w:pPr>
+        <w:pStyle w:val="Heading2"/>
+        <w:bidi w:val="0"/>
+        <w:jc w:val="left"/>
+        <w:rPr>
+          <w:color w:val="C9211E"/>
+          <w:lang w:val="pt-PT"/>
+        </w:rPr>
+      </w:pPr>
+      <w:r>
+        <w:rPr>
+          <w:color w:val="C9211E"/>
+          <w:lang w:val="pt-PT"/>
+        </w:rPr>
+        <w:t>FIQUEI AQUI</w:t>
       </w:r>
     </w:p>
     <w:p>
@@ -24929,7 +25276,7 @@
       </w:r>
     </w:p>
   </w:comment>
-  <w:comment w:id="109" w:author="Unknown Author" w:date="2026-07-05T12:15:21Z" w:initials="">
+  <w:comment w:id="109" w:author="Unknown Author" w:date="2026-07-06T07:57:34Z" w:initials="">
     <w:p>
       <w:pPr>
         <w:overflowPunct w:val="false"/>
@@ -24942,7 +25289,24 @@
         <w:rPr>
           <w:lang w:val="pt-PT"/>
         </w:rPr>
-        <w:t>negação</w:t>
+        <w:t>Autoria projetual</w:t>
+      </w:r>
+    </w:p>
+  </w:comment>
+  <w:comment w:id="110" w:author="Unknown Author" w:date="2026-07-06T07:58:17Z" w:initials="">
+    <w:p>
+      <w:pPr>
+        <w:overflowPunct w:val="false"/>
+        <w:rPr/>
+      </w:pPr>
+      <w:r>
+        <w:annotationRef/>
+      </w:r>
+      <w:r>
+        <w:rPr>
+          <w:lang w:val="pt-PT"/>
+        </w:rPr>
+        <w:t>Lógica algorítmica</w:t>
       </w:r>
     </w:p>
   </w:comment>

</xml_diff>

<commit_message>
Update README and manuscript DOCX
</commit_message>
<xml_diff>
--- a/projecto-completo.docx
+++ b/projecto-completo.docx
@@ -32,6 +32,31 @@
           <w:lang w:val="pt-PT"/>
         </w:rPr>
         <w:t>Versão do documento:0.4.12</w:t>
+      </w:r>
+    </w:p>
+    <w:p>
+      <w:pPr>
+        <w:pStyle w:val="Normal"/>
+        <w:bidi w:val="0"/>
+        <w:jc w:val="left"/>
+        <w:rPr>
+          <w:lang w:val="pt-PT"/>
+        </w:rPr>
+      </w:pPr>
+      <w:r>
+        <w:rPr>
+          <w:lang w:val="pt-PT"/>
+        </w:rPr>
+      </w:r>
+    </w:p>
+    <w:p>
+      <w:pPr>
+        <w:pStyle w:val="Heading2"/>
+        <w:rPr/>
+      </w:pPr>
+      <w:r>
+        <w:rPr/>
+        <w:t>INTEGRAÇÃO DO DESIGN E DA INTELIGÊNCIA ARTIFICIAL EM PROCESSOS PARAMÉTRICOS PARA O DESENVOLVIMENTO DE PRÓTESES DE MEMBROS SUPERIORES EM IMPRESSÃO 3D.</w:t>
       </w:r>
     </w:p>
     <w:p>
@@ -82,8 +107,8 @@
         </w:tblCellMar>
       </w:tblPr>
       <w:tblGrid>
-        <w:gridCol w:w="4512"/>
-        <w:gridCol w:w="4514"/>
+        <w:gridCol w:w="1260"/>
+        <w:gridCol w:w="7766"/>
       </w:tblGrid>
       <w:tr>
         <w:trPr>
@@ -91,7 +116,7 @@
         </w:trPr>
         <w:tc>
           <w:tcPr>
-            <w:tcW w:w="4512" w:type="dxa"/>
+            <w:tcW w:w="1260" w:type="dxa"/>
             <w:tcBorders>
               <w:top w:val="single" w:sz="4" w:space="0" w:color="808080"/>
               <w:left w:val="single" w:sz="4" w:space="0" w:color="808080"/>
@@ -112,7 +137,7 @@
         </w:tc>
         <w:tc>
           <w:tcPr>
-            <w:tcW w:w="4514" w:type="dxa"/>
+            <w:tcW w:w="7766" w:type="dxa"/>
             <w:tcBorders>
               <w:top w:val="single" w:sz="4" w:space="0" w:color="808080"/>
               <w:left w:val="single" w:sz="4" w:space="0" w:color="808080"/>
@@ -136,7 +161,7 @@
         <w:trPr/>
         <w:tc>
           <w:tcPr>
-            <w:tcW w:w="4512" w:type="dxa"/>
+            <w:tcW w:w="1260" w:type="dxa"/>
             <w:tcBorders>
               <w:top w:val="single" w:sz="4" w:space="0" w:color="808080"/>
               <w:left w:val="single" w:sz="4" w:space="0" w:color="808080"/>
@@ -157,7 +182,7 @@
         </w:tc>
         <w:tc>
           <w:tcPr>
-            <w:tcW w:w="4514" w:type="dxa"/>
+            <w:tcW w:w="7766" w:type="dxa"/>
             <w:tcBorders>
               <w:top w:val="single" w:sz="4" w:space="0" w:color="808080"/>
               <w:left w:val="single" w:sz="4" w:space="0" w:color="808080"/>
@@ -181,7 +206,7 @@
         <w:trPr/>
         <w:tc>
           <w:tcPr>
-            <w:tcW w:w="4512" w:type="dxa"/>
+            <w:tcW w:w="1260" w:type="dxa"/>
             <w:tcBorders>
               <w:top w:val="single" w:sz="4" w:space="0" w:color="808080"/>
               <w:left w:val="single" w:sz="4" w:space="0" w:color="808080"/>
@@ -202,7 +227,7 @@
         </w:tc>
         <w:tc>
           <w:tcPr>
-            <w:tcW w:w="4514" w:type="dxa"/>
+            <w:tcW w:w="7766" w:type="dxa"/>
             <w:tcBorders>
               <w:top w:val="single" w:sz="4" w:space="0" w:color="808080"/>
               <w:left w:val="single" w:sz="4" w:space="0" w:color="808080"/>
@@ -226,7 +251,7 @@
         <w:trPr/>
         <w:tc>
           <w:tcPr>
-            <w:tcW w:w="4512" w:type="dxa"/>
+            <w:tcW w:w="1260" w:type="dxa"/>
             <w:tcBorders>
               <w:top w:val="single" w:sz="4" w:space="0" w:color="808080"/>
               <w:left w:val="single" w:sz="4" w:space="0" w:color="808080"/>
@@ -247,7 +272,7 @@
         </w:tc>
         <w:tc>
           <w:tcPr>
-            <w:tcW w:w="4514" w:type="dxa"/>
+            <w:tcW w:w="7766" w:type="dxa"/>
             <w:tcBorders>
               <w:top w:val="single" w:sz="4" w:space="0" w:color="808080"/>
               <w:left w:val="single" w:sz="4" w:space="0" w:color="808080"/>
@@ -277,7 +302,7 @@
         <w:trPr/>
         <w:tc>
           <w:tcPr>
-            <w:tcW w:w="4512" w:type="dxa"/>
+            <w:tcW w:w="1260" w:type="dxa"/>
             <w:tcBorders>
               <w:top w:val="single" w:sz="4" w:space="0" w:color="808080"/>
               <w:left w:val="single" w:sz="4" w:space="0" w:color="808080"/>
@@ -298,7 +323,7 @@
         </w:tc>
         <w:tc>
           <w:tcPr>
-            <w:tcW w:w="4514" w:type="dxa"/>
+            <w:tcW w:w="7766" w:type="dxa"/>
             <w:tcBorders>
               <w:top w:val="single" w:sz="4" w:space="0" w:color="808080"/>
               <w:left w:val="single" w:sz="4" w:space="0" w:color="808080"/>
@@ -328,7 +353,7 @@
         <w:trPr/>
         <w:tc>
           <w:tcPr>
-            <w:tcW w:w="4512" w:type="dxa"/>
+            <w:tcW w:w="1260" w:type="dxa"/>
             <w:tcBorders>
               <w:top w:val="single" w:sz="4" w:space="0" w:color="808080"/>
               <w:left w:val="single" w:sz="4" w:space="0" w:color="808080"/>
@@ -349,7 +374,7 @@
         </w:tc>
         <w:tc>
           <w:tcPr>
-            <w:tcW w:w="4514" w:type="dxa"/>
+            <w:tcW w:w="7766" w:type="dxa"/>
             <w:tcBorders>
               <w:top w:val="single" w:sz="4" w:space="0" w:color="808080"/>
               <w:left w:val="single" w:sz="4" w:space="0" w:color="808080"/>
@@ -379,7 +404,7 @@
         <w:trPr/>
         <w:tc>
           <w:tcPr>
-            <w:tcW w:w="4512" w:type="dxa"/>
+            <w:tcW w:w="1260" w:type="dxa"/>
             <w:tcBorders>
               <w:top w:val="single" w:sz="4" w:space="0" w:color="808080"/>
               <w:left w:val="single" w:sz="4" w:space="0" w:color="808080"/>
@@ -400,7 +425,7 @@
         </w:tc>
         <w:tc>
           <w:tcPr>
-            <w:tcW w:w="4514" w:type="dxa"/>
+            <w:tcW w:w="7766" w:type="dxa"/>
             <w:tcBorders>
               <w:top w:val="single" w:sz="4" w:space="0" w:color="808080"/>
               <w:left w:val="single" w:sz="4" w:space="0" w:color="808080"/>
@@ -430,7 +455,7 @@
         <w:trPr/>
         <w:tc>
           <w:tcPr>
-            <w:tcW w:w="4512" w:type="dxa"/>
+            <w:tcW w:w="1260" w:type="dxa"/>
             <w:tcBorders>
               <w:top w:val="single" w:sz="4" w:space="0" w:color="808080"/>
               <w:left w:val="single" w:sz="4" w:space="0" w:color="808080"/>
@@ -451,7 +476,7 @@
         </w:tc>
         <w:tc>
           <w:tcPr>
-            <w:tcW w:w="4514" w:type="dxa"/>
+            <w:tcW w:w="7766" w:type="dxa"/>
             <w:tcBorders>
               <w:top w:val="single" w:sz="4" w:space="0" w:color="808080"/>
               <w:left w:val="single" w:sz="4" w:space="0" w:color="808080"/>
@@ -481,7 +506,7 @@
         <w:trPr/>
         <w:tc>
           <w:tcPr>
-            <w:tcW w:w="4512" w:type="dxa"/>
+            <w:tcW w:w="1260" w:type="dxa"/>
             <w:tcBorders>
               <w:top w:val="single" w:sz="4" w:space="0" w:color="808080"/>
               <w:left w:val="single" w:sz="4" w:space="0" w:color="808080"/>
@@ -502,7 +527,7 @@
         </w:tc>
         <w:tc>
           <w:tcPr>
-            <w:tcW w:w="4514" w:type="dxa"/>
+            <w:tcW w:w="7766" w:type="dxa"/>
             <w:tcBorders>
               <w:top w:val="single" w:sz="4" w:space="0" w:color="808080"/>
               <w:left w:val="single" w:sz="4" w:space="0" w:color="808080"/>
@@ -532,7 +557,7 @@
         <w:trPr/>
         <w:tc>
           <w:tcPr>
-            <w:tcW w:w="4512" w:type="dxa"/>
+            <w:tcW w:w="1260" w:type="dxa"/>
             <w:tcBorders>
               <w:top w:val="single" w:sz="4" w:space="0" w:color="808080"/>
               <w:left w:val="single" w:sz="4" w:space="0" w:color="808080"/>
@@ -553,7 +578,7 @@
         </w:tc>
         <w:tc>
           <w:tcPr>
-            <w:tcW w:w="4514" w:type="dxa"/>
+            <w:tcW w:w="7766" w:type="dxa"/>
             <w:tcBorders>
               <w:top w:val="single" w:sz="4" w:space="0" w:color="808080"/>
               <w:left w:val="single" w:sz="4" w:space="0" w:color="808080"/>
@@ -583,7 +608,7 @@
         <w:trPr/>
         <w:tc>
           <w:tcPr>
-            <w:tcW w:w="4512" w:type="dxa"/>
+            <w:tcW w:w="1260" w:type="dxa"/>
             <w:tcBorders>
               <w:top w:val="single" w:sz="4" w:space="0" w:color="808080"/>
               <w:left w:val="single" w:sz="4" w:space="0" w:color="808080"/>
@@ -604,7 +629,7 @@
         </w:tc>
         <w:tc>
           <w:tcPr>
-            <w:tcW w:w="4514" w:type="dxa"/>
+            <w:tcW w:w="7766" w:type="dxa"/>
             <w:tcBorders>
               <w:top w:val="single" w:sz="4" w:space="0" w:color="808080"/>
               <w:left w:val="single" w:sz="4" w:space="0" w:color="808080"/>
@@ -634,7 +659,7 @@
         <w:trPr/>
         <w:tc>
           <w:tcPr>
-            <w:tcW w:w="4512" w:type="dxa"/>
+            <w:tcW w:w="1260" w:type="dxa"/>
             <w:tcBorders>
               <w:top w:val="single" w:sz="4" w:space="0" w:color="808080"/>
               <w:left w:val="single" w:sz="4" w:space="0" w:color="808080"/>
@@ -655,7 +680,7 @@
         </w:tc>
         <w:tc>
           <w:tcPr>
-            <w:tcW w:w="4514" w:type="dxa"/>
+            <w:tcW w:w="7766" w:type="dxa"/>
             <w:tcBorders>
               <w:top w:val="single" w:sz="4" w:space="0" w:color="808080"/>
               <w:left w:val="single" w:sz="4" w:space="0" w:color="808080"/>
@@ -685,7 +710,7 @@
         <w:trPr/>
         <w:tc>
           <w:tcPr>
-            <w:tcW w:w="4512" w:type="dxa"/>
+            <w:tcW w:w="1260" w:type="dxa"/>
             <w:tcBorders>
               <w:top w:val="single" w:sz="4" w:space="0" w:color="808080"/>
               <w:left w:val="single" w:sz="4" w:space="0" w:color="808080"/>
@@ -706,7 +731,7 @@
         </w:tc>
         <w:tc>
           <w:tcPr>
-            <w:tcW w:w="4514" w:type="dxa"/>
+            <w:tcW w:w="7766" w:type="dxa"/>
             <w:tcBorders>
               <w:top w:val="single" w:sz="4" w:space="0" w:color="808080"/>
               <w:left w:val="single" w:sz="4" w:space="0" w:color="808080"/>
@@ -736,7 +761,7 @@
         <w:trPr/>
         <w:tc>
           <w:tcPr>
-            <w:tcW w:w="4512" w:type="dxa"/>
+            <w:tcW w:w="1260" w:type="dxa"/>
             <w:tcBorders>
               <w:top w:val="single" w:sz="4" w:space="0" w:color="808080"/>
               <w:left w:val="single" w:sz="4" w:space="0" w:color="808080"/>
@@ -757,7 +782,7 @@
         </w:tc>
         <w:tc>
           <w:tcPr>
-            <w:tcW w:w="4514" w:type="dxa"/>
+            <w:tcW w:w="7766" w:type="dxa"/>
             <w:tcBorders>
               <w:top w:val="single" w:sz="4" w:space="0" w:color="808080"/>
               <w:left w:val="single" w:sz="4" w:space="0" w:color="808080"/>
@@ -787,7 +812,7 @@
         <w:trPr/>
         <w:tc>
           <w:tcPr>
-            <w:tcW w:w="4512" w:type="dxa"/>
+            <w:tcW w:w="1260" w:type="dxa"/>
             <w:tcBorders>
               <w:top w:val="single" w:sz="4" w:space="0" w:color="808080"/>
               <w:left w:val="single" w:sz="4" w:space="0" w:color="808080"/>
@@ -808,7 +833,7 @@
         </w:tc>
         <w:tc>
           <w:tcPr>
-            <w:tcW w:w="4514" w:type="dxa"/>
+            <w:tcW w:w="7766" w:type="dxa"/>
             <w:tcBorders>
               <w:top w:val="single" w:sz="4" w:space="0" w:color="808080"/>
               <w:left w:val="single" w:sz="4" w:space="0" w:color="808080"/>
@@ -838,7 +863,7 @@
         <w:trPr/>
         <w:tc>
           <w:tcPr>
-            <w:tcW w:w="4512" w:type="dxa"/>
+            <w:tcW w:w="1260" w:type="dxa"/>
             <w:tcBorders>
               <w:top w:val="single" w:sz="4" w:space="0" w:color="808080"/>
               <w:left w:val="single" w:sz="4" w:space="0" w:color="808080"/>
@@ -859,7 +884,7 @@
         </w:tc>
         <w:tc>
           <w:tcPr>
-            <w:tcW w:w="4514" w:type="dxa"/>
+            <w:tcW w:w="7766" w:type="dxa"/>
             <w:tcBorders>
               <w:top w:val="single" w:sz="4" w:space="0" w:color="808080"/>
               <w:left w:val="single" w:sz="4" w:space="0" w:color="808080"/>
@@ -889,7 +914,7 @@
         <w:trPr/>
         <w:tc>
           <w:tcPr>
-            <w:tcW w:w="4512" w:type="dxa"/>
+            <w:tcW w:w="1260" w:type="dxa"/>
             <w:tcBorders>
               <w:top w:val="single" w:sz="4" w:space="0" w:color="808080"/>
               <w:left w:val="single" w:sz="4" w:space="0" w:color="808080"/>
@@ -910,7 +935,7 @@
         </w:tc>
         <w:tc>
           <w:tcPr>
-            <w:tcW w:w="4514" w:type="dxa"/>
+            <w:tcW w:w="7766" w:type="dxa"/>
             <w:tcBorders>
               <w:top w:val="single" w:sz="4" w:space="0" w:color="808080"/>
               <w:left w:val="single" w:sz="4" w:space="0" w:color="808080"/>
@@ -940,7 +965,7 @@
         <w:trPr/>
         <w:tc>
           <w:tcPr>
-            <w:tcW w:w="4512" w:type="dxa"/>
+            <w:tcW w:w="1260" w:type="dxa"/>
             <w:tcBorders>
               <w:top w:val="single" w:sz="4" w:space="0" w:color="808080"/>
               <w:left w:val="single" w:sz="4" w:space="0" w:color="808080"/>
@@ -961,7 +986,7 @@
         </w:tc>
         <w:tc>
           <w:tcPr>
-            <w:tcW w:w="4514" w:type="dxa"/>
+            <w:tcW w:w="7766" w:type="dxa"/>
             <w:tcBorders>
               <w:top w:val="single" w:sz="4" w:space="0" w:color="808080"/>
               <w:left w:val="single" w:sz="4" w:space="0" w:color="808080"/>
@@ -985,7 +1010,7 @@
         <w:trPr/>
         <w:tc>
           <w:tcPr>
-            <w:tcW w:w="4512" w:type="dxa"/>
+            <w:tcW w:w="1260" w:type="dxa"/>
             <w:tcBorders>
               <w:top w:val="single" w:sz="4" w:space="0" w:color="808080"/>
               <w:left w:val="single" w:sz="4" w:space="0" w:color="808080"/>
@@ -1006,7 +1031,7 @@
         </w:tc>
         <w:tc>
           <w:tcPr>
-            <w:tcW w:w="4514" w:type="dxa"/>
+            <w:tcW w:w="7766" w:type="dxa"/>
             <w:tcBorders>
               <w:top w:val="single" w:sz="4" w:space="0" w:color="808080"/>
               <w:left w:val="single" w:sz="4" w:space="0" w:color="808080"/>
@@ -1036,7 +1061,7 @@
         <w:trPr/>
         <w:tc>
           <w:tcPr>
-            <w:tcW w:w="4512" w:type="dxa"/>
+            <w:tcW w:w="1260" w:type="dxa"/>
             <w:tcBorders>
               <w:top w:val="single" w:sz="4" w:space="0" w:color="808080"/>
               <w:left w:val="single" w:sz="4" w:space="0" w:color="808080"/>
@@ -1057,7 +1082,7 @@
         </w:tc>
         <w:tc>
           <w:tcPr>
-            <w:tcW w:w="4514" w:type="dxa"/>
+            <w:tcW w:w="7766" w:type="dxa"/>
             <w:tcBorders>
               <w:top w:val="single" w:sz="4" w:space="0" w:color="808080"/>
               <w:left w:val="single" w:sz="4" w:space="0" w:color="808080"/>
@@ -1081,7 +1106,7 @@
         <w:trPr/>
         <w:tc>
           <w:tcPr>
-            <w:tcW w:w="4512" w:type="dxa"/>
+            <w:tcW w:w="1260" w:type="dxa"/>
             <w:tcBorders>
               <w:top w:val="single" w:sz="4" w:space="0" w:color="808080"/>
               <w:left w:val="single" w:sz="4" w:space="0" w:color="808080"/>
@@ -1102,7 +1127,7 @@
         </w:tc>
         <w:tc>
           <w:tcPr>
-            <w:tcW w:w="4514" w:type="dxa"/>
+            <w:tcW w:w="7766" w:type="dxa"/>
             <w:tcBorders>
               <w:top w:val="single" w:sz="4" w:space="0" w:color="808080"/>
               <w:left w:val="single" w:sz="4" w:space="0" w:color="808080"/>
@@ -1126,7 +1151,7 @@
         <w:trPr/>
         <w:tc>
           <w:tcPr>
-            <w:tcW w:w="4512" w:type="dxa"/>
+            <w:tcW w:w="1260" w:type="dxa"/>
             <w:tcBorders>
               <w:top w:val="single" w:sz="4" w:space="0" w:color="808080"/>
               <w:left w:val="single" w:sz="4" w:space="0" w:color="808080"/>
@@ -1147,7 +1172,7 @@
         </w:tc>
         <w:tc>
           <w:tcPr>
-            <w:tcW w:w="4514" w:type="dxa"/>
+            <w:tcW w:w="7766" w:type="dxa"/>
             <w:tcBorders>
               <w:top w:val="single" w:sz="4" w:space="0" w:color="808080"/>
               <w:left w:val="single" w:sz="4" w:space="0" w:color="808080"/>
@@ -1177,7 +1202,7 @@
         <w:trPr/>
         <w:tc>
           <w:tcPr>
-            <w:tcW w:w="4512" w:type="dxa"/>
+            <w:tcW w:w="1260" w:type="dxa"/>
             <w:tcBorders>
               <w:top w:val="single" w:sz="4" w:space="0" w:color="808080"/>
               <w:left w:val="single" w:sz="4" w:space="0" w:color="808080"/>
@@ -1198,7 +1223,7 @@
         </w:tc>
         <w:tc>
           <w:tcPr>
-            <w:tcW w:w="4514" w:type="dxa"/>
+            <w:tcW w:w="7766" w:type="dxa"/>
             <w:tcBorders>
               <w:top w:val="single" w:sz="4" w:space="0" w:color="808080"/>
               <w:left w:val="single" w:sz="4" w:space="0" w:color="808080"/>
@@ -1228,7 +1253,7 @@
         <w:trPr/>
         <w:tc>
           <w:tcPr>
-            <w:tcW w:w="4512" w:type="dxa"/>
+            <w:tcW w:w="1260" w:type="dxa"/>
             <w:tcBorders>
               <w:top w:val="single" w:sz="4" w:space="0" w:color="808080"/>
               <w:left w:val="single" w:sz="4" w:space="0" w:color="808080"/>
@@ -1249,7 +1274,7 @@
         </w:tc>
         <w:tc>
           <w:tcPr>
-            <w:tcW w:w="4514" w:type="dxa"/>
+            <w:tcW w:w="7766" w:type="dxa"/>
             <w:tcBorders>
               <w:top w:val="single" w:sz="4" w:space="0" w:color="808080"/>
               <w:left w:val="single" w:sz="4" w:space="0" w:color="808080"/>
@@ -1279,7 +1304,7 @@
         <w:trPr/>
         <w:tc>
           <w:tcPr>
-            <w:tcW w:w="4512" w:type="dxa"/>
+            <w:tcW w:w="1260" w:type="dxa"/>
             <w:tcBorders>
               <w:top w:val="single" w:sz="4" w:space="0" w:color="808080"/>
               <w:left w:val="single" w:sz="4" w:space="0" w:color="808080"/>
@@ -1300,7 +1325,7 @@
         </w:tc>
         <w:tc>
           <w:tcPr>
-            <w:tcW w:w="4514" w:type="dxa"/>
+            <w:tcW w:w="7766" w:type="dxa"/>
             <w:tcBorders>
               <w:top w:val="single" w:sz="4" w:space="0" w:color="808080"/>
               <w:left w:val="single" w:sz="4" w:space="0" w:color="808080"/>
@@ -1330,7 +1355,7 @@
         <w:trPr/>
         <w:tc>
           <w:tcPr>
-            <w:tcW w:w="4512" w:type="dxa"/>
+            <w:tcW w:w="1260" w:type="dxa"/>
             <w:tcBorders>
               <w:top w:val="single" w:sz="4" w:space="0" w:color="808080"/>
               <w:left w:val="single" w:sz="4" w:space="0" w:color="808080"/>
@@ -1351,7 +1376,7 @@
         </w:tc>
         <w:tc>
           <w:tcPr>
-            <w:tcW w:w="4514" w:type="dxa"/>
+            <w:tcW w:w="7766" w:type="dxa"/>
             <w:tcBorders>
               <w:top w:val="single" w:sz="4" w:space="0" w:color="808080"/>
               <w:left w:val="single" w:sz="4" w:space="0" w:color="808080"/>
@@ -1381,7 +1406,7 @@
         <w:trPr/>
         <w:tc>
           <w:tcPr>
-            <w:tcW w:w="4512" w:type="dxa"/>
+            <w:tcW w:w="1260" w:type="dxa"/>
             <w:tcBorders>
               <w:top w:val="single" w:sz="4" w:space="0" w:color="808080"/>
               <w:left w:val="single" w:sz="4" w:space="0" w:color="808080"/>
@@ -1402,7 +1427,7 @@
         </w:tc>
         <w:tc>
           <w:tcPr>
-            <w:tcW w:w="4514" w:type="dxa"/>
+            <w:tcW w:w="7766" w:type="dxa"/>
             <w:tcBorders>
               <w:top w:val="single" w:sz="4" w:space="0" w:color="808080"/>
               <w:left w:val="single" w:sz="4" w:space="0" w:color="808080"/>
@@ -1432,7 +1457,7 @@
         <w:trPr/>
         <w:tc>
           <w:tcPr>
-            <w:tcW w:w="4512" w:type="dxa"/>
+            <w:tcW w:w="1260" w:type="dxa"/>
             <w:tcBorders>
               <w:top w:val="single" w:sz="4" w:space="0" w:color="808080"/>
               <w:left w:val="single" w:sz="4" w:space="0" w:color="808080"/>
@@ -1453,7 +1478,7 @@
         </w:tc>
         <w:tc>
           <w:tcPr>
-            <w:tcW w:w="4514" w:type="dxa"/>
+            <w:tcW w:w="7766" w:type="dxa"/>
             <w:tcBorders>
               <w:top w:val="single" w:sz="4" w:space="0" w:color="808080"/>
               <w:left w:val="single" w:sz="4" w:space="0" w:color="808080"/>
@@ -1477,7 +1502,7 @@
         <w:trPr/>
         <w:tc>
           <w:tcPr>
-            <w:tcW w:w="4512" w:type="dxa"/>
+            <w:tcW w:w="1260" w:type="dxa"/>
             <w:tcBorders>
               <w:top w:val="single" w:sz="4" w:space="0" w:color="808080"/>
               <w:left w:val="single" w:sz="4" w:space="0" w:color="808080"/>
@@ -1498,7 +1523,7 @@
         </w:tc>
         <w:tc>
           <w:tcPr>
-            <w:tcW w:w="4514" w:type="dxa"/>
+            <w:tcW w:w="7766" w:type="dxa"/>
             <w:tcBorders>
               <w:top w:val="single" w:sz="4" w:space="0" w:color="808080"/>
               <w:left w:val="single" w:sz="4" w:space="0" w:color="808080"/>
@@ -1528,7 +1553,7 @@
         <w:trPr/>
         <w:tc>
           <w:tcPr>
-            <w:tcW w:w="4512" w:type="dxa"/>
+            <w:tcW w:w="1260" w:type="dxa"/>
             <w:tcBorders>
               <w:top w:val="single" w:sz="4" w:space="0" w:color="808080"/>
               <w:left w:val="single" w:sz="4" w:space="0" w:color="808080"/>
@@ -1549,7 +1574,7 @@
         </w:tc>
         <w:tc>
           <w:tcPr>
-            <w:tcW w:w="4514" w:type="dxa"/>
+            <w:tcW w:w="7766" w:type="dxa"/>
             <w:tcBorders>
               <w:top w:val="single" w:sz="4" w:space="0" w:color="808080"/>
               <w:left w:val="single" w:sz="4" w:space="0" w:color="808080"/>
@@ -1579,7 +1604,7 @@
         <w:trPr/>
         <w:tc>
           <w:tcPr>
-            <w:tcW w:w="4512" w:type="dxa"/>
+            <w:tcW w:w="1260" w:type="dxa"/>
             <w:tcBorders>
               <w:top w:val="single" w:sz="4" w:space="0" w:color="808080"/>
               <w:left w:val="single" w:sz="4" w:space="0" w:color="808080"/>
@@ -1600,7 +1625,7 @@
         </w:tc>
         <w:tc>
           <w:tcPr>
-            <w:tcW w:w="4514" w:type="dxa"/>
+            <w:tcW w:w="7766" w:type="dxa"/>
             <w:tcBorders>
               <w:top w:val="single" w:sz="4" w:space="0" w:color="808080"/>
               <w:left w:val="single" w:sz="4" w:space="0" w:color="808080"/>
@@ -1630,7 +1655,7 @@
         <w:trPr/>
         <w:tc>
           <w:tcPr>
-            <w:tcW w:w="4512" w:type="dxa"/>
+            <w:tcW w:w="1260" w:type="dxa"/>
             <w:tcBorders>
               <w:top w:val="single" w:sz="4" w:space="0" w:color="808080"/>
               <w:left w:val="single" w:sz="4" w:space="0" w:color="808080"/>
@@ -1651,7 +1676,7 @@
         </w:tc>
         <w:tc>
           <w:tcPr>
-            <w:tcW w:w="4514" w:type="dxa"/>
+            <w:tcW w:w="7766" w:type="dxa"/>
             <w:tcBorders>
               <w:top w:val="single" w:sz="4" w:space="0" w:color="808080"/>
               <w:left w:val="single" w:sz="4" w:space="0" w:color="808080"/>
@@ -1681,7 +1706,7 @@
         <w:trPr/>
         <w:tc>
           <w:tcPr>
-            <w:tcW w:w="4512" w:type="dxa"/>
+            <w:tcW w:w="1260" w:type="dxa"/>
             <w:tcBorders>
               <w:top w:val="single" w:sz="4" w:space="0" w:color="808080"/>
               <w:left w:val="single" w:sz="4" w:space="0" w:color="808080"/>
@@ -1702,7 +1727,7 @@
         </w:tc>
         <w:tc>
           <w:tcPr>
-            <w:tcW w:w="4514" w:type="dxa"/>
+            <w:tcW w:w="7766" w:type="dxa"/>
             <w:tcBorders>
               <w:top w:val="single" w:sz="4" w:space="0" w:color="808080"/>
               <w:left w:val="single" w:sz="4" w:space="0" w:color="808080"/>
@@ -1732,7 +1757,7 @@
         <w:trPr/>
         <w:tc>
           <w:tcPr>
-            <w:tcW w:w="4512" w:type="dxa"/>
+            <w:tcW w:w="1260" w:type="dxa"/>
             <w:tcBorders>
               <w:top w:val="single" w:sz="4" w:space="0" w:color="808080"/>
               <w:left w:val="single" w:sz="4" w:space="0" w:color="808080"/>
@@ -1753,7 +1778,7 @@
         </w:tc>
         <w:tc>
           <w:tcPr>
-            <w:tcW w:w="4514" w:type="dxa"/>
+            <w:tcW w:w="7766" w:type="dxa"/>
             <w:tcBorders>
               <w:top w:val="single" w:sz="4" w:space="0" w:color="808080"/>
               <w:left w:val="single" w:sz="4" w:space="0" w:color="808080"/>
@@ -1777,7 +1802,7 @@
         <w:trPr/>
         <w:tc>
           <w:tcPr>
-            <w:tcW w:w="4512" w:type="dxa"/>
+            <w:tcW w:w="1260" w:type="dxa"/>
             <w:tcBorders>
               <w:top w:val="single" w:sz="4" w:space="0" w:color="808080"/>
               <w:left w:val="single" w:sz="4" w:space="0" w:color="808080"/>
@@ -1798,7 +1823,7 @@
         </w:tc>
         <w:tc>
           <w:tcPr>
-            <w:tcW w:w="4514" w:type="dxa"/>
+            <w:tcW w:w="7766" w:type="dxa"/>
             <w:tcBorders>
               <w:top w:val="single" w:sz="4" w:space="0" w:color="808080"/>
               <w:left w:val="single" w:sz="4" w:space="0" w:color="808080"/>
@@ -1828,7 +1853,7 @@
         <w:trPr/>
         <w:tc>
           <w:tcPr>
-            <w:tcW w:w="4512" w:type="dxa"/>
+            <w:tcW w:w="1260" w:type="dxa"/>
             <w:tcBorders>
               <w:top w:val="single" w:sz="4" w:space="0" w:color="808080"/>
               <w:left w:val="single" w:sz="4" w:space="0" w:color="808080"/>
@@ -1849,7 +1874,7 @@
         </w:tc>
         <w:tc>
           <w:tcPr>
-            <w:tcW w:w="4514" w:type="dxa"/>
+            <w:tcW w:w="7766" w:type="dxa"/>
             <w:tcBorders>
               <w:top w:val="single" w:sz="4" w:space="0" w:color="808080"/>
               <w:left w:val="single" w:sz="4" w:space="0" w:color="808080"/>
@@ -1879,7 +1904,7 @@
         <w:trPr/>
         <w:tc>
           <w:tcPr>
-            <w:tcW w:w="4512" w:type="dxa"/>
+            <w:tcW w:w="1260" w:type="dxa"/>
             <w:tcBorders>
               <w:top w:val="single" w:sz="4" w:space="0" w:color="808080"/>
               <w:left w:val="single" w:sz="4" w:space="0" w:color="808080"/>
@@ -1900,7 +1925,7 @@
         </w:tc>
         <w:tc>
           <w:tcPr>
-            <w:tcW w:w="4514" w:type="dxa"/>
+            <w:tcW w:w="7766" w:type="dxa"/>
             <w:tcBorders>
               <w:top w:val="single" w:sz="4" w:space="0" w:color="808080"/>
               <w:left w:val="single" w:sz="4" w:space="0" w:color="808080"/>
@@ -1930,7 +1955,7 @@
         <w:trPr/>
         <w:tc>
           <w:tcPr>
-            <w:tcW w:w="4512" w:type="dxa"/>
+            <w:tcW w:w="1260" w:type="dxa"/>
             <w:tcBorders>
               <w:top w:val="single" w:sz="4" w:space="0" w:color="808080"/>
               <w:left w:val="single" w:sz="4" w:space="0" w:color="808080"/>
@@ -1951,7 +1976,7 @@
         </w:tc>
         <w:tc>
           <w:tcPr>
-            <w:tcW w:w="4514" w:type="dxa"/>
+            <w:tcW w:w="7766" w:type="dxa"/>
             <w:tcBorders>
               <w:top w:val="single" w:sz="4" w:space="0" w:color="808080"/>
               <w:left w:val="single" w:sz="4" w:space="0" w:color="808080"/>
@@ -1981,7 +2006,7 @@
         <w:trPr/>
         <w:tc>
           <w:tcPr>
-            <w:tcW w:w="4512" w:type="dxa"/>
+            <w:tcW w:w="1260" w:type="dxa"/>
             <w:tcBorders>
               <w:top w:val="single" w:sz="4" w:space="0" w:color="808080"/>
               <w:left w:val="single" w:sz="4" w:space="0" w:color="808080"/>
@@ -2002,7 +2027,7 @@
         </w:tc>
         <w:tc>
           <w:tcPr>
-            <w:tcW w:w="4514" w:type="dxa"/>
+            <w:tcW w:w="7766" w:type="dxa"/>
             <w:tcBorders>
               <w:top w:val="single" w:sz="4" w:space="0" w:color="808080"/>
               <w:left w:val="single" w:sz="4" w:space="0" w:color="808080"/>
@@ -2032,7 +2057,7 @@
         <w:trPr/>
         <w:tc>
           <w:tcPr>
-            <w:tcW w:w="4512" w:type="dxa"/>
+            <w:tcW w:w="1260" w:type="dxa"/>
             <w:tcBorders>
               <w:top w:val="single" w:sz="4" w:space="0" w:color="808080"/>
               <w:left w:val="single" w:sz="4" w:space="0" w:color="808080"/>
@@ -2053,7 +2078,7 @@
         </w:tc>
         <w:tc>
           <w:tcPr>
-            <w:tcW w:w="4514" w:type="dxa"/>
+            <w:tcW w:w="7766" w:type="dxa"/>
             <w:tcBorders>
               <w:top w:val="single" w:sz="4" w:space="0" w:color="808080"/>
               <w:left w:val="single" w:sz="4" w:space="0" w:color="808080"/>
@@ -2083,7 +2108,7 @@
         <w:trPr/>
         <w:tc>
           <w:tcPr>
-            <w:tcW w:w="4512" w:type="dxa"/>
+            <w:tcW w:w="1260" w:type="dxa"/>
             <w:tcBorders>
               <w:top w:val="single" w:sz="4" w:space="0" w:color="808080"/>
               <w:left w:val="single" w:sz="4" w:space="0" w:color="808080"/>
@@ -2104,7 +2129,7 @@
         </w:tc>
         <w:tc>
           <w:tcPr>
-            <w:tcW w:w="4514" w:type="dxa"/>
+            <w:tcW w:w="7766" w:type="dxa"/>
             <w:tcBorders>
               <w:top w:val="single" w:sz="4" w:space="0" w:color="808080"/>
               <w:left w:val="single" w:sz="4" w:space="0" w:color="808080"/>
@@ -2134,7 +2159,7 @@
         <w:trPr/>
         <w:tc>
           <w:tcPr>
-            <w:tcW w:w="4512" w:type="dxa"/>
+            <w:tcW w:w="1260" w:type="dxa"/>
             <w:tcBorders>
               <w:top w:val="single" w:sz="4" w:space="0" w:color="808080"/>
               <w:left w:val="single" w:sz="4" w:space="0" w:color="808080"/>
@@ -2155,7 +2180,7 @@
         </w:tc>
         <w:tc>
           <w:tcPr>
-            <w:tcW w:w="4514" w:type="dxa"/>
+            <w:tcW w:w="7766" w:type="dxa"/>
             <w:tcBorders>
               <w:top w:val="single" w:sz="4" w:space="0" w:color="808080"/>
               <w:left w:val="single" w:sz="4" w:space="0" w:color="808080"/>
@@ -2185,7 +2210,7 @@
         <w:trPr/>
         <w:tc>
           <w:tcPr>
-            <w:tcW w:w="4512" w:type="dxa"/>
+            <w:tcW w:w="1260" w:type="dxa"/>
             <w:tcBorders>
               <w:top w:val="single" w:sz="4" w:space="0" w:color="808080"/>
               <w:left w:val="single" w:sz="4" w:space="0" w:color="808080"/>
@@ -2206,7 +2231,7 @@
         </w:tc>
         <w:tc>
           <w:tcPr>
-            <w:tcW w:w="4514" w:type="dxa"/>
+            <w:tcW w:w="7766" w:type="dxa"/>
             <w:tcBorders>
               <w:top w:val="single" w:sz="4" w:space="0" w:color="808080"/>
               <w:left w:val="single" w:sz="4" w:space="0" w:color="808080"/>
@@ -2236,7 +2261,7 @@
         <w:trPr/>
         <w:tc>
           <w:tcPr>
-            <w:tcW w:w="4512" w:type="dxa"/>
+            <w:tcW w:w="1260" w:type="dxa"/>
             <w:tcBorders>
               <w:top w:val="single" w:sz="4" w:space="0" w:color="808080"/>
               <w:left w:val="single" w:sz="4" w:space="0" w:color="808080"/>
@@ -2257,7 +2282,7 @@
         </w:tc>
         <w:tc>
           <w:tcPr>
-            <w:tcW w:w="4514" w:type="dxa"/>
+            <w:tcW w:w="7766" w:type="dxa"/>
             <w:tcBorders>
               <w:top w:val="single" w:sz="4" w:space="0" w:color="808080"/>
               <w:left w:val="single" w:sz="4" w:space="0" w:color="808080"/>
@@ -2287,7 +2312,7 @@
         <w:trPr/>
         <w:tc>
           <w:tcPr>
-            <w:tcW w:w="4512" w:type="dxa"/>
+            <w:tcW w:w="1260" w:type="dxa"/>
             <w:tcBorders>
               <w:top w:val="single" w:sz="4" w:space="0" w:color="808080"/>
               <w:left w:val="single" w:sz="4" w:space="0" w:color="808080"/>
@@ -2308,7 +2333,7 @@
         </w:tc>
         <w:tc>
           <w:tcPr>
-            <w:tcW w:w="4514" w:type="dxa"/>
+            <w:tcW w:w="7766" w:type="dxa"/>
             <w:tcBorders>
               <w:top w:val="single" w:sz="4" w:space="0" w:color="808080"/>
               <w:left w:val="single" w:sz="4" w:space="0" w:color="808080"/>
@@ -2338,7 +2363,7 @@
         <w:trPr/>
         <w:tc>
           <w:tcPr>
-            <w:tcW w:w="4512" w:type="dxa"/>
+            <w:tcW w:w="1260" w:type="dxa"/>
             <w:tcBorders>
               <w:top w:val="single" w:sz="4" w:space="0" w:color="808080"/>
               <w:left w:val="single" w:sz="4" w:space="0" w:color="808080"/>
@@ -2359,7 +2384,7 @@
         </w:tc>
         <w:tc>
           <w:tcPr>
-            <w:tcW w:w="4514" w:type="dxa"/>
+            <w:tcW w:w="7766" w:type="dxa"/>
             <w:tcBorders>
               <w:top w:val="single" w:sz="4" w:space="0" w:color="808080"/>
               <w:left w:val="single" w:sz="4" w:space="0" w:color="808080"/>
@@ -2389,7 +2414,7 @@
         <w:trPr/>
         <w:tc>
           <w:tcPr>
-            <w:tcW w:w="4512" w:type="dxa"/>
+            <w:tcW w:w="1260" w:type="dxa"/>
             <w:tcBorders>
               <w:top w:val="single" w:sz="4" w:space="0" w:color="808080"/>
               <w:left w:val="single" w:sz="4" w:space="0" w:color="808080"/>
@@ -2410,7 +2435,7 @@
         </w:tc>
         <w:tc>
           <w:tcPr>
-            <w:tcW w:w="4514" w:type="dxa"/>
+            <w:tcW w:w="7766" w:type="dxa"/>
             <w:tcBorders>
               <w:top w:val="single" w:sz="4" w:space="0" w:color="808080"/>
               <w:left w:val="single" w:sz="4" w:space="0" w:color="808080"/>
@@ -2440,7 +2465,7 @@
         <w:trPr/>
         <w:tc>
           <w:tcPr>
-            <w:tcW w:w="4512" w:type="dxa"/>
+            <w:tcW w:w="1260" w:type="dxa"/>
             <w:tcBorders>
               <w:top w:val="single" w:sz="4" w:space="0" w:color="808080"/>
               <w:left w:val="single" w:sz="4" w:space="0" w:color="808080"/>
@@ -2461,7 +2486,7 @@
         </w:tc>
         <w:tc>
           <w:tcPr>
-            <w:tcW w:w="4514" w:type="dxa"/>
+            <w:tcW w:w="7766" w:type="dxa"/>
             <w:tcBorders>
               <w:top w:val="single" w:sz="4" w:space="0" w:color="808080"/>
               <w:left w:val="single" w:sz="4" w:space="0" w:color="808080"/>
@@ -2491,7 +2516,7 @@
         <w:trPr/>
         <w:tc>
           <w:tcPr>
-            <w:tcW w:w="4512" w:type="dxa"/>
+            <w:tcW w:w="1260" w:type="dxa"/>
             <w:tcBorders>
               <w:top w:val="single" w:sz="4" w:space="0" w:color="808080"/>
               <w:left w:val="single" w:sz="4" w:space="0" w:color="808080"/>
@@ -2512,7 +2537,7 @@
         </w:tc>
         <w:tc>
           <w:tcPr>
-            <w:tcW w:w="4514" w:type="dxa"/>
+            <w:tcW w:w="7766" w:type="dxa"/>
             <w:tcBorders>
               <w:top w:val="single" w:sz="4" w:space="0" w:color="808080"/>
               <w:left w:val="single" w:sz="4" w:space="0" w:color="808080"/>
@@ -2542,7 +2567,7 @@
         <w:trPr/>
         <w:tc>
           <w:tcPr>
-            <w:tcW w:w="4512" w:type="dxa"/>
+            <w:tcW w:w="1260" w:type="dxa"/>
             <w:tcBorders>
               <w:top w:val="single" w:sz="4" w:space="0" w:color="808080"/>
               <w:left w:val="single" w:sz="4" w:space="0" w:color="808080"/>
@@ -2563,7 +2588,7 @@
         </w:tc>
         <w:tc>
           <w:tcPr>
-            <w:tcW w:w="4514" w:type="dxa"/>
+            <w:tcW w:w="7766" w:type="dxa"/>
             <w:tcBorders>
               <w:top w:val="single" w:sz="4" w:space="0" w:color="808080"/>
               <w:left w:val="single" w:sz="4" w:space="0" w:color="808080"/>
@@ -2593,7 +2618,7 @@
         <w:trPr/>
         <w:tc>
           <w:tcPr>
-            <w:tcW w:w="4512" w:type="dxa"/>
+            <w:tcW w:w="1260" w:type="dxa"/>
             <w:tcBorders>
               <w:top w:val="single" w:sz="4" w:space="0" w:color="808080"/>
               <w:left w:val="single" w:sz="4" w:space="0" w:color="808080"/>
@@ -2614,7 +2639,7 @@
         </w:tc>
         <w:tc>
           <w:tcPr>
-            <w:tcW w:w="4514" w:type="dxa"/>
+            <w:tcW w:w="7766" w:type="dxa"/>
             <w:tcBorders>
               <w:top w:val="single" w:sz="4" w:space="0" w:color="808080"/>
               <w:left w:val="single" w:sz="4" w:space="0" w:color="808080"/>
@@ -2644,7 +2669,7 @@
         <w:trPr/>
         <w:tc>
           <w:tcPr>
-            <w:tcW w:w="4512" w:type="dxa"/>
+            <w:tcW w:w="1260" w:type="dxa"/>
             <w:tcBorders>
               <w:top w:val="single" w:sz="4" w:space="0" w:color="808080"/>
               <w:left w:val="single" w:sz="4" w:space="0" w:color="808080"/>
@@ -2665,7 +2690,7 @@
         </w:tc>
         <w:tc>
           <w:tcPr>
-            <w:tcW w:w="4514" w:type="dxa"/>
+            <w:tcW w:w="7766" w:type="dxa"/>
             <w:tcBorders>
               <w:top w:val="single" w:sz="4" w:space="0" w:color="808080"/>
               <w:left w:val="single" w:sz="4" w:space="0" w:color="808080"/>
@@ -2695,7 +2720,7 @@
         <w:trPr/>
         <w:tc>
           <w:tcPr>
-            <w:tcW w:w="4512" w:type="dxa"/>
+            <w:tcW w:w="1260" w:type="dxa"/>
             <w:tcBorders>
               <w:top w:val="single" w:sz="4" w:space="0" w:color="808080"/>
               <w:left w:val="single" w:sz="4" w:space="0" w:color="808080"/>
@@ -2716,7 +2741,7 @@
         </w:tc>
         <w:tc>
           <w:tcPr>
-            <w:tcW w:w="4514" w:type="dxa"/>
+            <w:tcW w:w="7766" w:type="dxa"/>
             <w:tcBorders>
               <w:top w:val="single" w:sz="4" w:space="0" w:color="808080"/>
               <w:left w:val="single" w:sz="4" w:space="0" w:color="808080"/>
@@ -2746,7 +2771,7 @@
         <w:trPr/>
         <w:tc>
           <w:tcPr>
-            <w:tcW w:w="4512" w:type="dxa"/>
+            <w:tcW w:w="1260" w:type="dxa"/>
             <w:tcBorders>
               <w:top w:val="single" w:sz="4" w:space="0" w:color="808080"/>
               <w:left w:val="single" w:sz="4" w:space="0" w:color="808080"/>
@@ -2767,7 +2792,7 @@
         </w:tc>
         <w:tc>
           <w:tcPr>
-            <w:tcW w:w="4514" w:type="dxa"/>
+            <w:tcW w:w="7766" w:type="dxa"/>
             <w:tcBorders>
               <w:top w:val="single" w:sz="4" w:space="0" w:color="808080"/>
               <w:left w:val="single" w:sz="4" w:space="0" w:color="808080"/>
@@ -2797,49 +2822,52 @@
         <w:trPr/>
         <w:tc>
           <w:tcPr>
-            <w:tcW w:w="4512" w:type="dxa"/>
-            <w:tcBorders>
-              <w:top w:val="single" w:sz="4" w:space="0" w:color="808080"/>
-              <w:left w:val="single" w:sz="4" w:space="0" w:color="808080"/>
-              <w:bottom w:val="single" w:sz="4" w:space="0" w:color="808080"/>
-              <w:right w:val="single" w:sz="4" w:space="0" w:color="808080"/>
-            </w:tcBorders>
-          </w:tcPr>
-          <w:p>
-            <w:pPr>
-              <w:pStyle w:val="Normal"/>
-              <w:rPr/>
-            </w:pPr>
-            <w:r>
-              <w:rPr/>
-              <w:t>STL</w:t>
-            </w:r>
-          </w:p>
-        </w:tc>
-        <w:tc>
-          <w:tcPr>
-            <w:tcW w:w="4514" w:type="dxa"/>
-            <w:tcBorders>
-              <w:top w:val="single" w:sz="4" w:space="0" w:color="808080"/>
-              <w:left w:val="single" w:sz="4" w:space="0" w:color="808080"/>
-              <w:bottom w:val="single" w:sz="4" w:space="0" w:color="808080"/>
-              <w:right w:val="single" w:sz="4" w:space="0" w:color="808080"/>
-            </w:tcBorders>
-          </w:tcPr>
-          <w:p>
-            <w:pPr>
-              <w:pStyle w:val="Normal"/>
-              <w:rPr/>
-            </w:pPr>
-            <w:r>
-              <w:rPr>
-                <w:i/>
-              </w:rPr>
-              <w:t>Stereolithography</w:t>
-            </w:r>
-            <w:r>
-              <w:rPr/>
-              <w:t>; formato de ficheiro de malha tridimensional usado em impressão 3D.</w:t>
+            <w:tcW w:w="1260" w:type="dxa"/>
+            <w:tcBorders>
+              <w:left w:val="single" w:sz="4" w:space="0" w:color="808080"/>
+              <w:bottom w:val="single" w:sz="4" w:space="0" w:color="808080"/>
+              <w:right w:val="single" w:sz="4" w:space="0" w:color="808080"/>
+            </w:tcBorders>
+          </w:tcPr>
+          <w:p>
+            <w:pPr>
+              <w:pStyle w:val="BodyText"/>
+              <w:bidi w:val="0"/>
+              <w:spacing w:before="0" w:after="140"/>
+              <w:jc w:val="left"/>
+              <w:rPr>
+                <w:lang w:val="pt-PT"/>
+              </w:rPr>
+            </w:pPr>
+            <w:r>
+              <w:rPr>
+                <w:lang w:val="pt-PT"/>
+              </w:rPr>
+              <w:t>SQLite</w:t>
+            </w:r>
+          </w:p>
+        </w:tc>
+        <w:tc>
+          <w:tcPr>
+            <w:tcW w:w="7766" w:type="dxa"/>
+            <w:tcBorders>
+              <w:left w:val="single" w:sz="4" w:space="0" w:color="808080"/>
+              <w:bottom w:val="single" w:sz="4" w:space="0" w:color="808080"/>
+              <w:right w:val="single" w:sz="4" w:space="0" w:color="808080"/>
+            </w:tcBorders>
+          </w:tcPr>
+          <w:p>
+            <w:pPr>
+              <w:pStyle w:val="Normal"/>
+              <w:rPr/>
+            </w:pPr>
+            <w:r>
+              <w:rPr/>
+              <w:t>M</w:t>
+            </w:r>
+            <w:r>
+              <w:rPr/>
+              <w:t>otor leve de base de dados relacional baseado em SQL, autónomo e incorporável na aplicação.</w:t>
             </w:r>
           </w:p>
         </w:tc>
@@ -2848,28 +2876,28 @@
         <w:trPr/>
         <w:tc>
           <w:tcPr>
-            <w:tcW w:w="4512" w:type="dxa"/>
-            <w:tcBorders>
-              <w:top w:val="single" w:sz="4" w:space="0" w:color="808080"/>
-              <w:left w:val="single" w:sz="4" w:space="0" w:color="808080"/>
-              <w:bottom w:val="single" w:sz="4" w:space="0" w:color="808080"/>
-              <w:right w:val="single" w:sz="4" w:space="0" w:color="808080"/>
-            </w:tcBorders>
-          </w:tcPr>
-          <w:p>
-            <w:pPr>
-              <w:pStyle w:val="Normal"/>
-              <w:rPr/>
-            </w:pPr>
-            <w:r>
-              <w:rPr/>
-              <w:t>TC</w:t>
-            </w:r>
-          </w:p>
-        </w:tc>
-        <w:tc>
-          <w:tcPr>
-            <w:tcW w:w="4514" w:type="dxa"/>
+            <w:tcW w:w="1260" w:type="dxa"/>
+            <w:tcBorders>
+              <w:top w:val="single" w:sz="4" w:space="0" w:color="808080"/>
+              <w:left w:val="single" w:sz="4" w:space="0" w:color="808080"/>
+              <w:bottom w:val="single" w:sz="4" w:space="0" w:color="808080"/>
+              <w:right w:val="single" w:sz="4" w:space="0" w:color="808080"/>
+            </w:tcBorders>
+          </w:tcPr>
+          <w:p>
+            <w:pPr>
+              <w:pStyle w:val="Normal"/>
+              <w:rPr/>
+            </w:pPr>
+            <w:r>
+              <w:rPr/>
+              <w:t>STL</w:t>
+            </w:r>
+          </w:p>
+        </w:tc>
+        <w:tc>
+          <w:tcPr>
+            <w:tcW w:w="7766" w:type="dxa"/>
             <w:tcBorders>
               <w:top w:val="single" w:sz="4" w:space="0" w:color="808080"/>
               <w:left w:val="single" w:sz="4" w:space="0" w:color="808080"/>
@@ -2886,11 +2914,11 @@
               <w:rPr>
                 <w:i/>
               </w:rPr>
-              <w:t>Technical Committee</w:t>
-            </w:r>
-            <w:r>
-              <w:rPr/>
-              <w:t>; comité técnico.</w:t>
+              <w:t>Stereolithography</w:t>
+            </w:r>
+            <w:r>
+              <w:rPr/>
+              <w:t>; formato de ficheiro de malha tridimensional usado em impressão 3D.</w:t>
             </w:r>
           </w:p>
         </w:tc>
@@ -2899,28 +2927,28 @@
         <w:trPr/>
         <w:tc>
           <w:tcPr>
-            <w:tcW w:w="4512" w:type="dxa"/>
-            <w:tcBorders>
-              <w:top w:val="single" w:sz="4" w:space="0" w:color="808080"/>
-              <w:left w:val="single" w:sz="4" w:space="0" w:color="808080"/>
-              <w:bottom w:val="single" w:sz="4" w:space="0" w:color="808080"/>
-              <w:right w:val="single" w:sz="4" w:space="0" w:color="808080"/>
-            </w:tcBorders>
-          </w:tcPr>
-          <w:p>
-            <w:pPr>
-              <w:pStyle w:val="Normal"/>
-              <w:rPr/>
-            </w:pPr>
-            <w:r>
-              <w:rPr/>
-              <w:t>TRL</w:t>
-            </w:r>
-          </w:p>
-        </w:tc>
-        <w:tc>
-          <w:tcPr>
-            <w:tcW w:w="4514" w:type="dxa"/>
+            <w:tcW w:w="1260" w:type="dxa"/>
+            <w:tcBorders>
+              <w:top w:val="single" w:sz="4" w:space="0" w:color="808080"/>
+              <w:left w:val="single" w:sz="4" w:space="0" w:color="808080"/>
+              <w:bottom w:val="single" w:sz="4" w:space="0" w:color="808080"/>
+              <w:right w:val="single" w:sz="4" w:space="0" w:color="808080"/>
+            </w:tcBorders>
+          </w:tcPr>
+          <w:p>
+            <w:pPr>
+              <w:pStyle w:val="Normal"/>
+              <w:rPr/>
+            </w:pPr>
+            <w:r>
+              <w:rPr/>
+              <w:t>TC</w:t>
+            </w:r>
+          </w:p>
+        </w:tc>
+        <w:tc>
+          <w:tcPr>
+            <w:tcW w:w="7766" w:type="dxa"/>
             <w:tcBorders>
               <w:top w:val="single" w:sz="4" w:space="0" w:color="808080"/>
               <w:left w:val="single" w:sz="4" w:space="0" w:color="808080"/>
@@ -2937,11 +2965,11 @@
               <w:rPr>
                 <w:i/>
               </w:rPr>
-              <w:t>Technology Readiness Level</w:t>
-            </w:r>
-            <w:r>
-              <w:rPr/>
-              <w:t>; nível de prontidão tecnológica.</w:t>
+              <w:t>Technical Committee</w:t>
+            </w:r>
+            <w:r>
+              <w:rPr/>
+              <w:t>; comité técnico.</w:t>
             </w:r>
           </w:p>
         </w:tc>
@@ -2950,28 +2978,28 @@
         <w:trPr/>
         <w:tc>
           <w:tcPr>
-            <w:tcW w:w="4512" w:type="dxa"/>
-            <w:tcBorders>
-              <w:top w:val="single" w:sz="4" w:space="0" w:color="808080"/>
-              <w:left w:val="single" w:sz="4" w:space="0" w:color="808080"/>
-              <w:bottom w:val="single" w:sz="4" w:space="0" w:color="808080"/>
-              <w:right w:val="single" w:sz="4" w:space="0" w:color="808080"/>
-            </w:tcBorders>
-          </w:tcPr>
-          <w:p>
-            <w:pPr>
-              <w:pStyle w:val="Normal"/>
-              <w:rPr/>
-            </w:pPr>
-            <w:r>
-              <w:rPr/>
-              <w:t>UCD</w:t>
-            </w:r>
-          </w:p>
-        </w:tc>
-        <w:tc>
-          <w:tcPr>
-            <w:tcW w:w="4514" w:type="dxa"/>
+            <w:tcW w:w="1260" w:type="dxa"/>
+            <w:tcBorders>
+              <w:top w:val="single" w:sz="4" w:space="0" w:color="808080"/>
+              <w:left w:val="single" w:sz="4" w:space="0" w:color="808080"/>
+              <w:bottom w:val="single" w:sz="4" w:space="0" w:color="808080"/>
+              <w:right w:val="single" w:sz="4" w:space="0" w:color="808080"/>
+            </w:tcBorders>
+          </w:tcPr>
+          <w:p>
+            <w:pPr>
+              <w:pStyle w:val="Normal"/>
+              <w:rPr/>
+            </w:pPr>
+            <w:r>
+              <w:rPr/>
+              <w:t>TRL</w:t>
+            </w:r>
+          </w:p>
+        </w:tc>
+        <w:tc>
+          <w:tcPr>
+            <w:tcW w:w="7766" w:type="dxa"/>
             <w:tcBorders>
               <w:top w:val="single" w:sz="4" w:space="0" w:color="808080"/>
               <w:left w:val="single" w:sz="4" w:space="0" w:color="808080"/>
@@ -2988,11 +3016,11 @@
               <w:rPr>
                 <w:i/>
               </w:rPr>
-              <w:t>User-Centred Design</w:t>
-            </w:r>
-            <w:r>
-              <w:rPr/>
-              <w:t>; design centrado no utilizador.</w:t>
+              <w:t>Technology Readiness Level</w:t>
+            </w:r>
+            <w:r>
+              <w:rPr/>
+              <w:t>; nível de prontidão tecnológica.</w:t>
             </w:r>
           </w:p>
         </w:tc>
@@ -3001,28 +3029,28 @@
         <w:trPr/>
         <w:tc>
           <w:tcPr>
-            <w:tcW w:w="4512" w:type="dxa"/>
-            <w:tcBorders>
-              <w:top w:val="single" w:sz="4" w:space="0" w:color="808080"/>
-              <w:left w:val="single" w:sz="4" w:space="0" w:color="808080"/>
-              <w:bottom w:val="single" w:sz="4" w:space="0" w:color="808080"/>
-              <w:right w:val="single" w:sz="4" w:space="0" w:color="808080"/>
-            </w:tcBorders>
-          </w:tcPr>
-          <w:p>
-            <w:pPr>
-              <w:pStyle w:val="Normal"/>
-              <w:rPr/>
-            </w:pPr>
-            <w:r>
-              <w:rPr/>
-              <w:t>UI</w:t>
-            </w:r>
-          </w:p>
-        </w:tc>
-        <w:tc>
-          <w:tcPr>
-            <w:tcW w:w="4514" w:type="dxa"/>
+            <w:tcW w:w="1260" w:type="dxa"/>
+            <w:tcBorders>
+              <w:top w:val="single" w:sz="4" w:space="0" w:color="808080"/>
+              <w:left w:val="single" w:sz="4" w:space="0" w:color="808080"/>
+              <w:bottom w:val="single" w:sz="4" w:space="0" w:color="808080"/>
+              <w:right w:val="single" w:sz="4" w:space="0" w:color="808080"/>
+            </w:tcBorders>
+          </w:tcPr>
+          <w:p>
+            <w:pPr>
+              <w:pStyle w:val="Normal"/>
+              <w:rPr/>
+            </w:pPr>
+            <w:r>
+              <w:rPr/>
+              <w:t>UCD</w:t>
+            </w:r>
+          </w:p>
+        </w:tc>
+        <w:tc>
+          <w:tcPr>
+            <w:tcW w:w="7766" w:type="dxa"/>
             <w:tcBorders>
               <w:top w:val="single" w:sz="4" w:space="0" w:color="808080"/>
               <w:left w:val="single" w:sz="4" w:space="0" w:color="808080"/>
@@ -3039,11 +3067,11 @@
               <w:rPr>
                 <w:i/>
               </w:rPr>
-              <w:t>User Interface</w:t>
-            </w:r>
-            <w:r>
-              <w:rPr/>
-              <w:t>; interface do utilizador.</w:t>
+              <w:t>User-Centred Design</w:t>
+            </w:r>
+            <w:r>
+              <w:rPr/>
+              <w:t>; design centrado no utilizador.</w:t>
             </w:r>
           </w:p>
         </w:tc>
@@ -3052,28 +3080,28 @@
         <w:trPr/>
         <w:tc>
           <w:tcPr>
-            <w:tcW w:w="4512" w:type="dxa"/>
-            <w:tcBorders>
-              <w:top w:val="single" w:sz="4" w:space="0" w:color="808080"/>
-              <w:left w:val="single" w:sz="4" w:space="0" w:color="808080"/>
-              <w:bottom w:val="single" w:sz="4" w:space="0" w:color="808080"/>
-              <w:right w:val="single" w:sz="4" w:space="0" w:color="808080"/>
-            </w:tcBorders>
-          </w:tcPr>
-          <w:p>
-            <w:pPr>
-              <w:pStyle w:val="Normal"/>
-              <w:rPr/>
-            </w:pPr>
-            <w:r>
-              <w:rPr/>
-              <w:t>UL</w:t>
-            </w:r>
-          </w:p>
-        </w:tc>
-        <w:tc>
-          <w:tcPr>
-            <w:tcW w:w="4514" w:type="dxa"/>
+            <w:tcW w:w="1260" w:type="dxa"/>
+            <w:tcBorders>
+              <w:top w:val="single" w:sz="4" w:space="0" w:color="808080"/>
+              <w:left w:val="single" w:sz="4" w:space="0" w:color="808080"/>
+              <w:bottom w:val="single" w:sz="4" w:space="0" w:color="808080"/>
+              <w:right w:val="single" w:sz="4" w:space="0" w:color="808080"/>
+            </w:tcBorders>
+          </w:tcPr>
+          <w:p>
+            <w:pPr>
+              <w:pStyle w:val="Normal"/>
+              <w:rPr/>
+            </w:pPr>
+            <w:r>
+              <w:rPr/>
+              <w:t>UI</w:t>
+            </w:r>
+          </w:p>
+        </w:tc>
+        <w:tc>
+          <w:tcPr>
+            <w:tcW w:w="7766" w:type="dxa"/>
             <w:tcBorders>
               <w:top w:val="single" w:sz="4" w:space="0" w:color="808080"/>
               <w:left w:val="single" w:sz="4" w:space="0" w:color="808080"/>
@@ -3090,11 +3118,11 @@
               <w:rPr>
                 <w:i/>
               </w:rPr>
-              <w:t>Upper Limb</w:t>
-            </w:r>
-            <w:r>
-              <w:rPr/>
-              <w:t>; membro superior.</w:t>
+              <w:t>User Interface</w:t>
+            </w:r>
+            <w:r>
+              <w:rPr/>
+              <w:t>; interface do utilizador.</w:t>
             </w:r>
           </w:p>
         </w:tc>
@@ -3103,28 +3131,28 @@
         <w:trPr/>
         <w:tc>
           <w:tcPr>
-            <w:tcW w:w="4512" w:type="dxa"/>
-            <w:tcBorders>
-              <w:top w:val="single" w:sz="4" w:space="0" w:color="808080"/>
-              <w:left w:val="single" w:sz="4" w:space="0" w:color="808080"/>
-              <w:bottom w:val="single" w:sz="4" w:space="0" w:color="808080"/>
-              <w:right w:val="single" w:sz="4" w:space="0" w:color="808080"/>
-            </w:tcBorders>
-          </w:tcPr>
-          <w:p>
-            <w:pPr>
-              <w:pStyle w:val="Normal"/>
-              <w:rPr/>
-            </w:pPr>
-            <w:r>
-              <w:rPr/>
-              <w:t>UX</w:t>
-            </w:r>
-          </w:p>
-        </w:tc>
-        <w:tc>
-          <w:tcPr>
-            <w:tcW w:w="4514" w:type="dxa"/>
+            <w:tcW w:w="1260" w:type="dxa"/>
+            <w:tcBorders>
+              <w:top w:val="single" w:sz="4" w:space="0" w:color="808080"/>
+              <w:left w:val="single" w:sz="4" w:space="0" w:color="808080"/>
+              <w:bottom w:val="single" w:sz="4" w:space="0" w:color="808080"/>
+              <w:right w:val="single" w:sz="4" w:space="0" w:color="808080"/>
+            </w:tcBorders>
+          </w:tcPr>
+          <w:p>
+            <w:pPr>
+              <w:pStyle w:val="Normal"/>
+              <w:rPr/>
+            </w:pPr>
+            <w:r>
+              <w:rPr/>
+              <w:t>UL</w:t>
+            </w:r>
+          </w:p>
+        </w:tc>
+        <w:tc>
+          <w:tcPr>
+            <w:tcW w:w="7766" w:type="dxa"/>
             <w:tcBorders>
               <w:top w:val="single" w:sz="4" w:space="0" w:color="808080"/>
               <w:left w:val="single" w:sz="4" w:space="0" w:color="808080"/>
@@ -3141,11 +3169,11 @@
               <w:rPr>
                 <w:i/>
               </w:rPr>
-              <w:t>User Experience</w:t>
-            </w:r>
-            <w:r>
-              <w:rPr/>
-              <w:t>; experiência do utilizador.</w:t>
+              <w:t>Upper Limb</w:t>
+            </w:r>
+            <w:r>
+              <w:rPr/>
+              <w:t>; membro superior.</w:t>
             </w:r>
           </w:p>
         </w:tc>
@@ -3154,28 +3182,28 @@
         <w:trPr/>
         <w:tc>
           <w:tcPr>
-            <w:tcW w:w="4512" w:type="dxa"/>
-            <w:tcBorders>
-              <w:top w:val="single" w:sz="4" w:space="0" w:color="808080"/>
-              <w:left w:val="single" w:sz="4" w:space="0" w:color="808080"/>
-              <w:bottom w:val="single" w:sz="4" w:space="0" w:color="808080"/>
-              <w:right w:val="single" w:sz="4" w:space="0" w:color="808080"/>
-            </w:tcBorders>
-          </w:tcPr>
-          <w:p>
-            <w:pPr>
-              <w:pStyle w:val="Normal"/>
-              <w:rPr/>
-            </w:pPr>
-            <w:r>
-              <w:rPr/>
-              <w:t>WASM</w:t>
-            </w:r>
-          </w:p>
-        </w:tc>
-        <w:tc>
-          <w:tcPr>
-            <w:tcW w:w="4514" w:type="dxa"/>
+            <w:tcW w:w="1260" w:type="dxa"/>
+            <w:tcBorders>
+              <w:top w:val="single" w:sz="4" w:space="0" w:color="808080"/>
+              <w:left w:val="single" w:sz="4" w:space="0" w:color="808080"/>
+              <w:bottom w:val="single" w:sz="4" w:space="0" w:color="808080"/>
+              <w:right w:val="single" w:sz="4" w:space="0" w:color="808080"/>
+            </w:tcBorders>
+          </w:tcPr>
+          <w:p>
+            <w:pPr>
+              <w:pStyle w:val="Normal"/>
+              <w:rPr/>
+            </w:pPr>
+            <w:r>
+              <w:rPr/>
+              <w:t>UX</w:t>
+            </w:r>
+          </w:p>
+        </w:tc>
+        <w:tc>
+          <w:tcPr>
+            <w:tcW w:w="7766" w:type="dxa"/>
             <w:tcBorders>
               <w:top w:val="single" w:sz="4" w:space="0" w:color="808080"/>
               <w:left w:val="single" w:sz="4" w:space="0" w:color="808080"/>
@@ -3192,11 +3220,11 @@
               <w:rPr>
                 <w:i/>
               </w:rPr>
-              <w:t>WebAssembly</w:t>
-            </w:r>
-            <w:r>
-              <w:rPr/>
-              <w:t>; tecnologia para execução de código compilado no navegador.</w:t>
+              <w:t>User Experience</w:t>
+            </w:r>
+            <w:r>
+              <w:rPr/>
+              <w:t>; experiência do utilizador.</w:t>
             </w:r>
           </w:p>
         </w:tc>
@@ -3205,7 +3233,58 @@
         <w:trPr/>
         <w:tc>
           <w:tcPr>
-            <w:tcW w:w="4512" w:type="dxa"/>
+            <w:tcW w:w="1260" w:type="dxa"/>
+            <w:tcBorders>
+              <w:top w:val="single" w:sz="4" w:space="0" w:color="808080"/>
+              <w:left w:val="single" w:sz="4" w:space="0" w:color="808080"/>
+              <w:bottom w:val="single" w:sz="4" w:space="0" w:color="808080"/>
+              <w:right w:val="single" w:sz="4" w:space="0" w:color="808080"/>
+            </w:tcBorders>
+          </w:tcPr>
+          <w:p>
+            <w:pPr>
+              <w:pStyle w:val="Normal"/>
+              <w:rPr/>
+            </w:pPr>
+            <w:r>
+              <w:rPr/>
+              <w:t>WASM</w:t>
+            </w:r>
+          </w:p>
+        </w:tc>
+        <w:tc>
+          <w:tcPr>
+            <w:tcW w:w="7766" w:type="dxa"/>
+            <w:tcBorders>
+              <w:top w:val="single" w:sz="4" w:space="0" w:color="808080"/>
+              <w:left w:val="single" w:sz="4" w:space="0" w:color="808080"/>
+              <w:bottom w:val="single" w:sz="4" w:space="0" w:color="808080"/>
+              <w:right w:val="single" w:sz="4" w:space="0" w:color="808080"/>
+            </w:tcBorders>
+          </w:tcPr>
+          <w:p>
+            <w:pPr>
+              <w:pStyle w:val="Normal"/>
+              <w:rPr/>
+            </w:pPr>
+            <w:r>
+              <w:rPr>
+                <w:i/>
+              </w:rPr>
+              <w:t>WebAssembly</w:t>
+            </w:r>
+            <w:r>
+              <w:rPr/>
+              <w:t>; tecnologia para execução de código compilado no navegador.</w:t>
+            </w:r>
+          </w:p>
+        </w:tc>
+      </w:tr>
+      <w:tr>
+        <w:trPr/>
+        <w:tc>
+          <w:tcPr>
+            <w:tcW w:w="1260" w:type="dxa"/>
             <w:tcBorders>
               <w:top w:val="single" w:sz="4" w:space="0" w:color="808080"/>
               <w:left w:val="single" w:sz="4" w:space="0" w:color="808080"/>
@@ -3226,7 +3305,7 @@
         </w:tc>
         <w:tc>
           <w:tcPr>
-            <w:tcW w:w="4514" w:type="dxa"/>
+            <w:tcW w:w="7766" w:type="dxa"/>
             <w:tcBorders>
               <w:top w:val="single" w:sz="4" w:space="0" w:color="808080"/>
               <w:left w:val="single" w:sz="4" w:space="0" w:color="808080"/>
@@ -6734,7 +6813,7 @@
         <w:rPr>
           <w:lang w:val="pt-PT"/>
         </w:rPr>
-        <w:t>Em contextos médicos e assistivos, estudos demonstram a integração de modelos paramétricos com análises de elementos finitos (FEM) para validar o desempenho estrutural, bem como de algoritmos generativos que adaptam padrões e estruturas superficiais a geometrias individualizadas (Lei et al., 2016 (#ref-lei-2016); Lim et al., 2018 (#ref-lim-2018)).</w:t>
+        <w:t>Em contextos médicos e de tecnologias de apoio, estudos demonstram a integração de modelos paramétricos com análises de elementos finitos (FEM) para validar o desempenho estrutural, bem como a utilização de algoritmos generativos capazes de adaptar padrões e estruturas superficiais a geometrias individualizadas. (Lei et al., 2016 (#ref-lei-2016); Lim et al., 2018 (#ref-lim-2018)).</w:t>
       </w:r>
     </w:p>
     <w:p>
@@ -15990,8 +16069,34 @@
         <w:rPr>
           <w:lang w:val="pt-PT"/>
         </w:rPr>
-        <w:t xml:space="preserve">As decisões de normalização dos dados seguiram quatro princípios metodológicos. Em primeiro lugar, todas as medidas antropométricas foram convertidas para milímetros, centímetros e polegadas, mantendo-se também a unidade originalmente utilizada em cada fonte. Esta decisão permite comparar valores entre estudos sem perder a referência ao formato de publicação original e reduz o risco de conversões ambíguas no momento de utilização dos dados. Em segundo lugar, valores provenientes de subgrupos com dimensão amostral reduzida, dados extraídos de figuras em vez de tabelas, desvios-padrão discrepantes ou definições anatómicas pouco explícitas foram mantidos na base, mas assinalados através de notas de qualidade. Deste modo, a incerteza associada a cada registo permanece documentada, em vez de ser eliminada sem justificação metodológica. Em terceiro lugar, as medidas foram agrupadas por região corporal, distinguindo dimensões da mão, dedos e palma, diretamente relevantes para a geração da geometria principal, de dimensões do punho e antebraço, mais associadas à interface, à fixação ou à adaptação ao membro residual. Por fim, os valores recolhidos foram tratados como referências paramétricas, e não como prescrições dimensionais finais. A base antropométrica construída responde, assim, a uma necessidade específica do modelo desenvolvido: traduzir o enquadramento antropométrico da personalização protésica em intervalos, relações proporcionais e restrições utilizáveis no processo de modelação. Deste modo, os dados não definem automaticamente a forma da prótese, mas delimitam o espaço de variação dentro do qual o modelo pode operar com maior coerência geométrica e metodológica. Para tal, o sistema necessita de identificar quais as medidas recorrentes na literatura, que variações podem ser consideradas plausíveis entre populações, que dimensões podem funcionar como entradas mínimas de configuração e em que situações o redimensionamento uniforme se torna metodologicamente arriscado. A base de dados construída permite comparar, de forma rastreável, valores relativos ao comprimento da mão, à largura da palma, aos comprimentos digitais, às dimensões do punho e às relações com o antebraço. </w:t>
-      </w:r>
+        <w:t>As decisões de normalização dos dados seguiram quatro princípios metodológicos. Em primeiro lugar, todas as medidas antropométricas foram convertidas para milímetros, centímetros e polegadas, mantendo-se também a unidade originalmente utilizada em cada fonte. Esta decisão permite comparar valores entre estudos sem perder a referência ao formato de publicação original e reduz o risco de conversões ambíguas no momento de utilização dos dados. Em segundo lugar, valores provenientes de subgrupos com dimensão amostral reduzida, dados extraídos de figuras em vez de tabelas, desvios-padrão discrepantes ou definições anatómicas pouco explícitas foram mantidos na base, mas assinalados através de notas de qualidade. Deste modo, a incerteza associada a cada registo permanece documentada, em vez de ser eliminada sem justificação metodológica. Em terceiro lugar, as medidas foram agrupadas por região corporal, distinguindo dimensões da mão, dedos e palma, diretamente relevantes para a geração da geometria principal, de dimensões do punho e antebraço, mais associadas à interface, à fixação ou à adaptação ao membro residual. Por fim, os valores recolhidos foram tratados como referências paramétricas, e não como prescrições dimensionais finais. A base antropométrica construída responde, assim, a uma necessidade específica do modelo desenvolvido: traduzir o enquadramento antropométrico da personalização protésica em intervalos, relações proporcionais e restrições utilizáveis no processo de modelação. Deste modo, os dados não definem automaticamente a forma da prótese, mas delimitam o espaço de variação dentro do qual o modelo pode operar com maior coerência geométrica e metodológica. Para tal, o sistema necessita de identificar quais as medidas recorrentes na literatura, que variações podem ser consideradas plausíveis entre populações, que dimensões podem funcionar como entradas mínimas de configuração e em que situações o redimensionamento uniforme se torna metodologicamente arriscado.</w:t>
+      </w:r>
+    </w:p>
+    <w:p>
+      <w:pPr>
+        <w:pStyle w:val="BodyText"/>
+        <w:bidi w:val="0"/>
+        <w:jc w:val="left"/>
+        <w:rPr>
+          <w:lang w:val="pt-PT"/>
+        </w:rPr>
+      </w:pPr>
+      <w:r>
+        <w:rPr>
+          <w:lang w:val="pt-PT"/>
+        </w:rPr>
+        <w:t>A base de dados construída permite comparar valores relativos ao comprimento da mão, à largura da palma, aos comprimentos digitais, às dimensões do punho e às relações com o antebraço, mantendo a referência à fonte, à população e ao contexto metodológico de cada registo.</w:t>
+      </w:r>
+    </w:p>
+    <w:p>
+      <w:pPr>
+        <w:pStyle w:val="BodyText"/>
+        <w:bidi w:val="0"/>
+        <w:jc w:val="left"/>
+        <w:rPr>
+          <w:lang w:val="pt-PT"/>
+        </w:rPr>
+      </w:pPr>
       <w:r>
         <w:rPr/>
         <w:t>Deste modo, a base de dados sustenta a passagem entre o enquadramento antropométrico e a modelação paramétrica tridimensional, usando OpenSCAD: os dados não geram automaticamente a prótese, mas delimitam o espaço de variação dentro do qual o modelo pode operar com maior coerência geométrica e metodológica.</w:t>
@@ -19265,7 +19370,11 @@
         <w:rPr>
           <w:lang w:val="pt-PT"/>
         </w:rPr>
-        <w:t>, formato de script utilizado pelo OpenSCAD para definir modelos geométricos por código; os parâmetros introduzidos ou ajustados na interface; e o ambiente de execução em WebAssembly. Quando o utilizador altera uma configuração, a plataforma envia os valores atualizados para um Web Worker, que aplica esses parâmetros ao modelo em OpenSCAD e gera a geometria tridimensional correspondente. O resultado é depois devolvido ao visualizador no navegador, permitindo observar os efeitos das alterações sem recorrer a software CAD instalado localmente. Este fluxo estabelece uma ligação direta entre edição paramétrica, cálculo geométrico e feedback visual, mantendo o processo rastreável dentro da própria plataforma.</w:t>
+        <w:t xml:space="preserve">, formato de script utilizado pelo OpenSCAD para definir modelos geométricos por código; os parâmetros introduzidos ou ajustados na interface; e o ambiente de execução em WebAssembly. Quando o utilizador altera uma configuração, a plataforma envia os valores atualizados para um Web Worker, que aplica esses parâmetros ao modelo em OpenSCAD e gera a geometria tridimensional correspondente. O resultado é depois devolvido ao visualizador no navegador, permitindo observar os efeitos das alterações sem recorrer a software CAD instalado localmente. </w:t>
+      </w:r>
+      <w:r>
+        <w:rPr/>
+        <w:t>Este fluxo estabelece uma ligação direta entre edição paramétrica, cálculo geométrico e feedback visual, permitindo que o processo seja documentado, verificado e revisto dentro da própria plataforma.</w:t>
       </w:r>
     </w:p>
     <w:p>
@@ -19672,30 +19781,39 @@
       </w:r>
       <w:r>
         <w:rPr>
-          <w:lang w:val="pt-PT"/>
-        </w:rPr>
-        <w:t xml:space="preserve"> assumida no projeto.</w:t>
-      </w:r>
-    </w:p>
-    <w:p>
-      <w:pPr>
-        <w:pStyle w:val="Normal"/>
-        <w:bidi w:val="0"/>
-        <w:jc w:val="left"/>
-        <w:rPr/>
-      </w:pPr>
-      <w:r>
-        <w:rPr>
-          <w:lang w:val="pt-PT"/>
-        </w:rPr>
-        <w:t xml:space="preserve">A evolução posterior do módulo acrescentou uma ancoragem opcional em dados populacionais. Quando o </w:t>
-      </w:r>
-      <w:r>
-        <w:rPr>
+          <w:rStyle w:val="FootnoteReference"/>
           <w:i/>
           <w:iCs/>
           <w:lang w:val="pt-PT"/>
         </w:rPr>
+        <w:footnoteReference w:id="14"/>
+      </w:r>
+      <w:r>
+        <w:rPr>
+          <w:lang w:val="pt-PT"/>
+        </w:rPr>
+        <w:t xml:space="preserve"> assumida no projeto.</w:t>
+      </w:r>
+    </w:p>
+    <w:p>
+      <w:pPr>
+        <w:pStyle w:val="Normal"/>
+        <w:bidi w:val="0"/>
+        <w:jc w:val="left"/>
+        <w:rPr/>
+      </w:pPr>
+      <w:r>
+        <w:rPr>
+          <w:lang w:val="pt-PT"/>
+        </w:rPr>
+        <w:t xml:space="preserve">A evolução posterior do módulo acrescentou uma ancoragem opcional em dados populacionais. Quando o </w:t>
+      </w:r>
+      <w:r>
+        <w:rPr>
+          <w:i/>
+          <w:iCs/>
+          <w:lang w:val="pt-PT"/>
+        </w:rPr>
         <w:t>frontend</w:t>
       </w:r>
       <w:r>
@@ -19756,14 +19874,64 @@
         <w:rPr>
           <w:lang w:val="pt-PT"/>
         </w:rPr>
-        <w:t xml:space="preserve">Por fim, a plataforma inclui um módulo administrativo e de controlo de acesso que suporta a organização multi-utilizador. Este módulo assegura a criação de contas, a diferenciação de permissões, a atribuição de utilizadores a técnicos e a delimitação das ações acessíveis a cada perfil. A sua presença confirma que a estrutura funcional </w:t>
-      </w:r>
+        <w:t>Por fim, a plataforma inclui um módulo administrativo e de controlo de acesso que suporta a organização multi-utilizador. Este módulo assegura a criação de contas, a diferenciação de permissões, a atribuição de utilizadores a técnicos e a delimitação das ações acessíveis a cada perfil.</w:t>
+      </w:r>
+    </w:p>
+    <w:p>
+      <w:pPr>
+        <w:pStyle w:val="Normal"/>
+        <w:bidi w:val="0"/>
+        <w:jc w:val="left"/>
+        <w:rPr>
+          <w:lang w:val="pt-PT"/>
+        </w:rPr>
+      </w:pPr>
+      <w:r>
+        <w:rPr/>
+        <w:t>A sua presença confirma que a estrutura funcional da plataforma abrange a manipulação de parâmetros, a visualização de formas e a gestão das relações entre agentes, responsabilidades e níveis de intervenção. Neste sentido, a aplicação obtém sugestões paramétricas através do servidor, que comunica com serviços externos por intermédio de um proxy seguro</w:t>
+      </w:r>
+      <w:r>
+        <w:rPr>
+          <w:rStyle w:val="FootnoteReference"/>
+        </w:rPr>
+        <w:footnoteReference w:id="15"/>
+      </w:r>
+      <w:r>
+        <w:rPr/>
+        <w:t>, enquadrando essa capacidade numa estrutura funcional mais ampla, em que configuração, supervisão e persistência coexistem como partes de um mesmo sistema operativo.</w:t>
+      </w:r>
+    </w:p>
+    <w:p>
+      <w:pPr>
+        <w:pStyle w:val="Normal"/>
+        <w:bidi w:val="0"/>
+        <w:jc w:val="left"/>
+        <w:rPr>
+          <w:lang w:val="pt-PT"/>
+        </w:rPr>
+      </w:pPr>
+      <w:r>
+        <w:rPr>
+          <w:lang w:val="pt-PT"/>
+        </w:rPr>
+        <w:t>A biblioteca de modelos integrada na plataforma confirma esta lógica modular. Em vez de tratar a prótese como um único ficheiro estático, o sistema organiza diferentes famílias de próteses como modelos registados, cada uma com parâmetros, dependências, limites e modos de visualização próprios. Esta decisão permitiu comparar estratégias distintas de integração: modelos reconstruídos integralmente em OpenSCAD, modelos provenientes de geometrias existentes e modelos open source já paramétricos, mas não alinhados com a nomenclatura antropométrica da plataforma. A integração não consistiu, portanto, apenas em “carregar” ficheiros tridimensionais; consistiu em traduzir cada modelo para uma interface comum de parâmetros, mantendo as suas restrições mecânicas específicas.</w:t>
+      </w:r>
+    </w:p>
+    <w:p>
+      <w:pPr>
+        <w:pStyle w:val="Normal"/>
+        <w:bidi w:val="0"/>
+        <w:jc w:val="left"/>
+        <w:rPr>
+          <w:lang w:val="pt-PT"/>
+        </w:rPr>
+      </w:pPr>
       <w:commentRangeStart w:id="16"/>
       <w:r>
         <w:rPr>
           <w:lang w:val="pt-PT"/>
         </w:rPr>
-        <w:t>da plataforma não se esgota na manipulação de parâmetros e na visualização de</w:t>
+        <w:t>No caso do Paraglider Hand, também conhecido como Flexible Flyer, a integração partiu de uma mão mecânica acionada pelo corpo, derivada da linhagem Phoenix e UnLimbited.</w:t>
       </w:r>
       <w:r>
         <w:rPr>
@@ -19778,14 +19946,46 @@
         <w:rPr>
           <w:lang w:val="pt-PT"/>
         </w:rPr>
-        <w:t xml:space="preserve"> formas; inclui também a gestão das relações entre agentes, das responsabilidades e dos níveis de intervenção. Neste sentido, a aplicação obtém sugestões paramétricas através do servidor, que se comunica com serviços externos por intermédio de um </w:t>
+        <w:t xml:space="preserve"> O desafio principal não foi reconstruir a geometria dos dedos, já definida em OpenSCAD, mas alinhar a lógica original do modelo com os nomes canónicos usados pelo sistema. A palma passou a ser controlada pela largura metacarpal, enquanto os dedos foram associados a comprimentos digitais independentes. Esta separação foi importante porque a largura da palma e o comprimento dos dedos não variam necessariamente de forma proporcional. Ao mesmo tempo, a palma teve de manter escalonamento uniforme, uma vez que os furos cilíndricos para pinos metálicos não podem ser deformados em elipses sem comprometer a montagem. Assim, certas medidas, como o comprimento e a espessura da palma, foram mantidas como informação contextual para a IA e para o perfil antropométrico, mas não foram usadas como transformações geométricas ativas nesse modelo.</w:t>
+      </w:r>
+    </w:p>
+    <w:p>
+      <w:pPr>
+        <w:pStyle w:val="Normal"/>
+        <w:bidi w:val="0"/>
+        <w:jc w:val="left"/>
+        <w:rPr>
+          <w:lang w:val="pt-PT"/>
+        </w:rPr>
+      </w:pPr>
+      <w:r>
+        <w:rPr>
+          <w:lang w:val="pt-PT"/>
+        </w:rPr>
+        <w:t>A integração do Paraglider também revelou limitações práticas da execução de OpenSCAD em WebAssembly. Alguns ficheiros originais usavam construções sintáticas não suportadas pela versão compilada para navegador, o que impediu a definição de módulos durante a renderização. A solução foi manter cópias corrigidas dos ficheiros necessários, preservar a origem do modelo e controlar explicitamente as dependências carregadas para o sistema virtual de ficheiros do navegador. Esta etapa teve relevância metodológica porque mostrou que a compatibilidade web não depende apenas da qualidade geométrica do modelo, mas também da forma como bibliotecas, ficheiros importados e variantes de sintaxe são organizados no fluxo digital.</w:t>
+      </w:r>
+    </w:p>
+    <w:p>
+      <w:pPr>
+        <w:pStyle w:val="Normal"/>
+        <w:bidi w:val="0"/>
+        <w:jc w:val="left"/>
+        <w:rPr>
+          <w:lang w:val="pt-PT"/>
+        </w:rPr>
+      </w:pPr>
+      <w:r>
+        <w:rPr>
+          <w:lang w:val="pt-PT"/>
+        </w:rPr>
+        <w:t xml:space="preserve">O trabalho realizado sobre modelos do tipo Cyborg Beast/Flexy Hand teve uma função complementar. Estes modelos foram usados como base exploratória para testar uma reparametrização mais ampla, em que a geometria original foi reorganizada em torno de medidas antropométricas da palma, dos dedos, do punho e do membro residual. A versão antropométrica resultante não foi tratada como simples escala global: incorporou comprimentos digitais, espessuras estruturais, canais internos, </w:t>
       </w:r>
       <w:commentRangeStart w:id="17"/>
       <w:r>
         <w:rPr>
           <w:lang w:val="pt-PT"/>
         </w:rPr>
-        <w:t>proxy seguro</w:t>
+        <w:t>parâmetros de hardware</w:t>
       </w:r>
       <w:r>
         <w:rPr>
@@ -19800,40 +20000,216 @@
         <w:rPr>
           <w:lang w:val="pt-PT"/>
         </w:rPr>
-        <w:t>, mas enquadra essa capacidade dentro de uma estrutura funcional mais ampla, em que configuração, supervisão e persistência coexistem como partes de um mesmo sistema operativo.</w:t>
-      </w:r>
-    </w:p>
-    <w:p>
-      <w:pPr>
-        <w:pStyle w:val="Normal"/>
-        <w:bidi w:val="0"/>
-        <w:jc w:val="left"/>
-        <w:rPr>
-          <w:lang w:val="pt-PT"/>
-        </w:rPr>
-      </w:pPr>
-      <w:r>
-        <w:rPr>
-          <w:lang w:val="pt-PT"/>
-        </w:rPr>
-        <w:t>A biblioteca de modelos integrada na plataforma confirma esta lógica modular. Em vez de tratar a prótese como um único ficheiro estático, o sistema organiza diferentes famílias de próteses como modelos registados, cada uma com parâmetros, dependências, limites e modos de visualização próprios. Esta decisão permitiu comparar estratégias distintas de integração: modelos reconstruídos integralmente em OpenSCAD, modelos provenientes de geometrias existentes e modelos open source já paramétricos, mas não alinhados com a nomenclatura antropométrica da plataforma. A integração não consistiu, portanto, apenas em “carregar” ficheiros tridimensionais; consistiu em traduzir cada modelo para uma interface comum de parâmetros, mantendo as suas restrições mecânicas específicas.</w:t>
-      </w:r>
-    </w:p>
-    <w:p>
-      <w:pPr>
-        <w:pStyle w:val="Normal"/>
-        <w:bidi w:val="0"/>
-        <w:jc w:val="left"/>
-        <w:rPr>
-          <w:lang w:val="pt-PT"/>
-        </w:rPr>
-      </w:pPr>
+        <w:t xml:space="preserve"> e dimensões de encaixe derivadas de medidas do antebraço. Essa experiência foi útil para clarificar a diferença entre adaptar um modelo existente por multiplicadores gerais e reconstruir a sua lógica dimensional em torno de uma estrutura antropométrica coerente. Mesmo quando determinados modelos permaneceram como material de desenvolvimento e comparação, contribuíram para estabilizar a taxonomia de parâmetros que a plataforma passou a exigir aos modelos ativos.</w:t>
+      </w:r>
+    </w:p>
+    <w:p>
+      <w:pPr>
+        <w:pStyle w:val="Normal"/>
+        <w:bidi w:val="0"/>
+        <w:jc w:val="left"/>
+        <w:rPr>
+          <w:lang w:val="pt-PT"/>
+        </w:rPr>
+      </w:pPr>
+      <w:r>
+        <w:rPr>
+          <w:lang w:val="pt-PT"/>
+        </w:rPr>
+        <w:t>Em conjunto, estes casos mostram que a expansão da plataforma depende menos da quantidade de modelos disponíveis e mais da existência de uma gramática comum de integração. Cada nova prótese a integrar no sistema exige três operações: identificar quais parâmetros antropométricos são relevantes, decidir que parâmetros podem alterar a geometria sem quebrar interfaces mecânicas e declarar essas relações de forma compreensível para a interface, para o renderizador e para a camada de IA. A biblioteca de modelos torna-se, assim, um campo de validação técnica da própria arquitetura: quanto mais heterogéneos forem os modelos integrados, mais clara se torna a necessidade de separar dados antropométricos, regras geométricas, restrições de fabrico e sugestões assistidas.</w:t>
+      </w:r>
+    </w:p>
+    <w:p>
+      <w:pPr>
+        <w:pStyle w:val="Normal"/>
+        <w:bidi w:val="0"/>
+        <w:jc w:val="left"/>
+        <w:rPr>
+          <w:lang w:val="pt-PT"/>
+        </w:rPr>
+      </w:pPr>
+      <w:r>
+        <w:rPr>
+          <w:lang w:val="pt-PT"/>
+        </w:rPr>
+      </w:r>
+    </w:p>
+    <w:p>
+      <w:pPr>
+        <w:pStyle w:val="Heading3"/>
+        <w:bidi w:val="0"/>
+        <w:jc w:val="left"/>
+        <w:rPr>
+          <w:lang w:val="pt-PT"/>
+        </w:rPr>
+      </w:pPr>
+      <w:r>
+        <w:rPr>
+          <w:lang w:val="pt-PT"/>
+        </w:rPr>
+        <w:t>5.5 Gestão de parâmetros, versões e expansão</w:t>
+      </w:r>
+    </w:p>
+    <w:p>
+      <w:pPr>
+        <w:pStyle w:val="Heading3"/>
+        <w:bidi w:val="0"/>
+        <w:jc w:val="left"/>
+        <w:rPr>
+          <w:lang w:val="pt-PT"/>
+        </w:rPr>
+      </w:pPr>
+      <w:r>
+        <w:rPr>
+          <w:lang w:val="pt-PT"/>
+        </w:rPr>
+      </w:r>
+    </w:p>
+    <w:p>
+      <w:pPr>
+        <w:pStyle w:val="Normal"/>
+        <w:bidi w:val="0"/>
+        <w:jc w:val="left"/>
+        <w:rPr>
+          <w:lang w:val="pt-PT"/>
+        </w:rPr>
+      </w:pPr>
+      <w:r>
+        <w:rPr>
+          <w:lang w:val="pt-PT"/>
+        </w:rPr>
+        <w:t>Controlar parâmetros constitui uma das condições centrais para transformar um modelo paramétrico num sistema utilizável e persistente. No caso da plataforma desenvolvida, essa gestão é operacionalizada através de ficheiros de configuração que descrevem cada parâmetro segundo atributos como nome, tipo, valor inicial, limites, incrementos e agrupamento temático. Esta estrutura não cumpre apenas uma função técnica de leitura na interface; formaliza a relação entre o código OpenSCAD, o espaço de variação permitido e os mecanismos de controlo disponibilizados ao utilizador. Em termos metodológicos, esta opção aproxima-se da lógica descrita na literatura sobre configuradores e personalização digital, segundo a qual a eficácia do sistema depende da capacidade de expor apenas parâmetros relevantes, dentro de limites inteligíveis e controlados, preservando a coerência interna do modelo-base (Ozdemir et al., 2022 (#ref-ozdemir-2022); Lei et al., 2016 (#ref-lei-2016)).</w:t>
+      </w:r>
+    </w:p>
+    <w:p>
+      <w:pPr>
+        <w:pStyle w:val="Normal"/>
+        <w:bidi w:val="0"/>
+        <w:jc w:val="left"/>
+        <w:rPr/>
+      </w:pPr>
+      <w:r>
+        <w:rPr>
+          <w:lang w:val="pt-PT"/>
+        </w:rPr>
+        <w:t xml:space="preserve">Ao descrever os parâmetros em estruturas independentes do código geométrico principal, a plataforma obtém duas vantagens. A primeira é a rastreabilidade: torna-se possível saber quais variáveis são editáveis, quais são os seus intervalos válidos e como se articulam com a interface. </w:t>
+      </w:r>
+      <w:r>
+        <w:rPr/>
+        <w:t xml:space="preserve">A segunda vantagem reside na possibilidade de adaptar a estrutura do próprio sistema: parâmetros podem ser adicionados, removidos ou ajustados sem que seja necessário reescrever integralmente a lógica de interação. Assim, a gestão de parâmetros funciona como uma camada intermédia entre a definição geométrica e a experiência de uso, permitindo que o modelo permaneça tecnicamente explícito sem exigir que o utilizador interaja diretamente com a sua sintaxe interna. </w:t>
+      </w:r>
+    </w:p>
+    <w:p>
+      <w:pPr>
+        <w:pStyle w:val="Normal"/>
+        <w:bidi w:val="0"/>
+        <w:jc w:val="left"/>
+        <w:rPr/>
+      </w:pPr>
+      <w:r>
+        <w:rPr>
+          <w:lang w:val="pt-PT"/>
+        </w:rPr>
+        <w:t>A gestão de versões manifesta-se, neste estágio do projeto, sobretudo por meio do armazenamento de configurações salvas. A plataforma permite conservar diferentes conjuntos de parâmetros associados ao mesmo modelo, atribuindo-lhes identificação própria, notas descritivas e associação a um utilizador específico. E</w:t>
+      </w:r>
+      <w:r>
+        <w:rPr/>
+        <w:t>mbora esta solução ainda não corresponda a um sistema completo de gestão de versões, como os utilizados no desenvolvimento de software, já suporta uma função relevante para o processo de projeto: acompanhar a configuração ao longo do tempo, preservar variantes e permitir a comparação entre estados sucessivos do mesmo artefacto.</w:t>
+      </w:r>
+      <w:r>
+        <w:rPr>
+          <w:lang w:val="pt-PT"/>
+        </w:rPr>
+        <w:t xml:space="preserve"> </w:t>
+      </w:r>
+      <w:r>
+        <w:rPr/>
+        <w:t xml:space="preserve">Cada configuração registada pode, assim, ser entendida como uma instância documentada do processo de personalização, passível de recuperação, comparação e revisão, e não apenas como um ficheiro transitório. </w:t>
+      </w:r>
+      <w:r>
+        <w:rPr>
+          <w:lang w:val="pt-PT"/>
+        </w:rPr>
+        <w:t>Esta capacidade é particularmente importante num contexto em que a personalização não é um ato único, mas uma sequência de aproximações, testes e revisões.</w:t>
+      </w:r>
+    </w:p>
+    <w:p>
+      <w:pPr>
+        <w:pStyle w:val="Normal"/>
+        <w:bidi w:val="0"/>
+        <w:jc w:val="left"/>
+        <w:rPr>
+          <w:lang w:val="pt-PT"/>
+        </w:rPr>
+      </w:pPr>
+      <w:r>
+        <w:rPr>
+          <w:lang w:val="pt-PT"/>
+        </w:rPr>
+        <w:t>Do ponto de vista funcional, a persistência dessas configurações em estruturas JSON associadas a modelos e utilizadores reforça a continuidade entre interação, revisão e reutilização. O sistema deixa, assim, de limitar a configuração ao estado temporário da sessão e passa a preservar um registo das configurações realizadas, possibilitando retomar soluções anteriores, documentar alternativas exploradas e preparar comparações futuras entre versões. Esta forma de gestão prática de versões é coerente com o caráter experimental da plataforma: ainda não pretende substituir mecanismos mais sofisticados de gestão de revisões, mas fornece uma base suficiente para sustentar o acompanhamento iterativo do desenvolvimento e a análise reflexiva do processo.</w:t>
+      </w:r>
+    </w:p>
+    <w:p>
+      <w:pPr>
+        <w:pStyle w:val="BodyText"/>
+        <w:bidi w:val="0"/>
+        <w:jc w:val="left"/>
+        <w:rPr/>
+      </w:pPr>
+      <w:r>
+        <w:rPr>
+          <w:lang w:val="pt-PT"/>
+        </w:rPr>
+        <w:t xml:space="preserve">Quanto à capacidade de expansão, a plataforma beneficia de uma arquitetura modular e orientada por ficheiros de configuração. A separação entre modelos, parâmetros, interface, autenticação e persistência permite acrescentar novos modelos em OpenSCAD, novos tipos de parâmetros ou novas rotinas de apoio sem reestruturar integralmente a aplicação. </w:t>
+      </w:r>
+      <w:r>
+        <w:rPr/>
+        <w:t>Na prática, a introdução de um novo modelo exige sobretudo a adição do ficheiro .scad correspondente e o seu registo no ficheiro de configuração dos modelos (models-config.json). Esta estrutura evidencia uma lógica de expansão baseada menos na duplicação de código e mais na extensão controlada da plataforma.</w:t>
+      </w:r>
+      <w:r>
+        <w:rPr>
+          <w:lang w:val="pt-PT"/>
+        </w:rPr>
+        <w:t xml:space="preserve"> Esta característica é consistente com a literatura sobre sistemas paramétricos e famílias de produto, que associa robustez e expansão sustentável à qualidade das estruturas relacionais, e não ao aumento indiscriminado de opções ou de módulos independentes (Lei et al., 2016 (#ref-lei-2016); Ozdemir et al., 2022 (#ref-ozdemir-2022)).</w:t>
+      </w:r>
+    </w:p>
+    <w:p>
+      <w:pPr>
+        <w:pStyle w:val="Normal"/>
+        <w:bidi w:val="0"/>
+        <w:jc w:val="left"/>
+        <w:rPr>
+          <w:lang w:val="pt-PT"/>
+        </w:rPr>
+      </w:pPr>
+      <w:r>
+        <w:rPr>
+          <w:lang w:val="pt-PT"/>
+        </w:rPr>
+        <w:t>Todavia, esta lógica de expansão deve ser analisada criticamente.</w:t>
+      </w:r>
+    </w:p>
+    <w:p>
+      <w:pPr>
+        <w:pStyle w:val="BodyText"/>
+        <w:bidi w:val="0"/>
+        <w:jc w:val="left"/>
+        <w:rPr>
+          <w:lang w:val="pt-PT"/>
+        </w:rPr>
+      </w:pPr>
+      <w:r>
+        <w:rPr>
+          <w:lang w:val="pt-PT"/>
+        </w:rPr>
+        <w:t xml:space="preserve">O recurso ao </w:t>
+      </w:r>
       <w:commentRangeStart w:id="18"/>
       <w:r>
         <w:rPr>
           <w:lang w:val="pt-PT"/>
         </w:rPr>
-        <w:t>No caso do Paraglider Hand, também conhecido como Flexible Flyer, a integração partiu de uma mão mecânica acionada pelo corpo, derivada da linhagem Phoenix e UnLimbited.</w:t>
+        <w:t>SQLite</w:t>
       </w:r>
       <w:r>
         <w:rPr>
@@ -19843,296 +20219,6 @@
       <w:commentRangeEnd w:id="18"/>
       <w:r>
         <w:commentReference w:id="18"/>
-      </w:r>
-      <w:r>
-        <w:rPr>
-          <w:lang w:val="pt-PT"/>
-        </w:rPr>
-        <w:t xml:space="preserve"> O desafio principal não foi reconstruir a geometria dos dedos, já definida em OpenSCAD, mas alinhar a lógica original do modelo com os nomes canónicos usados pelo sistema. A palma passou a ser controlada pela largura metacarpal, enquanto os dedos foram associados a comprimentos digitais independentes. Esta separação foi importante porque a largura da palma e o comprimento dos dedos não variam necessariamente de forma proporcional. Ao mesmo tempo, a palma teve de manter escalonamento uniforme, uma vez que os furos cilíndricos para pinos metálicos não podem ser deformados em elipses sem comprometer a montagem. Assim, certas medidas, como o comprimento e a espessura da palma, foram mantidas como informação contextual para a IA e para o perfil antropométrico, mas não foram usadas como transformações geométricas ativas nesse modelo.</w:t>
-      </w:r>
-    </w:p>
-    <w:p>
-      <w:pPr>
-        <w:pStyle w:val="Normal"/>
-        <w:bidi w:val="0"/>
-        <w:jc w:val="left"/>
-        <w:rPr>
-          <w:lang w:val="pt-PT"/>
-        </w:rPr>
-      </w:pPr>
-      <w:r>
-        <w:rPr>
-          <w:lang w:val="pt-PT"/>
-        </w:rPr>
-        <w:t>A integração do Paraglider também revelou limitações práticas da execução de OpenSCAD em WebAssembly. Alguns ficheiros originais usavam construções sintáticas não suportadas pela versão compilada para navegador, o que impediu a definição de módulos durante a renderização. A solução foi manter cópias corrigidas dos ficheiros necessários, preservar a origem do modelo e controlar explicitamente as dependências carregadas para o sistema virtual de ficheiros do navegador. Esta etapa teve relevância metodológica porque mostrou que a compatibilidade web não depende apenas da qualidade geométrica do modelo, mas também da forma como bibliotecas, ficheiros importados e variantes de sintaxe são organizados no fluxo digital.</w:t>
-      </w:r>
-    </w:p>
-    <w:p>
-      <w:pPr>
-        <w:pStyle w:val="Normal"/>
-        <w:bidi w:val="0"/>
-        <w:jc w:val="left"/>
-        <w:rPr>
-          <w:lang w:val="pt-PT"/>
-        </w:rPr>
-      </w:pPr>
-      <w:r>
-        <w:rPr>
-          <w:lang w:val="pt-PT"/>
-        </w:rPr>
-        <w:t xml:space="preserve">O trabalho realizado sobre modelos do tipo Cyborg Beast/Flexy Hand teve uma função complementar. Estes modelos foram usados como base exploratória para testar uma reparametrização mais ampla, em que a geometria original foi reorganizada em torno de medidas antropométricas da palma, dos dedos, do punho e do membro residual. A versão antropométrica resultante não foi tratada como simples escala global: incorporou comprimentos digitais, espessuras estruturais, canais internos, </w:t>
-      </w:r>
-      <w:commentRangeStart w:id="19"/>
-      <w:r>
-        <w:rPr>
-          <w:lang w:val="pt-PT"/>
-        </w:rPr>
-        <w:t>parâmetros de hardware</w:t>
-      </w:r>
-      <w:r>
-        <w:rPr>
-          <w:lang w:val="pt-PT"/>
-        </w:rPr>
-      </w:r>
-      <w:commentRangeEnd w:id="19"/>
-      <w:r>
-        <w:commentReference w:id="19"/>
-      </w:r>
-      <w:r>
-        <w:rPr>
-          <w:lang w:val="pt-PT"/>
-        </w:rPr>
-        <w:t xml:space="preserve"> e dimensões de encaixe derivadas de medidas do antebraço. Essa experiência foi útil para clarificar a diferença entre adaptar um modelo existente por multiplicadores gerais e reconstruir a sua lógica dimensional em torno de uma estrutura antropométrica coerente. Mesmo quando determinados modelos permaneceram como material de desenvolvimento e comparação, contribuíram para estabilizar a taxonomia de parâmetros que a plataforma passou a exigir aos modelos ativos.</w:t>
-      </w:r>
-    </w:p>
-    <w:p>
-      <w:pPr>
-        <w:pStyle w:val="Normal"/>
-        <w:bidi w:val="0"/>
-        <w:jc w:val="left"/>
-        <w:rPr>
-          <w:lang w:val="pt-PT"/>
-        </w:rPr>
-      </w:pPr>
-      <w:r>
-        <w:rPr>
-          <w:lang w:val="pt-PT"/>
-        </w:rPr>
-        <w:t>Em conjunto, estes casos mostram que a expansão da plataforma depende menos da quantidade de modelos disponíveis e mais da existência de uma gramática comum de integração. Cada nova prótese a integrar no sistema exige três operações: identificar quais parâmetros antropométricos são relevantes, decidir que parâmetros podem alterar a geometria sem quebrar interfaces mecânicas e declarar essas relações de forma compreensível para a interface, para o renderizador e para a camada de IA. A biblioteca de modelos torna-se, assim, um campo de validação técnica da própria arquitetura: quanto mais heterogéneos forem os modelos integrados, mais clara se torna a necessidade de separar dados antropométricos, regras geométricas, restrições de fabrico e sugestões assistidas.</w:t>
-      </w:r>
-    </w:p>
-    <w:p>
-      <w:pPr>
-        <w:pStyle w:val="Normal"/>
-        <w:bidi w:val="0"/>
-        <w:jc w:val="left"/>
-        <w:rPr>
-          <w:lang w:val="pt-PT"/>
-        </w:rPr>
-      </w:pPr>
-      <w:r>
-        <w:rPr>
-          <w:lang w:val="pt-PT"/>
-        </w:rPr>
-      </w:r>
-    </w:p>
-    <w:p>
-      <w:pPr>
-        <w:pStyle w:val="Heading3"/>
-        <w:bidi w:val="0"/>
-        <w:jc w:val="left"/>
-        <w:rPr>
-          <w:lang w:val="pt-PT"/>
-        </w:rPr>
-      </w:pPr>
-      <w:r>
-        <w:rPr>
-          <w:lang w:val="pt-PT"/>
-        </w:rPr>
-        <w:t>5.5 Gestão de parâmetros, versões e expansão</w:t>
-      </w:r>
-    </w:p>
-    <w:p>
-      <w:pPr>
-        <w:pStyle w:val="Heading3"/>
-        <w:bidi w:val="0"/>
-        <w:jc w:val="left"/>
-        <w:rPr>
-          <w:lang w:val="pt-PT"/>
-        </w:rPr>
-      </w:pPr>
-      <w:r>
-        <w:rPr>
-          <w:lang w:val="pt-PT"/>
-        </w:rPr>
-      </w:r>
-    </w:p>
-    <w:p>
-      <w:pPr>
-        <w:pStyle w:val="Normal"/>
-        <w:bidi w:val="0"/>
-        <w:jc w:val="left"/>
-        <w:rPr>
-          <w:lang w:val="pt-PT"/>
-        </w:rPr>
-      </w:pPr>
-      <w:r>
-        <w:rPr>
-          <w:lang w:val="pt-PT"/>
-        </w:rPr>
-        <w:t>Controlar parâmetros constitui uma das condições centrais para transformar um modelo paramétrico num sistema utilizável e persistente. No caso da plataforma desenvolvida, essa gestão é operacionalizada através de ficheiros de configuração que descrevem cada parâmetro segundo atributos como nome, tipo, valor inicial, limites, incrementos e agrupamento temático. Esta estrutura não cumpre apenas uma função técnica de leitura na interface; formaliza a relação entre o código OpenSCAD, o espaço de variação permitido e os mecanismos de controlo disponibilizados ao utilizador. Em termos metodológicos, esta opção aproxima-se da lógica descrita na literatura sobre configuradores e personalização digital, segundo a qual a eficácia do sistema depende da capacidade de expor apenas parâmetros relevantes, dentro de limites inteligíveis e controlados, preservando a coerência interna do modelo-base (Ozdemir et al., 2022 (#ref-ozdemir-2022); Lei et al., 2016 (#ref-lei-2016)).</w:t>
-      </w:r>
-    </w:p>
-    <w:p>
-      <w:pPr>
-        <w:pStyle w:val="Normal"/>
-        <w:bidi w:val="0"/>
-        <w:jc w:val="left"/>
-        <w:rPr/>
-      </w:pPr>
-      <w:r>
-        <w:rPr>
-          <w:lang w:val="pt-PT"/>
-        </w:rPr>
-        <w:t xml:space="preserve">Ao descrever os parâmetros em estruturas independentes do código geométrico principal, a plataforma obtém duas vantagens. A primeira é a rastreabilidade: torna-se possível saber quais variáveis são editáveis, quais são os seus intervalos válidos e como se articulam com a interface. </w:t>
-      </w:r>
-      <w:r>
-        <w:rPr/>
-        <w:t xml:space="preserve">A segunda vantagem reside na possibilidade de adaptar a estrutura do próprio sistema: parâmetros podem ser adicionados, removidos ou ajustados sem que seja necessário reescrever integralmente a lógica de interação. Assim, a gestão de parâmetros funciona como uma camada intermédia entre a definição geométrica e a experiência de uso, permitindo que o modelo permaneça tecnicamente explícito sem exigir que o utilizador interaja diretamente com a sua sintaxe interna. </w:t>
-      </w:r>
-    </w:p>
-    <w:p>
-      <w:pPr>
-        <w:pStyle w:val="Normal"/>
-        <w:bidi w:val="0"/>
-        <w:jc w:val="left"/>
-        <w:rPr/>
-      </w:pPr>
-      <w:r>
-        <w:rPr>
-          <w:lang w:val="pt-PT"/>
-        </w:rPr>
-        <w:t>A gestão de versões manifesta-se, neste estágio do projeto, sobretudo por meio do armazenamento de configurações salvas. A plataforma permite conservar diferentes conjuntos de parâmetros associados ao mesmo modelo, atribuindo-lhes identificação própria, notas descritivas e associação a um utilizador específico. E</w:t>
-      </w:r>
-      <w:r>
-        <w:rPr/>
-        <w:t>mbora esta solução ainda não corresponda a um sistema completo de gestão de versões, como os utilizados no desenvolvimento de software, já suporta uma função relevante para o processo de projeto: acompanhar a configuração ao longo do tempo, preservar variantes e permitir a comparação entre estados sucessivos do mesmo artefacto.</w:t>
-      </w:r>
-      <w:r>
-        <w:rPr>
-          <w:lang w:val="pt-PT"/>
-        </w:rPr>
-        <w:t xml:space="preserve"> Cada configuração registada pode, assim, ser entendida como uma instância rastreável do processo de personalização, e não apenas como um ficheiro transitório. Esta capacidade é particularmente importante num contexto em que a personalização não é um ato único, mas uma sequência de aproximações, testes e revisões.</w:t>
-      </w:r>
-    </w:p>
-    <w:p>
-      <w:pPr>
-        <w:pStyle w:val="Normal"/>
-        <w:bidi w:val="0"/>
-        <w:jc w:val="left"/>
-        <w:rPr>
-          <w:lang w:val="pt-PT"/>
-        </w:rPr>
-      </w:pPr>
-      <w:r>
-        <w:rPr>
-          <w:lang w:val="pt-PT"/>
-        </w:rPr>
-        <w:t xml:space="preserve">Do ponto de vista funcional, a persistência dessas configurações em estruturas </w:t>
-      </w:r>
-      <w:commentRangeStart w:id="20"/>
-      <w:r>
-        <w:rPr>
-          <w:lang w:val="pt-PT"/>
-        </w:rPr>
-        <w:t>JSON</w:t>
-      </w:r>
-      <w:r>
-        <w:rPr>
-          <w:lang w:val="pt-PT"/>
-        </w:rPr>
-      </w:r>
-      <w:commentRangeEnd w:id="20"/>
-      <w:r>
-        <w:commentReference w:id="20"/>
-      </w:r>
-      <w:r>
-        <w:rPr>
-          <w:lang w:val="pt-PT"/>
-        </w:rPr>
-        <w:t xml:space="preserve"> associadas a modelos e utilizadores reforça a continuidade entre interação, revisão e reutilização. O sistema deixa, assim, de limitar a configuração ao estado temporário da sessão e passa a preservar um registo das configurações realizadas, possibilitando retomar soluções anteriores, documentar alternativas exploradas e preparar comparações futuras entre versões. Esta forma de gestão prática de versões é coerente com o caráter experimental da plataforma: ainda não pretende substituir mecanismos mais sofisticados de gestão de revisões, mas fornece uma base suficiente para sustentar o acompanhamento iterativo do desenvolvimento e a análise reflexiva do processo.</w:t>
-      </w:r>
-    </w:p>
-    <w:p>
-      <w:pPr>
-        <w:pStyle w:val="BodyText"/>
-        <w:bidi w:val="0"/>
-        <w:jc w:val="left"/>
-        <w:rPr/>
-      </w:pPr>
-      <w:r>
-        <w:rPr>
-          <w:lang w:val="pt-PT"/>
-        </w:rPr>
-        <w:t xml:space="preserve">Quanto à capacidade de expansão, a plataforma beneficia de uma arquitetura modular e orientada por ficheiros de configuração. A separação entre modelos, parâmetros, interface, autenticação e persistência permite acrescentar novos modelos em OpenSCAD, novos tipos de parâmetros ou novas rotinas de apoio sem reestruturar integralmente a aplicação. </w:t>
-      </w:r>
-      <w:r>
-        <w:rPr/>
-        <w:t>Na prática, a introdução de um novo modelo exige sobretudo a adição do ficheiro .scad correspondente e o seu registo no ficheiro de configuração dos modelos (models-config.json). Esta estrutura evidencia uma lógica de expansão baseada menos na duplicação de código e mais na extensão controlada da plataforma.</w:t>
-      </w:r>
-      <w:r>
-        <w:rPr>
-          <w:lang w:val="pt-PT"/>
-        </w:rPr>
-        <w:t xml:space="preserve"> Esta característica é consistente com a literatura sobre sistemas paramétricos e famílias de produto, que associa robustez e expansão sustentável à qualidade das estruturas relacionais, e não ao aumento indiscriminado de opções ou de módulos independentes (Lei et al., 2016 (#ref-lei-2016); Ozdemir et al., 2022 (#ref-ozdemir-2022)).</w:t>
-      </w:r>
-    </w:p>
-    <w:p>
-      <w:pPr>
-        <w:pStyle w:val="Normal"/>
-        <w:bidi w:val="0"/>
-        <w:jc w:val="left"/>
-        <w:rPr>
-          <w:lang w:val="pt-PT"/>
-        </w:rPr>
-      </w:pPr>
-      <w:r>
-        <w:rPr>
-          <w:lang w:val="pt-PT"/>
-        </w:rPr>
-        <w:t>Todavia, esta lógica de expansão deve ser analisada criticamente.</w:t>
-      </w:r>
-    </w:p>
-    <w:p>
-      <w:pPr>
-        <w:pStyle w:val="BodyText"/>
-        <w:bidi w:val="0"/>
-        <w:jc w:val="left"/>
-        <w:rPr>
-          <w:lang w:val="pt-PT"/>
-        </w:rPr>
-      </w:pPr>
-      <w:r>
-        <w:rPr>
-          <w:lang w:val="pt-PT"/>
-        </w:rPr>
-        <w:t xml:space="preserve">O recurso ao </w:t>
-      </w:r>
-      <w:commentRangeStart w:id="21"/>
-      <w:r>
-        <w:rPr>
-          <w:lang w:val="pt-PT"/>
-        </w:rPr>
-        <w:t>SQLite</w:t>
-      </w:r>
-      <w:r>
-        <w:rPr>
-          <w:lang w:val="pt-PT"/>
-        </w:rPr>
-      </w:r>
-      <w:commentRangeEnd w:id="21"/>
-      <w:r>
-        <w:commentReference w:id="21"/>
       </w:r>
       <w:r>
         <w:rPr>
@@ -20250,183 +20336,183 @@
         </w:rPr>
         <w:t xml:space="preserve">6.1 Papel da </w:t>
       </w:r>
+      <w:commentRangeStart w:id="19"/>
+      <w:r>
+        <w:rPr>
+          <w:lang w:val="pt-PT"/>
+        </w:rPr>
+        <w:t>IA</w:t>
+      </w:r>
+      <w:r>
+        <w:rPr>
+          <w:lang w:val="pt-PT"/>
+        </w:rPr>
+      </w:r>
+      <w:commentRangeEnd w:id="19"/>
+      <w:r>
+        <w:commentReference w:id="19"/>
+      </w:r>
+      <w:r>
+        <w:rPr>
+          <w:lang w:val="pt-PT"/>
+        </w:rPr>
+        <w:t xml:space="preserve"> no sistema proposto</w:t>
+      </w:r>
+    </w:p>
+    <w:p>
+      <w:pPr>
+        <w:pStyle w:val="Normal"/>
+        <w:bidi w:val="0"/>
+        <w:jc w:val="left"/>
+        <w:rPr>
+          <w:lang w:val="pt-PT"/>
+        </w:rPr>
+      </w:pPr>
+      <w:r>
+        <w:rPr>
+          <w:lang w:val="pt-PT"/>
+        </w:rPr>
+      </w:r>
+    </w:p>
+    <w:p>
+      <w:pPr>
+        <w:pStyle w:val="Normal"/>
+        <w:bidi w:val="0"/>
+        <w:jc w:val="left"/>
+        <w:rPr>
+          <w:lang w:val="pt-PT"/>
+        </w:rPr>
+      </w:pPr>
+      <w:r>
+        <w:rPr>
+          <w:lang w:val="pt-PT"/>
+        </w:rPr>
+        <w:t>No sistema desenvolvido, a IA assume uma função distinta daquela que surge com maior frequência nos estudos sobre próteses. Enquanto grande parte da investigação consultada se concentra em tarefas de controlo, interpretação de biosinais, reconhecimento de gestos e adaptação funcional, esta investigação explora a IA como camada de apoio à configuração paramétrica, articulada com dados antropométricos, modelos geométricos explícitos e interface web.</w:t>
+      </w:r>
+    </w:p>
+    <w:p>
+      <w:pPr>
+        <w:pStyle w:val="Normal"/>
+        <w:bidi w:val="0"/>
+        <w:jc w:val="left"/>
+        <w:rPr>
+          <w:lang w:val="pt-PT"/>
+        </w:rPr>
+      </w:pPr>
+      <w:r>
+        <w:rPr>
+          <w:lang w:val="pt-PT"/>
+        </w:rPr>
+        <w:t xml:space="preserve">Os estudos consultados indicam que, no caso das próteses de membro superior, a aprendizagem automática tem sido aplicada sobretudo à classificação de sinais </w:t>
+      </w:r>
+      <w:commentRangeStart w:id="20"/>
+      <w:r>
+        <w:rPr>
+          <w:lang w:val="pt-PT"/>
+        </w:rPr>
+        <w:t>EMG</w:t>
+      </w:r>
+      <w:r>
+        <w:rPr>
+          <w:lang w:val="pt-PT"/>
+        </w:rPr>
+      </w:r>
+      <w:commentRangeEnd w:id="20"/>
+      <w:r>
+        <w:commentReference w:id="20"/>
+      </w:r>
+      <w:r>
+        <w:rPr>
+          <w:lang w:val="pt-PT"/>
+        </w:rPr>
+        <w:t>, à inferência de intenção motora, isto é, à interpretação dos sinais corporais que permitem estimar o movimento que o utilizador pretende realizar, e à melhoria do desempenho operativo do dispositivo (Choo e Chang, 2023; Terrazas-Rodas e Carrión-Pérez, 2022; Hachoumi, Laabidi e Eddabbah, 2026; Batista, Vieira e Gaspar, 2025).</w:t>
+      </w:r>
+    </w:p>
+    <w:p>
+      <w:pPr>
+        <w:pStyle w:val="Normal"/>
+        <w:bidi w:val="0"/>
+        <w:jc w:val="left"/>
+        <w:rPr/>
+      </w:pPr>
+      <w:r>
+        <w:rPr>
+          <w:lang w:val="pt-PT"/>
+        </w:rPr>
+        <w:t xml:space="preserve">Em contrapartida, continuam pouco consolidadas as abordagens que articulam, no mesmo sistema, a entrada antropométrica, o modelo paramétrico explícito, a sugestão assistida de parâmetros e a supervisão técnica. </w:t>
+      </w:r>
+      <w:r>
+        <w:rPr/>
+        <w:t>Esta lacuna é central para a presente investigação, pois permite situar a proposta como uma articulação entre componentes que os estudos consultados tendem a desenvolver de forma fragmentada.</w:t>
+      </w:r>
+    </w:p>
+    <w:p>
+      <w:pPr>
+        <w:pStyle w:val="Normal"/>
+        <w:bidi w:val="0"/>
+        <w:jc w:val="left"/>
+        <w:rPr>
+          <w:lang w:val="pt-PT"/>
+        </w:rPr>
+      </w:pPr>
+      <w:r>
+        <w:rPr>
+          <w:lang w:val="pt-PT"/>
+        </w:rPr>
+        <w:t xml:space="preserve">Neste enquadramento, a IA assume a função de camada complementar de apoio à configuração, operando sobre uma base paramétrica já definida e articulando-se com a lógica geométrica do modelo, a decisão de projeto e a validação técnica. A literatura sobre modelação paramétrica aplicada a próteses personalizadas e sobre fabrico aditivo mostra que há um fundamento técnico robusto para construir geometrias configuráveis com base em regras explícitas, parâmetros dimensionais e relações geométricas controladas. </w:t>
+      </w:r>
+      <w:r>
+        <w:rPr/>
+        <w:t>Estudos sobre próteses paramétricas para diferentes níveis de amputação de membros superiores, sobre a personalização de dedos protésicos por modelação paramétrica e sobre encaixes protésicos personalizados para próteses transradiais demonstram que a personalização pode ser estruturada através de modelos explícitos e fluxos CAD/CAM ajustáveis.</w:t>
+      </w:r>
+      <w:r>
+        <w:rPr>
+          <w:lang w:val="pt-PT"/>
+        </w:rPr>
+        <w:t xml:space="preserve"> (da Silveira Romero et al., 2025 (#ref-da-silveira-romero-2025); Lim et al., 2018 (#ref-lim-2018); Saldarriaga et al., 2024 (#ref-saldarriaga-2024)). </w:t>
+      </w:r>
+      <w:commentRangeStart w:id="21"/>
+      <w:r>
+        <w:rPr>
+          <w:shd w:fill="FFFF00" w:val="clear"/>
+          <w:lang w:val="pt-PT"/>
+        </w:rPr>
+        <w:t>O sistema aqui proposto parte precisamente desta premissa: a geometria não é gerada de forma opaca por um modelo autónomo, mas sim por um modelo paramétrico explícito, definido em OpenSCAD e manipulável por meio de parâmetros rastreáveis.</w:t>
+      </w:r>
+      <w:commentRangeEnd w:id="21"/>
+      <w:r>
+        <w:commentReference w:id="21"/>
+      </w:r>
+      <w:r>
+        <w:rPr>
+          <w:shd w:fill="FFFF00" w:val="clear"/>
+          <w:lang w:val="pt-PT"/>
+        </w:rPr>
+      </w:r>
+    </w:p>
+    <w:p>
+      <w:pPr>
+        <w:pStyle w:val="Normal"/>
+        <w:bidi w:val="0"/>
+        <w:jc w:val="left"/>
+        <w:rPr>
+          <w:lang w:val="pt-PT"/>
+        </w:rPr>
+      </w:pPr>
+      <w:r>
+        <w:rPr>
+          <w:lang w:val="pt-PT"/>
+        </w:rPr>
+        <w:t>É neste ponto que a IA assume uma função específica. Em vez de atuar como gerador integral da forma, atua como um mecanismo de mediação entre os dados de entrada e a exploração inicial do espaço paramétrico. O seu papel é apoiar a tradução de informação antropométrica, de preferências funcionais e de critérios de fabrico em sugestões paramétricas plausíveis, reduzindo a complexidade associada à definição manual de valores iniciais e à navegação em sistemas com múltiplas dependências internas. Esta posição aproxima-se de abordagen</w:t>
+      </w:r>
+      <w:r>
+        <w:rPr>
+          <w:shd w:fill="FFFF00" w:val="clear"/>
+          <w:lang w:val="pt-PT"/>
+        </w:rPr>
+        <w:t xml:space="preserve">s </w:t>
+      </w:r>
       <w:commentRangeStart w:id="22"/>
-      <w:r>
-        <w:rPr>
-          <w:lang w:val="pt-PT"/>
-        </w:rPr>
-        <w:t>IA</w:t>
-      </w:r>
-      <w:r>
-        <w:rPr>
-          <w:lang w:val="pt-PT"/>
-        </w:rPr>
-      </w:r>
-      <w:commentRangeEnd w:id="22"/>
-      <w:r>
-        <w:commentReference w:id="22"/>
-      </w:r>
-      <w:r>
-        <w:rPr>
-          <w:lang w:val="pt-PT"/>
-        </w:rPr>
-        <w:t xml:space="preserve"> no sistema proposto</w:t>
-      </w:r>
-    </w:p>
-    <w:p>
-      <w:pPr>
-        <w:pStyle w:val="Normal"/>
-        <w:bidi w:val="0"/>
-        <w:jc w:val="left"/>
-        <w:rPr>
-          <w:lang w:val="pt-PT"/>
-        </w:rPr>
-      </w:pPr>
-      <w:r>
-        <w:rPr>
-          <w:lang w:val="pt-PT"/>
-        </w:rPr>
-      </w:r>
-    </w:p>
-    <w:p>
-      <w:pPr>
-        <w:pStyle w:val="Normal"/>
-        <w:bidi w:val="0"/>
-        <w:jc w:val="left"/>
-        <w:rPr>
-          <w:lang w:val="pt-PT"/>
-        </w:rPr>
-      </w:pPr>
-      <w:r>
-        <w:rPr>
-          <w:lang w:val="pt-PT"/>
-        </w:rPr>
-        <w:t>No sistema desenvolvido, a IA assume uma função distinta daquela que surge com maior frequência nos estudos sobre próteses. Enquanto grande parte da investigação consultada se concentra em tarefas de controlo, interpretação de biosinais, reconhecimento de gestos e adaptação funcional, esta investigação explora a IA como camada de apoio à configuração paramétrica, articulada com dados antropométricos, modelos geométricos explícitos e interface web.</w:t>
-      </w:r>
-    </w:p>
-    <w:p>
-      <w:pPr>
-        <w:pStyle w:val="Normal"/>
-        <w:bidi w:val="0"/>
-        <w:jc w:val="left"/>
-        <w:rPr>
-          <w:lang w:val="pt-PT"/>
-        </w:rPr>
-      </w:pPr>
-      <w:r>
-        <w:rPr>
-          <w:lang w:val="pt-PT"/>
-        </w:rPr>
-        <w:t xml:space="preserve">Os estudos consultados indicam que, no caso das próteses de membro superior, a aprendizagem automática tem sido aplicada sobretudo à classificação de sinais </w:t>
-      </w:r>
-      <w:commentRangeStart w:id="23"/>
-      <w:r>
-        <w:rPr>
-          <w:lang w:val="pt-PT"/>
-        </w:rPr>
-        <w:t>EMG</w:t>
-      </w:r>
-      <w:r>
-        <w:rPr>
-          <w:lang w:val="pt-PT"/>
-        </w:rPr>
-      </w:r>
-      <w:commentRangeEnd w:id="23"/>
-      <w:r>
-        <w:commentReference w:id="23"/>
-      </w:r>
-      <w:r>
-        <w:rPr>
-          <w:lang w:val="pt-PT"/>
-        </w:rPr>
-        <w:t>, à inferência de intenção motora, isto é, à interpretação dos sinais corporais que permitem estimar o movimento que o utilizador pretende realizar, e à melhoria do desempenho operativo do dispositivo (Choo e Chang, 2023; Terrazas-Rodas e Carrión-Pérez, 2022; Hachoumi, Laabidi e Eddabbah, 2026; Batista, Vieira e Gaspar, 2025).</w:t>
-      </w:r>
-    </w:p>
-    <w:p>
-      <w:pPr>
-        <w:pStyle w:val="Normal"/>
-        <w:bidi w:val="0"/>
-        <w:jc w:val="left"/>
-        <w:rPr/>
-      </w:pPr>
-      <w:r>
-        <w:rPr>
-          <w:lang w:val="pt-PT"/>
-        </w:rPr>
-        <w:t xml:space="preserve">Em contrapartida, continuam pouco consolidadas as abordagens que articulam, no mesmo sistema, a entrada antropométrica, o modelo paramétrico explícito, a sugestão assistida de parâmetros e a supervisão técnica. </w:t>
-      </w:r>
-      <w:r>
-        <w:rPr/>
-        <w:t>Esta lacuna é central para a presente investigação, pois permite situar a proposta como uma articulação entre componentes que os estudos consultados tendem a desenvolver de forma fragmentada.</w:t>
-      </w:r>
-    </w:p>
-    <w:p>
-      <w:pPr>
-        <w:pStyle w:val="Normal"/>
-        <w:bidi w:val="0"/>
-        <w:jc w:val="left"/>
-        <w:rPr>
-          <w:lang w:val="pt-PT"/>
-        </w:rPr>
-      </w:pPr>
-      <w:r>
-        <w:rPr>
-          <w:lang w:val="pt-PT"/>
-        </w:rPr>
-        <w:t xml:space="preserve">Neste enquadramento, a IA assume a função de camada complementar de apoio à configuração, operando sobre uma base paramétrica já definida e articulando-se com a lógica geométrica do modelo, a decisão de projeto e a validação técnica. A literatura sobre modelação paramétrica aplicada a próteses personalizadas e sobre fabrico aditivo mostra que há um fundamento técnico robusto para construir geometrias configuráveis com base em regras explícitas, parâmetros dimensionais e relações geométricas controladas. </w:t>
-      </w:r>
-      <w:r>
-        <w:rPr/>
-        <w:t>Estudos sobre próteses paramétricas para diferentes níveis de amputação de membros superiores, sobre a personalização de dedos protésicos por modelação paramétrica e sobre encaixes protésicos personalizados para próteses transradiais demonstram que a personalização pode ser estruturada através de modelos explícitos e fluxos CAD/CAM ajustáveis.</w:t>
-      </w:r>
-      <w:r>
-        <w:rPr>
-          <w:lang w:val="pt-PT"/>
-        </w:rPr>
-        <w:t xml:space="preserve"> (da Silveira Romero et al., 2025 (#ref-da-silveira-romero-2025); Lim et al., 2018 (#ref-lim-2018); Saldarriaga et al., 2024 (#ref-saldarriaga-2024)). </w:t>
-      </w:r>
-      <w:commentRangeStart w:id="24"/>
-      <w:r>
-        <w:rPr>
-          <w:shd w:fill="FFFF00" w:val="clear"/>
-          <w:lang w:val="pt-PT"/>
-        </w:rPr>
-        <w:t>O sistema aqui proposto parte precisamente desta premissa: a geometria não é gerada de forma opaca por um modelo autónomo, mas sim por um modelo paramétrico explícito, definido em OpenSCAD e manipulável por meio de parâmetros rastreáveis.</w:t>
-      </w:r>
-      <w:commentRangeEnd w:id="24"/>
-      <w:r>
-        <w:commentReference w:id="24"/>
-      </w:r>
-      <w:r>
-        <w:rPr>
-          <w:shd w:fill="FFFF00" w:val="clear"/>
-          <w:lang w:val="pt-PT"/>
-        </w:rPr>
-      </w:r>
-    </w:p>
-    <w:p>
-      <w:pPr>
-        <w:pStyle w:val="Normal"/>
-        <w:bidi w:val="0"/>
-        <w:jc w:val="left"/>
-        <w:rPr>
-          <w:lang w:val="pt-PT"/>
-        </w:rPr>
-      </w:pPr>
-      <w:r>
-        <w:rPr>
-          <w:lang w:val="pt-PT"/>
-        </w:rPr>
-        <w:t>É neste ponto que a IA assume uma função específica. Em vez de atuar como gerador integral da forma, atua como um mecanismo de mediação entre os dados de entrada e a exploração inicial do espaço paramétrico. O seu papel é apoiar a tradução de informação antropométrica, de preferências funcionais e de critérios de fabrico em sugestões paramétricas plausíveis, reduzindo a complexidade associada à definição manual de valores iniciais e à navegação em sistemas com múltiplas dependências internas. Esta posição aproxima-se de abordagen</w:t>
-      </w:r>
-      <w:r>
-        <w:rPr>
-          <w:shd w:fill="FFFF00" w:val="clear"/>
-          <w:lang w:val="pt-PT"/>
-        </w:rPr>
-        <w:t xml:space="preserve">s </w:t>
-      </w:r>
-      <w:commentRangeStart w:id="25"/>
       <w:r>
         <w:rPr>
           <w:i/>
@@ -20444,9 +20530,9 @@
           <w:lang w:val="pt-PT"/>
         </w:rPr>
       </w:r>
-      <w:commentRangeEnd w:id="25"/>
-      <w:r>
-        <w:commentReference w:id="25"/>
+      <w:commentRangeEnd w:id="22"/>
+      <w:r>
+        <w:commentReference w:id="22"/>
       </w:r>
       <w:r>
         <w:rPr>
@@ -20687,7 +20773,7 @@
         </w:rPr>
         <w:t xml:space="preserve">É por isso que, nesta investigação, a personalização assistida por IA deve ser entendida como uma prática de </w:t>
       </w:r>
-      <w:commentRangeStart w:id="26"/>
+      <w:commentRangeStart w:id="23"/>
       <w:r>
         <w:rPr>
           <w:i/>
@@ -20703,9 +20789,9 @@
           <w:lang w:val="pt-PT"/>
         </w:rPr>
       </w:r>
-      <w:commentRangeEnd w:id="26"/>
-      <w:r>
-        <w:commentReference w:id="26"/>
+      <w:commentRangeEnd w:id="23"/>
+      <w:r>
+        <w:commentReference w:id="23"/>
       </w:r>
       <w:r>
         <w:rPr/>
@@ -20715,7 +20801,11 @@
         <w:rPr>
           <w:lang w:val="pt-PT"/>
         </w:rPr>
-        <w:t>a aceitação final, porém, continua dependente de verificação técnica e de julgamento contextual. Deste modo, a parametrização assistida por IA não corresponde a uma automatização cega da personalização, mas a um mecanismo de apoio à decisão que atua sobre uma base geométrica explícita, rastreável e tecnicamente verificável.</w:t>
+        <w:t xml:space="preserve">a aceitação final, porém, continua dependente de verificação técnica e de julgamento contextual. </w:t>
+      </w:r>
+      <w:r>
+        <w:rPr/>
+        <w:t>Deste modo, a parametrização assistida por IA não corresponde a uma automatização cega da personalização, mas a um mecanismo de apoio à decisão que atua sobre uma base geométrica explícita, documentada e tecnicamente verificável.</w:t>
       </w:r>
     </w:p>
     <w:p>
@@ -20843,7 +20933,7 @@
           <w:lang w:val="pt-PT"/>
         </w:rPr>
       </w:pPr>
-      <w:commentRangeStart w:id="27"/>
+      <w:commentRangeStart w:id="24"/>
       <w:r>
         <w:rPr>
           <w:lang w:val="pt-PT"/>
@@ -20855,9 +20945,9 @@
           <w:lang w:val="pt-PT"/>
         </w:rPr>
       </w:r>
-      <w:commentRangeEnd w:id="27"/>
-      <w:r>
-        <w:commentReference w:id="27"/>
+      <w:commentRangeEnd w:id="24"/>
+      <w:r>
+        <w:commentReference w:id="24"/>
       </w:r>
       <w:r>
         <w:rPr>
@@ -20955,7 +21045,7 @@
       </w:r>
       <w:r>
         <w:rPr/>
-        <w:commentReference w:id="28"/>
+        <w:commentReference w:id="25"/>
       </w:r>
       <w:r>
         <w:rPr>
@@ -21533,7 +21623,7 @@
         </w:rPr>
         <w:t xml:space="preserve">Uma decisão particularmente relevante reside na forma como a interface traduz a lógica paramétrica em linguagem operacional. Cada controlo não representa apenas um valor numérico isolado, mas também um ponto de acesso a relações geométricas que permanecem definidas no modelo. Em termos de </w:t>
       </w:r>
-      <w:commentRangeStart w:id="29"/>
+      <w:commentRangeStart w:id="26"/>
       <w:r>
         <w:rPr>
           <w:lang w:val="pt-PT"/>
@@ -21545,9 +21635,9 @@
           <w:lang w:val="pt-PT"/>
         </w:rPr>
       </w:r>
-      <w:commentRangeEnd w:id="29"/>
-      <w:r>
-        <w:commentReference w:id="29"/>
+      <w:commentRangeEnd w:id="26"/>
+      <w:r>
+        <w:commentReference w:id="26"/>
       </w:r>
       <w:r>
         <w:rPr>
@@ -33311,8 +33401,8 @@
       <w:tblGrid>
         <w:gridCol w:w="1805"/>
         <w:gridCol w:w="1805"/>
-        <w:gridCol w:w="1803"/>
-        <w:gridCol w:w="1805"/>
+        <w:gridCol w:w="1802"/>
+        <w:gridCol w:w="1806"/>
         <w:gridCol w:w="1808"/>
       </w:tblGrid>
       <w:tr>
@@ -33363,7 +33453,7 @@
         </w:tc>
         <w:tc>
           <w:tcPr>
-            <w:tcW w:w="1803" w:type="dxa"/>
+            <w:tcW w:w="1802" w:type="dxa"/>
             <w:tcBorders>
               <w:top w:val="single" w:sz="4" w:space="0" w:color="808080"/>
               <w:left w:val="single" w:sz="4" w:space="0" w:color="808080"/>
@@ -33384,7 +33474,7 @@
         </w:tc>
         <w:tc>
           <w:tcPr>
-            <w:tcW w:w="1805" w:type="dxa"/>
+            <w:tcW w:w="1806" w:type="dxa"/>
             <w:tcBorders>
               <w:top w:val="single" w:sz="4" w:space="0" w:color="808080"/>
               <w:left w:val="single" w:sz="4" w:space="0" w:color="808080"/>
@@ -33484,7 +33574,7 @@
         </w:tc>
         <w:tc>
           <w:tcPr>
-            <w:tcW w:w="1803" w:type="dxa"/>
+            <w:tcW w:w="1802" w:type="dxa"/>
             <w:tcBorders>
               <w:top w:val="single" w:sz="4" w:space="0" w:color="808080"/>
               <w:left w:val="single" w:sz="4" w:space="0" w:color="808080"/>
@@ -33505,7 +33595,7 @@
         </w:tc>
         <w:tc>
           <w:tcPr>
-            <w:tcW w:w="1805" w:type="dxa"/>
+            <w:tcW w:w="1806" w:type="dxa"/>
             <w:tcBorders>
               <w:top w:val="single" w:sz="4" w:space="0" w:color="808080"/>
               <w:left w:val="single" w:sz="4" w:space="0" w:color="808080"/>
@@ -33611,7 +33701,7 @@
         </w:tc>
         <w:tc>
           <w:tcPr>
-            <w:tcW w:w="1803" w:type="dxa"/>
+            <w:tcW w:w="1802" w:type="dxa"/>
             <w:tcBorders>
               <w:top w:val="single" w:sz="4" w:space="0" w:color="808080"/>
               <w:left w:val="single" w:sz="4" w:space="0" w:color="808080"/>
@@ -33632,7 +33722,7 @@
         </w:tc>
         <w:tc>
           <w:tcPr>
-            <w:tcW w:w="1805" w:type="dxa"/>
+            <w:tcW w:w="1806" w:type="dxa"/>
             <w:tcBorders>
               <w:top w:val="single" w:sz="4" w:space="0" w:color="808080"/>
               <w:left w:val="single" w:sz="4" w:space="0" w:color="808080"/>
@@ -33732,7 +33822,7 @@
         </w:tc>
         <w:tc>
           <w:tcPr>
-            <w:tcW w:w="1803" w:type="dxa"/>
+            <w:tcW w:w="1802" w:type="dxa"/>
             <w:tcBorders>
               <w:top w:val="single" w:sz="4" w:space="0" w:color="808080"/>
               <w:left w:val="single" w:sz="4" w:space="0" w:color="808080"/>
@@ -33753,7 +33843,7 @@
         </w:tc>
         <w:tc>
           <w:tcPr>
-            <w:tcW w:w="1805" w:type="dxa"/>
+            <w:tcW w:w="1806" w:type="dxa"/>
             <w:tcBorders>
               <w:top w:val="single" w:sz="4" w:space="0" w:color="808080"/>
               <w:left w:val="single" w:sz="4" w:space="0" w:color="808080"/>
@@ -36290,7 +36380,7 @@
   <w:comment w:id="0" w:author="Unknown Author" w:date="2026-06-30T18:08:33Z" w:initials="">
     <w:p>
       <w:pPr>
-        <w:overflowPunct w:val="false"/>
+        <w:overflowPunct w:val="true"/>
         <w:bidi w:val="0"/>
         <w:rPr/>
       </w:pPr>
@@ -36306,19 +36396,19 @@
     </w:p>
     <w:p>
       <w:pPr>
-        <w:overflowPunct w:val="false"/>
-        <w:bidi w:val="0"/>
-        <w:rPr/>
-      </w:pPr>
-      <w:r>
-        <w:rPr>
-          <w:lang w:val="pt-PT"/>
-        </w:rPr>
-      </w:r>
-    </w:p>
-    <w:p>
-      <w:pPr>
-        <w:overflowPunct w:val="false"/>
+        <w:overflowPunct w:val="true"/>
+        <w:bidi w:val="0"/>
+        <w:rPr/>
+      </w:pPr>
+      <w:r>
+        <w:rPr>
+          <w:lang w:val="pt-PT"/>
+        </w:rPr>
+      </w:r>
+    </w:p>
+    <w:p>
+      <w:pPr>
+        <w:overflowPunct w:val="true"/>
         <w:bidi w:val="0"/>
         <w:rPr/>
       </w:pPr>
@@ -36331,7 +36421,7 @@
     </w:p>
     <w:p>
       <w:pPr>
-        <w:overflowPunct w:val="false"/>
+        <w:overflowPunct w:val="true"/>
         <w:bidi w:val="0"/>
         <w:rPr/>
       </w:pPr>
@@ -36344,19 +36434,19 @@
     </w:p>
     <w:p>
       <w:pPr>
-        <w:overflowPunct w:val="false"/>
-        <w:bidi w:val="0"/>
-        <w:rPr/>
-      </w:pPr>
-      <w:r>
-        <w:rPr>
-          <w:lang w:val="pt-PT"/>
-        </w:rPr>
-      </w:r>
-    </w:p>
-    <w:p>
-      <w:pPr>
-        <w:overflowPunct w:val="false"/>
+        <w:overflowPunct w:val="true"/>
+        <w:bidi w:val="0"/>
+        <w:rPr/>
+      </w:pPr>
+      <w:r>
+        <w:rPr>
+          <w:lang w:val="pt-PT"/>
+        </w:rPr>
+      </w:r>
+    </w:p>
+    <w:p>
+      <w:pPr>
+        <w:overflowPunct w:val="true"/>
         <w:bidi w:val="0"/>
         <w:rPr/>
       </w:pPr>
@@ -36369,19 +36459,19 @@
     </w:p>
     <w:p>
       <w:pPr>
-        <w:overflowPunct w:val="false"/>
-        <w:bidi w:val="0"/>
-        <w:rPr/>
-      </w:pPr>
-      <w:r>
-        <w:rPr>
-          <w:lang w:val="pt-PT"/>
-        </w:rPr>
-      </w:r>
-    </w:p>
-    <w:p>
-      <w:pPr>
-        <w:overflowPunct w:val="false"/>
+        <w:overflowPunct w:val="true"/>
+        <w:bidi w:val="0"/>
+        <w:rPr/>
+      </w:pPr>
+      <w:r>
+        <w:rPr>
+          <w:lang w:val="pt-PT"/>
+        </w:rPr>
+      </w:r>
+    </w:p>
+    <w:p>
+      <w:pPr>
+        <w:overflowPunct w:val="true"/>
         <w:bidi w:val="0"/>
         <w:rPr/>
       </w:pPr>
@@ -36394,7 +36484,7 @@
     </w:p>
     <w:p>
       <w:pPr>
-        <w:overflowPunct w:val="false"/>
+        <w:overflowPunct w:val="true"/>
         <w:bidi w:val="0"/>
         <w:rPr/>
       </w:pPr>
@@ -36407,19 +36497,19 @@
     </w:p>
     <w:p>
       <w:pPr>
-        <w:overflowPunct w:val="false"/>
-        <w:bidi w:val="0"/>
-        <w:rPr/>
-      </w:pPr>
-      <w:r>
-        <w:rPr>
-          <w:lang w:val="pt-PT"/>
-        </w:rPr>
-      </w:r>
-    </w:p>
-    <w:p>
-      <w:pPr>
-        <w:overflowPunct w:val="false"/>
+        <w:overflowPunct w:val="true"/>
+        <w:bidi w:val="0"/>
+        <w:rPr/>
+      </w:pPr>
+      <w:r>
+        <w:rPr>
+          <w:lang w:val="pt-PT"/>
+        </w:rPr>
+      </w:r>
+    </w:p>
+    <w:p>
+      <w:pPr>
+        <w:overflowPunct w:val="true"/>
         <w:bidi w:val="0"/>
         <w:rPr/>
       </w:pPr>
@@ -36432,19 +36522,19 @@
     </w:p>
     <w:p>
       <w:pPr>
-        <w:overflowPunct w:val="false"/>
-        <w:bidi w:val="0"/>
-        <w:rPr/>
-      </w:pPr>
-      <w:r>
-        <w:rPr>
-          <w:lang w:val="pt-PT"/>
-        </w:rPr>
-      </w:r>
-    </w:p>
-    <w:p>
-      <w:pPr>
-        <w:overflowPunct w:val="false"/>
+        <w:overflowPunct w:val="true"/>
+        <w:bidi w:val="0"/>
+        <w:rPr/>
+      </w:pPr>
+      <w:r>
+        <w:rPr>
+          <w:lang w:val="pt-PT"/>
+        </w:rPr>
+      </w:r>
+    </w:p>
+    <w:p>
+      <w:pPr>
+        <w:overflowPunct w:val="true"/>
         <w:bidi w:val="0"/>
         <w:rPr/>
       </w:pPr>
@@ -36457,7 +36547,7 @@
     </w:p>
     <w:p>
       <w:pPr>
-        <w:overflowPunct w:val="false"/>
+        <w:overflowPunct w:val="true"/>
         <w:bidi w:val="0"/>
         <w:rPr/>
       </w:pPr>
@@ -36470,7 +36560,7 @@
     </w:p>
     <w:p>
       <w:pPr>
-        <w:overflowPunct w:val="false"/>
+        <w:overflowPunct w:val="true"/>
         <w:bidi w:val="0"/>
         <w:rPr/>
       </w:pPr>
@@ -36484,7 +36574,7 @@
   <w:comment w:id="1" w:author="Unknown Author" w:date="2026-06-30T20:08:54Z" w:initials="">
     <w:p>
       <w:pPr>
-        <w:overflowPunct w:val="false"/>
+        <w:overflowPunct w:val="true"/>
         <w:bidi w:val="0"/>
         <w:rPr/>
       </w:pPr>
@@ -36502,7 +36592,7 @@
   <w:comment w:id="2" w:author="Unknown Author" w:date="2026-06-30T20:17:49Z" w:initials="">
     <w:p>
       <w:pPr>
-        <w:overflowPunct w:val="false"/>
+        <w:overflowPunct w:val="true"/>
         <w:bidi w:val="0"/>
         <w:rPr/>
       </w:pPr>
@@ -36518,19 +36608,19 @@
     </w:p>
     <w:p>
       <w:pPr>
-        <w:overflowPunct w:val="false"/>
-        <w:bidi w:val="0"/>
-        <w:rPr/>
-      </w:pPr>
-      <w:r>
-        <w:rPr>
-          <w:lang w:val="pt-PT"/>
-        </w:rPr>
-      </w:r>
-    </w:p>
-    <w:p>
-      <w:pPr>
-        <w:overflowPunct w:val="false"/>
+        <w:overflowPunct w:val="true"/>
+        <w:bidi w:val="0"/>
+        <w:rPr/>
+      </w:pPr>
+      <w:r>
+        <w:rPr>
+          <w:lang w:val="pt-PT"/>
+        </w:rPr>
+      </w:r>
+    </w:p>
+    <w:p>
+      <w:pPr>
+        <w:overflowPunct w:val="true"/>
         <w:bidi w:val="0"/>
         <w:rPr/>
       </w:pPr>
@@ -36543,7 +36633,7 @@
     </w:p>
     <w:p>
       <w:pPr>
-        <w:overflowPunct w:val="false"/>
+        <w:overflowPunct w:val="true"/>
         <w:bidi w:val="0"/>
         <w:rPr/>
       </w:pPr>
@@ -36556,19 +36646,19 @@
     </w:p>
     <w:p>
       <w:pPr>
-        <w:overflowPunct w:val="false"/>
-        <w:bidi w:val="0"/>
-        <w:rPr/>
-      </w:pPr>
-      <w:r>
-        <w:rPr>
-          <w:lang w:val="pt-PT"/>
-        </w:rPr>
-      </w:r>
-    </w:p>
-    <w:p>
-      <w:pPr>
-        <w:overflowPunct w:val="false"/>
+        <w:overflowPunct w:val="true"/>
+        <w:bidi w:val="0"/>
+        <w:rPr/>
+      </w:pPr>
+      <w:r>
+        <w:rPr>
+          <w:lang w:val="pt-PT"/>
+        </w:rPr>
+      </w:r>
+    </w:p>
+    <w:p>
+      <w:pPr>
+        <w:overflowPunct w:val="true"/>
         <w:bidi w:val="0"/>
         <w:rPr/>
       </w:pPr>
@@ -36581,7 +36671,7 @@
     </w:p>
     <w:p>
       <w:pPr>
-        <w:overflowPunct w:val="false"/>
+        <w:overflowPunct w:val="true"/>
         <w:bidi w:val="0"/>
         <w:rPr/>
       </w:pPr>
@@ -36594,19 +36684,19 @@
     </w:p>
     <w:p>
       <w:pPr>
-        <w:overflowPunct w:val="false"/>
-        <w:bidi w:val="0"/>
-        <w:rPr/>
-      </w:pPr>
-      <w:r>
-        <w:rPr>
-          <w:lang w:val="pt-PT"/>
-        </w:rPr>
-      </w:r>
-    </w:p>
-    <w:p>
-      <w:pPr>
-        <w:overflowPunct w:val="false"/>
+        <w:overflowPunct w:val="true"/>
+        <w:bidi w:val="0"/>
+        <w:rPr/>
+      </w:pPr>
+      <w:r>
+        <w:rPr>
+          <w:lang w:val="pt-PT"/>
+        </w:rPr>
+      </w:r>
+    </w:p>
+    <w:p>
+      <w:pPr>
+        <w:overflowPunct w:val="true"/>
         <w:bidi w:val="0"/>
         <w:rPr/>
       </w:pPr>
@@ -36619,7 +36709,7 @@
     </w:p>
     <w:p>
       <w:pPr>
-        <w:overflowPunct w:val="false"/>
+        <w:overflowPunct w:val="true"/>
         <w:bidi w:val="0"/>
         <w:rPr/>
       </w:pPr>
@@ -36632,7 +36722,7 @@
     </w:p>
     <w:p>
       <w:pPr>
-        <w:overflowPunct w:val="false"/>
+        <w:overflowPunct w:val="true"/>
         <w:bidi w:val="0"/>
         <w:rPr/>
       </w:pPr>
@@ -36646,7 +36736,7 @@
   <w:comment w:id="3" w:author="Unknown Author" w:date="2026-07-01T19:07:33Z" w:initials="">
     <w:p>
       <w:pPr>
-        <w:overflowPunct w:val="true"/>
+        <w:overflowPunct w:val="false"/>
         <w:bidi w:val="0"/>
         <w:rPr/>
       </w:pPr>
@@ -36664,7 +36754,7 @@
   <w:comment w:id="4" w:author="Unknown Author" w:date="2026-07-01T19:08:06Z" w:initials="">
     <w:p>
       <w:pPr>
-        <w:overflowPunct w:val="true"/>
+        <w:overflowPunct w:val="false"/>
         <w:bidi w:val="0"/>
         <w:rPr/>
       </w:pPr>
@@ -36682,7 +36772,7 @@
   <w:comment w:id="5" w:author="Unknown Author" w:date="2026-07-01T20:43:47Z" w:initials="">
     <w:p>
       <w:pPr>
-        <w:overflowPunct w:val="true"/>
+        <w:overflowPunct w:val="false"/>
         <w:bidi w:val="0"/>
         <w:rPr/>
       </w:pPr>
@@ -36698,19 +36788,19 @@
     </w:p>
     <w:p>
       <w:pPr>
-        <w:overflowPunct w:val="true"/>
-        <w:bidi w:val="0"/>
-        <w:rPr/>
-      </w:pPr>
-      <w:r>
-        <w:rPr>
-          <w:lang w:val="pt-PT"/>
-        </w:rPr>
-      </w:r>
-    </w:p>
-    <w:p>
-      <w:pPr>
-        <w:overflowPunct w:val="true"/>
+        <w:overflowPunct w:val="false"/>
+        <w:bidi w:val="0"/>
+        <w:rPr/>
+      </w:pPr>
+      <w:r>
+        <w:rPr>
+          <w:lang w:val="pt-PT"/>
+        </w:rPr>
+      </w:r>
+    </w:p>
+    <w:p>
+      <w:pPr>
+        <w:overflowPunct w:val="false"/>
         <w:bidi w:val="0"/>
         <w:rPr/>
       </w:pPr>
@@ -36725,7 +36815,7 @@
   <w:comment w:id="6" w:author="Unknown Author" w:date="2026-07-02T17:25:21Z" w:initials="">
     <w:p>
       <w:pPr>
-        <w:overflowPunct w:val="true"/>
+        <w:overflowPunct w:val="false"/>
         <w:bidi w:val="0"/>
         <w:rPr/>
       </w:pPr>
@@ -36743,7 +36833,7 @@
   <w:comment w:id="7" w:author="Unknown Author" w:date="2026-07-02T17:57:37Z" w:initials="">
     <w:p>
       <w:pPr>
-        <w:overflowPunct w:val="true"/>
+        <w:overflowPunct w:val="false"/>
         <w:bidi w:val="0"/>
         <w:rPr/>
       </w:pPr>
@@ -36761,7 +36851,7 @@
   <w:comment w:id="8" w:author="Unknown Author" w:date="2026-07-02T18:05:03Z" w:initials="">
     <w:p>
       <w:pPr>
-        <w:overflowPunct w:val="true"/>
+        <w:overflowPunct w:val="false"/>
         <w:bidi w:val="0"/>
         <w:rPr/>
       </w:pPr>
@@ -36779,7 +36869,7 @@
   <w:comment w:id="9" w:author="Unknown Author" w:date="2026-07-03T19:16:18Z" w:initials="">
     <w:p>
       <w:pPr>
-        <w:overflowPunct w:val="false"/>
+        <w:overflowPunct w:val="true"/>
         <w:rPr/>
       </w:pPr>
       <w:r>
@@ -36796,7 +36886,7 @@
   <w:comment w:id="10" w:author="Unknown Author" w:date="2026-07-03T19:16:31Z" w:initials="">
     <w:p>
       <w:pPr>
-        <w:overflowPunct w:val="false"/>
+        <w:overflowPunct w:val="true"/>
         <w:rPr/>
       </w:pPr>
       <w:r>
@@ -36813,7 +36903,7 @@
   <w:comment w:id="11" w:author="Unknown Author" w:date="2026-07-03T13:45:05Z" w:initials="">
     <w:p>
       <w:pPr>
-        <w:overflowPunct w:val="true"/>
+        <w:overflowPunct w:val="false"/>
         <w:bidi w:val="0"/>
         <w:rPr/>
       </w:pPr>
@@ -36831,7 +36921,7 @@
   <w:comment w:id="12" w:author="Unknown Author" w:date="2026-07-04T13:26:12Z" w:initials="">
     <w:p>
       <w:pPr>
-        <w:overflowPunct w:val="false"/>
+        <w:overflowPunct w:val="true"/>
         <w:rPr/>
       </w:pPr>
       <w:r>
@@ -36848,7 +36938,7 @@
   <w:comment w:id="13" w:author="Unknown Author" w:date="2026-07-04T13:27:11Z" w:initials="">
     <w:p>
       <w:pPr>
-        <w:overflowPunct w:val="false"/>
+        <w:overflowPunct w:val="true"/>
         <w:rPr/>
       </w:pPr>
       <w:r>
@@ -36865,7 +36955,7 @@
   <w:comment w:id="14" w:author="Unknown Author" w:date="2026-07-04T15:20:50Z" w:initials="">
     <w:p>
       <w:pPr>
-        <w:overflowPunct w:val="false"/>
+        <w:overflowPunct w:val="true"/>
         <w:rPr/>
       </w:pPr>
       <w:r>
@@ -36882,6 +36972,108 @@
   <w:comment w:id="15" w:author="Unknown Author" w:date="2026-07-04T18:35:39Z" w:initials="">
     <w:p>
       <w:pPr>
+        <w:overflowPunct w:val="true"/>
+        <w:rPr/>
+      </w:pPr>
+      <w:r>
+        <w:annotationRef/>
+      </w:r>
+      <w:r>
+        <w:rPr>
+          <w:lang w:val="pt-PT"/>
+        </w:rPr>
+        <w:t>Não te esqueças de adicionar ao indice estas siglas.</w:t>
+      </w:r>
+    </w:p>
+  </w:comment>
+  <w:comment w:id="16" w:author="Unknown Author" w:date="2026-07-04T18:51:43Z" w:initials="">
+    <w:p>
+      <w:pPr>
+        <w:overflowPunct w:val="true"/>
+        <w:rPr/>
+      </w:pPr>
+      <w:r>
+        <w:annotationRef/>
+      </w:r>
+      <w:r>
+        <w:rPr>
+          <w:lang w:val="pt-PT"/>
+        </w:rPr>
+        <w:t>Faz sentido integrar uma parte sobre a E-nable e os modelos deles.</w:t>
+      </w:r>
+    </w:p>
+  </w:comment>
+  <w:comment w:id="17" w:author="Unknown Author" w:date="2026-07-04T18:53:29Z" w:initials="">
+    <w:p>
+      <w:pPr>
+        <w:overflowPunct w:val="true"/>
+        <w:rPr/>
+      </w:pPr>
+      <w:r>
+        <w:annotationRef/>
+      </w:r>
+      <w:r>
+        <w:rPr>
+          <w:lang w:val="pt-PT"/>
+        </w:rPr>
+        <w:t>Parametros de hardware</w:t>
+      </w:r>
+    </w:p>
+  </w:comment>
+  <w:comment w:id="18" w:author="Unknown Author" w:date="2026-07-04T21:37:44Z" w:initials="">
+    <w:p>
+      <w:pPr>
+        <w:overflowPunct w:val="true"/>
+        <w:rPr/>
+      </w:pPr>
+      <w:r>
+        <w:annotationRef/>
+      </w:r>
+      <w:r>
+        <w:rPr>
+          <w:lang w:val="pt-PT"/>
+        </w:rPr>
+        <w:t>Isto está no indice? Vai lá ver</w:t>
+      </w:r>
+    </w:p>
+  </w:comment>
+  <w:comment w:id="19" w:author="Unknown Author" w:date="2026-07-05T12:22:53Z" w:initials="">
+    <w:p>
+      <w:pPr>
+        <w:overflowPunct w:val="true"/>
+        <w:rPr/>
+      </w:pPr>
+      <w:r>
+        <w:annotationRef/>
+      </w:r>
+      <w:r>
+        <w:rPr>
+          <w:lang w:val="pt-PT"/>
+        </w:rPr>
+        <w:t>Não esquecer de meter no índice</w:t>
+      </w:r>
+    </w:p>
+  </w:comment>
+  <w:comment w:id="20" w:author="Unknown Author" w:date="2026-07-05T12:26:47Z" w:initials="">
+    <w:p>
+      <w:pPr>
+        <w:overflowPunct w:val="true"/>
+        <w:rPr/>
+      </w:pPr>
+      <w:r>
+        <w:annotationRef/>
+      </w:r>
+      <w:r>
+        <w:rPr>
+          <w:lang w:val="pt-PT"/>
+        </w:rPr>
+        <w:t>Adicionar uma nota a explicar e adicionar no indice a sigla</w:t>
+      </w:r>
+    </w:p>
+  </w:comment>
+  <w:comment w:id="21" w:author="Unknown Author" w:date="2026-07-05T14:28:24Z" w:initials="">
+    <w:p>
+      <w:pPr>
         <w:overflowPunct w:val="false"/>
         <w:rPr/>
       </w:pPr>
@@ -36892,11 +37084,11 @@
         <w:rPr>
           <w:lang w:val="pt-PT"/>
         </w:rPr>
-        <w:t>Não te esqueças de adicionar ao indice estas siglas.</w:t>
+        <w:t>Isto é uma repetição</w:t>
       </w:r>
     </w:p>
   </w:comment>
-  <w:comment w:id="16" w:author="Unknown Author" w:date="2026-07-05T12:17:34Z" w:initials="">
+  <w:comment w:id="22" w:author="Unknown Author" w:date="2026-07-05T14:29:31Z" w:initials="">
     <w:p>
       <w:pPr>
         <w:overflowPunct w:val="false"/>
@@ -36909,17 +37101,14 @@
         <w:rPr>
           <w:lang w:val="pt-PT"/>
         </w:rPr>
-        <w:t>negação</w:t>
+        <w:t>Inserir notas de rodapé</w:t>
       </w:r>
     </w:p>
   </w:comment>
-  <w:comment w:id="17" w:author="Unknown Author" w:date="2026-07-04T18:49:44Z" w:initials="">
+  <w:comment w:id="23" w:author="Unknown Author" w:date="2026-07-05T15:25:09Z" w:initials="">
     <w:p>
       <w:pPr>
         <w:overflowPunct w:val="false"/>
-        <w:bidi w:val="0"/>
-        <w:spacing w:before="0" w:after="0"/>
-        <w:jc w:val="left"/>
         <w:rPr/>
       </w:pPr>
       <w:r>
@@ -36927,55 +37116,33 @@
       </w:r>
       <w:r>
         <w:rPr>
-          <w:rFonts w:eastAsia="Noto Serif CJK SC" w:cs="Calibri" w:ascii="Calibri" w:hAnsi="Calibri"/>
-          <w:color w:val="auto"/>
-          <w:kern w:val="0"/>
-          <w:sz w:val="22"/>
-          <w:szCs w:val="22"/>
-          <w:lang w:val="pt-PT" w:eastAsia="zh-CN" w:bidi="en-US"/>
-        </w:rPr>
-        <w:t>¹ Entende-se por proxy seguro uma camada intermédia de comunicação que permite ao servidor gerir os pedidos enviados a serviços externos, protegendo credenciais sensíveis, controlando o acesso e reduzindo a exposição direta da aplicação a sistemas externos.</w:t>
-      </w:r>
-    </w:p>
+          <w:lang w:val="pt-PT"/>
+        </w:rPr>
+        <w:t>Inserir um comentário</w:t>
+      </w:r>
+    </w:p>
+  </w:comment>
+  <w:comment w:id="24" w:author="Unknown Author" w:date="2026-07-05T16:14:55Z" w:initials="">
     <w:p>
       <w:pPr>
         <w:overflowPunct w:val="false"/>
-        <w:bidi w:val="0"/>
-        <w:spacing w:before="0" w:after="0"/>
-        <w:jc w:val="left"/>
-        <w:rPr/>
-      </w:pPr>
-      <w:r>
-        <w:rPr>
-          <w:lang w:val="pt-PT"/>
-        </w:rPr>
-      </w:r>
-    </w:p>
-    <w:p>
-      <w:pPr>
-        <w:overflowPunct w:val="false"/>
-        <w:bidi w:val="0"/>
-        <w:spacing w:before="0" w:after="0"/>
-        <w:jc w:val="left"/>
-        <w:rPr/>
-      </w:pPr>
-      <w:r>
-        <w:rPr>
-          <w:rFonts w:eastAsia="Noto Serif CJK SC" w:cs="Calibri" w:ascii="Calibri" w:hAnsi="Calibri"/>
-          <w:color w:val="auto"/>
-          <w:kern w:val="0"/>
-          <w:sz w:val="22"/>
-          <w:szCs w:val="22"/>
-          <w:lang w:val="pt-PT" w:eastAsia="zh-CN" w:bidi="en-US"/>
-        </w:rPr>
-        <w:t>Já escrevemos proxy antes.</w:t>
+        <w:rPr/>
+      </w:pPr>
+      <w:r>
+        <w:annotationRef/>
+      </w:r>
+      <w:r>
+        <w:rPr>
+          <w:lang w:val="pt-PT"/>
+        </w:rPr>
+        <w:t>Se calhar introduzir uma tabela com os prompts</w:t>
       </w:r>
     </w:p>
   </w:comment>
-  <w:comment w:id="18" w:author="Unknown Author" w:date="2026-07-04T18:51:43Z" w:initials="">
-    <w:p>
-      <w:pPr>
-        <w:overflowPunct w:val="false"/>
+  <w:comment w:id="25" w:author="Unknown Author" w:date="2026-07-05T17:43:41Z" w:initials="">
+    <w:p>
+      <w:pPr>
+        <w:overflowPunct w:val="true"/>
         <w:rPr/>
       </w:pPr>
       <w:r>
@@ -36985,184 +37152,14 @@
         <w:rPr>
           <w:lang w:val="pt-PT"/>
         </w:rPr>
-        <w:t>Faz sentido integrar uma parte sobre a E-nable e os modelos deles.</w:t>
+        <w:t>Introduzir aqui uma tabela com valores</w:t>
       </w:r>
     </w:p>
   </w:comment>
-  <w:comment w:id="19" w:author="Unknown Author" w:date="2026-07-04T18:53:29Z" w:initials="">
-    <w:p>
-      <w:pPr>
-        <w:overflowPunct w:val="false"/>
-        <w:rPr/>
-      </w:pPr>
-      <w:r>
-        <w:annotationRef/>
-      </w:r>
-      <w:r>
-        <w:rPr>
-          <w:lang w:val="pt-PT"/>
-        </w:rPr>
-        <w:t>Parametros de hardware</w:t>
-      </w:r>
-    </w:p>
-  </w:comment>
-  <w:comment w:id="20" w:author="Unknown Author" w:date="2026-07-04T19:12:30Z" w:initials="">
-    <w:p>
-      <w:pPr>
-        <w:overflowPunct w:val="false"/>
-        <w:rPr/>
-      </w:pPr>
-      <w:r>
-        <w:annotationRef/>
-      </w:r>
-      <w:r>
-        <w:rPr>
-          <w:lang w:val="pt-PT"/>
-        </w:rPr>
-        <w:t>Adicionar ao indice</w:t>
-      </w:r>
-    </w:p>
-  </w:comment>
-  <w:comment w:id="21" w:author="Unknown Author" w:date="2026-07-04T21:37:44Z" w:initials="">
-    <w:p>
-      <w:pPr>
-        <w:overflowPunct w:val="false"/>
-        <w:rPr/>
-      </w:pPr>
-      <w:r>
-        <w:annotationRef/>
-      </w:r>
-      <w:r>
-        <w:rPr>
-          <w:lang w:val="pt-PT"/>
-        </w:rPr>
-        <w:t>Isto está no indice? Vai lá ver</w:t>
-      </w:r>
-    </w:p>
-  </w:comment>
-  <w:comment w:id="22" w:author="Unknown Author" w:date="2026-07-05T12:22:53Z" w:initials="">
-    <w:p>
-      <w:pPr>
-        <w:overflowPunct w:val="false"/>
-        <w:rPr/>
-      </w:pPr>
-      <w:r>
-        <w:annotationRef/>
-      </w:r>
-      <w:r>
-        <w:rPr>
-          <w:lang w:val="pt-PT"/>
-        </w:rPr>
-        <w:t>Não esquecer de meter no índice</w:t>
-      </w:r>
-    </w:p>
-  </w:comment>
-  <w:comment w:id="23" w:author="Unknown Author" w:date="2026-07-05T12:26:47Z" w:initials="">
-    <w:p>
-      <w:pPr>
-        <w:overflowPunct w:val="false"/>
-        <w:rPr/>
-      </w:pPr>
-      <w:r>
-        <w:annotationRef/>
-      </w:r>
-      <w:r>
-        <w:rPr>
-          <w:lang w:val="pt-PT"/>
-        </w:rPr>
-        <w:t>Adicionar uma nota a explicar e adicionar no indice a sigla</w:t>
-      </w:r>
-    </w:p>
-  </w:comment>
-  <w:comment w:id="24" w:author="Unknown Author" w:date="2026-07-05T14:28:24Z" w:initials="">
+  <w:comment w:id="26" w:author="Unknown Author" w:date="2026-07-05T19:22:29Z" w:initials="">
     <w:p>
       <w:pPr>
         <w:overflowPunct w:val="true"/>
-        <w:rPr/>
-      </w:pPr>
-      <w:r>
-        <w:annotationRef/>
-      </w:r>
-      <w:r>
-        <w:rPr>
-          <w:lang w:val="pt-PT"/>
-        </w:rPr>
-        <w:t>Isto é uma repetição</w:t>
-      </w:r>
-    </w:p>
-  </w:comment>
-  <w:comment w:id="25" w:author="Unknown Author" w:date="2026-07-05T14:29:31Z" w:initials="">
-    <w:p>
-      <w:pPr>
-        <w:overflowPunct w:val="true"/>
-        <w:rPr/>
-      </w:pPr>
-      <w:r>
-        <w:annotationRef/>
-      </w:r>
-      <w:r>
-        <w:rPr>
-          <w:lang w:val="pt-PT"/>
-        </w:rPr>
-        <w:t>Inserir notas de rodapé</w:t>
-      </w:r>
-    </w:p>
-  </w:comment>
-  <w:comment w:id="26" w:author="Unknown Author" w:date="2026-07-05T15:25:09Z" w:initials="">
-    <w:p>
-      <w:pPr>
-        <w:overflowPunct w:val="true"/>
-        <w:rPr/>
-      </w:pPr>
-      <w:r>
-        <w:annotationRef/>
-      </w:r>
-      <w:r>
-        <w:rPr>
-          <w:lang w:val="pt-PT"/>
-        </w:rPr>
-        <w:t>Inserir um comentário</w:t>
-      </w:r>
-    </w:p>
-  </w:comment>
-  <w:comment w:id="27" w:author="Unknown Author" w:date="2026-07-05T16:14:55Z" w:initials="">
-    <w:p>
-      <w:pPr>
-        <w:overflowPunct w:val="true"/>
-        <w:rPr/>
-      </w:pPr>
-      <w:r>
-        <w:annotationRef/>
-      </w:r>
-      <w:r>
-        <w:rPr>
-          <w:lang w:val="pt-PT"/>
-        </w:rPr>
-        <w:t>Se calhar introduzir uma tabela com os prompts</w:t>
-      </w:r>
-    </w:p>
-  </w:comment>
-  <w:comment w:id="28" w:author="Unknown Author" w:date="2026-07-05T17:43:41Z" w:initials="">
-    <w:p>
-      <w:pPr>
-        <w:overflowPunct w:val="false"/>
-        <w:rPr/>
-      </w:pPr>
-      <w:r>
-        <w:annotationRef/>
-      </w:r>
-      <w:r>
-        <w:rPr>
-          <w:lang w:val="pt-PT"/>
-        </w:rPr>
-        <w:t>Introduzir aqui uma tabela com valores</w:t>
-      </w:r>
-    </w:p>
-  </w:comment>
-  <w:comment w:id="29" w:author="Unknown Author" w:date="2026-07-05T19:22:29Z" w:initials="">
-    <w:p>
-      <w:pPr>
-        <w:overflowPunct w:val="false"/>
         <w:rPr/>
       </w:pPr>
       <w:r>
@@ -37497,6 +37494,75 @@
       <w:r>
         <w:rPr/>
         <w:t xml:space="preserve"> (TRL) é uma escala de maturidade tecnológica, normalmente composta por nove níveis, que permite avaliar o desenvolvimento de uma tecnologia desde a formulação conceptual até à sua demonstração e aplicação em contexto real.</w:t>
+      </w:r>
+    </w:p>
+  </w:footnote>
+  <w:footnote w:id="14">
+    <w:p>
+      <w:pPr>
+        <w:pStyle w:val="FootnoteText"/>
+        <w:rPr/>
+      </w:pPr>
+      <w:r>
+        <w:rPr>
+          <w:rStyle w:val="FootnoteCharacters"/>
+        </w:rPr>
+        <w:footnoteRef/>
+      </w:r>
+      <w:r>
+        <w:rPr>
+          <w:rStyle w:val="Emphasis"/>
+        </w:rPr>
+        <w:t xml:space="preserve"> </w:t>
+      </w:r>
+      <w:r>
+        <w:rPr>
+          <w:rStyle w:val="Emphasis"/>
+        </w:rPr>
+        <w:t>Human-in-the-loop designa uma abordagem em que uma pessoa permanece integrada num processo automatizado, assumindo funções de supervisão, interpretação, validação ou decisão.</w:t>
+      </w:r>
+    </w:p>
+  </w:footnote>
+  <w:footnote w:id="15">
+    <w:p>
+      <w:pPr>
+        <w:pStyle w:val="FootnoteText"/>
+        <w:rPr/>
+      </w:pPr>
+      <w:r>
+        <w:rPr>
+          <w:rStyle w:val="FootnoteCharacters"/>
+        </w:rPr>
+        <w:footnoteRef/>
+      </w:r>
+      <w:r>
+        <w:rPr>
+          <w:rStyle w:val="Emphasis"/>
+          <w:color w:val="auto"/>
+          <w:kern w:val="0"/>
+          <w:sz w:val="22"/>
+        </w:rPr>
+        <w:t xml:space="preserve"> </w:t>
+      </w:r>
+      <w:r>
+        <w:rPr>
+          <w:rStyle w:val="Emphasis"/>
+          <w:color w:val="auto"/>
+          <w:kern w:val="0"/>
+          <w:sz w:val="20"/>
+          <w:szCs w:val="20"/>
+        </w:rPr>
+        <w:t>C</w:t>
+      </w:r>
+      <w:r>
+        <w:rPr>
+          <w:rStyle w:val="Emphasis"/>
+          <w:color w:val="auto"/>
+          <w:kern w:val="0"/>
+          <w:sz w:val="20"/>
+          <w:szCs w:val="20"/>
+        </w:rPr>
+        <w:t>amada intermédia de comunicação que permite ao servidor gerir os pedidos enviados a serviços externos, protegendo credenciais sensíveis, controlando o acesso e reduzindo a exposição direta da aplicação a sistemas externos.</w:t>
       </w:r>
     </w:p>
   </w:footnote>
@@ -37832,15 +37898,15 @@
     <w:qFormat/>
     <w:rPr/>
   </w:style>
-  <w:style w:type="character" w:styleId="FootnoteCharactersuser">
-    <w:name w:val="Footnote Characters (user)"/>
+  <w:style w:type="character" w:styleId="FootnoteCharacters">
+    <w:name w:val="Footnote Characters"/>
     <w:qFormat/>
     <w:rPr>
       <w:vertAlign w:val="superscript"/>
     </w:rPr>
   </w:style>
-  <w:style w:type="character" w:styleId="FootnoteCharacters">
-    <w:name w:val="Footnote Characters"/>
+  <w:style w:type="character" w:styleId="FootnoteCharactersuser">
+    <w:name w:val="Footnote Characters (user)"/>
     <w:qFormat/>
     <w:rPr>
       <w:vertAlign w:val="superscript"/>
@@ -37860,17 +37926,19 @@
       <w:iCs/>
     </w:rPr>
   </w:style>
+  <w:style w:type="character" w:styleId="EndnoteCharactersuser">
+    <w:name w:val="Endnote Characters (user)"/>
+    <w:qFormat/>
+    <w:rPr>
+      <w:vertAlign w:val="superscript"/>
+    </w:rPr>
+  </w:style>
   <w:style w:type="character" w:styleId="EndnoteCharacters">
     <w:name w:val="Endnote Characters"/>
     <w:qFormat/>
     <w:rPr>
       <w:vertAlign w:val="superscript"/>
     </w:rPr>
-  </w:style>
-  <w:style w:type="character" w:styleId="EndnoteCharactersuser">
-    <w:name w:val="Endnote Characters (user)"/>
-    <w:qFormat/>
-    <w:rPr/>
   </w:style>
   <w:style w:type="character" w:styleId="EndnoteReference">
     <w:name w:val="endnote reference"/>

</xml_diff>